<commit_message>
feat(docs): update new jobs and with data and database for demo
</commit_message>
<xml_diff>
--- a/docs/baocao.docx
+++ b/docs/baocao.docx
@@ -292,7 +292,47 @@
           <w:bCs/>
           <w:lang w:val="vi-VN"/>
         </w:rPr>
-        <w:t>CÀI ĐẶT HỆ SINH THÁI BIGDATA HIVE VÀ PYSPARK</w:t>
+        <w:t xml:space="preserve">CÀI ĐẶT </w:t>
+      </w:r>
+      <w:r>
+        <w:rPr>
+          <w:b/>
+          <w:bCs/>
+          <w:lang w:val="vi-VN"/>
+        </w:rPr>
+        <w:t xml:space="preserve">VÀ THỰC THI </w:t>
+      </w:r>
+      <w:r>
+        <w:rPr>
+          <w:b/>
+          <w:bCs/>
+          <w:lang w:val="vi-VN"/>
+        </w:rPr>
+        <w:t xml:space="preserve">HỆ SINH THÁI BIGDATA HIVE VÀ </w:t>
+      </w:r>
+      <w:r>
+        <w:rPr>
+          <w:b/>
+          <w:bCs/>
+          <w:lang w:val="vi-VN"/>
+        </w:rPr>
+        <w:t>PY</w:t>
+      </w:r>
+      <w:r>
+        <w:rPr>
+          <w:b/>
+          <w:bCs/>
+          <w:lang w:val="vi-VN"/>
+        </w:rPr>
+        <w:t>SPARK</w:t>
+      </w:r>
+      <w:r>
+        <w:rPr>
+          <w:b/>
+          <w:bCs/>
+          <w:lang w:val="vi-VN"/>
+        </w:rPr>
+        <w:t xml:space="preserve"> TRÊN HADOOP CLUSTER</w:t>
       </w:r>
     </w:p>
     <w:p>
@@ -965,7 +1005,831 @@
     </w:p>
     <w:p/>
     <w:p>
-      <w:r>
+      <w:pPr>
+        <w:rPr>
+          <w:lang w:val="vi-VN"/>
+        </w:rPr>
+      </w:pPr>
+      <w:r>
+        <w:br w:type="page"/>
+      </w:r>
+    </w:p>
+    <w:p>
+      <w:pPr>
+        <w:pStyle w:val="Heading1"/>
+        <w:numPr>
+          <w:ilvl w:val="0"/>
+          <w:numId w:val="0"/>
+        </w:numPr>
+        <w:ind w:left="360"/>
+      </w:pPr>
+      <w:r>
+        <w:lastRenderedPageBreak/>
+        <w:t>BẢNG PHÂN CÔNG NHIỆM VỤ</w:t>
+      </w:r>
+    </w:p>
+    <w:tbl>
+      <w:tblPr>
+        <w:tblStyle w:val="TableGrid"/>
+        <w:tblW w:w="9634" w:type="dxa"/>
+        <w:jc w:val="center"/>
+        <w:tblLook w:val="04A0" w:firstRow="1" w:lastRow="0" w:firstColumn="1" w:lastColumn="0" w:noHBand="0" w:noVBand="1"/>
+      </w:tblPr>
+      <w:tblGrid>
+        <w:gridCol w:w="1447"/>
+        <w:gridCol w:w="1339"/>
+        <w:gridCol w:w="2354"/>
+        <w:gridCol w:w="2737"/>
+        <w:gridCol w:w="1757"/>
+      </w:tblGrid>
+      <w:tr>
+        <w:trPr>
+          <w:jc w:val="center"/>
+        </w:trPr>
+        <w:tc>
+          <w:tcPr>
+            <w:tcW w:w="1447" w:type="dxa"/>
+          </w:tcPr>
+          <w:p>
+            <w:pPr>
+              <w:pStyle w:val="Nidung"/>
+              <w:jc w:val="center"/>
+              <w:rPr>
+                <w:b/>
+                <w:bCs/>
+                <w:lang w:val="vi-VN"/>
+              </w:rPr>
+            </w:pPr>
+            <w:r>
+              <w:rPr>
+                <w:b/>
+                <w:bCs/>
+                <w:lang w:val="vi-VN"/>
+              </w:rPr>
+              <w:t>MSSV</w:t>
+            </w:r>
+          </w:p>
+        </w:tc>
+        <w:tc>
+          <w:tcPr>
+            <w:tcW w:w="1339" w:type="dxa"/>
+          </w:tcPr>
+          <w:p>
+            <w:pPr>
+              <w:pStyle w:val="Nidung"/>
+              <w:jc w:val="center"/>
+              <w:rPr>
+                <w:b/>
+                <w:bCs/>
+                <w:lang w:val="vi-VN"/>
+              </w:rPr>
+            </w:pPr>
+            <w:r>
+              <w:rPr>
+                <w:b/>
+                <w:bCs/>
+                <w:lang w:val="vi-VN"/>
+              </w:rPr>
+              <w:t xml:space="preserve">Họ </w:t>
+            </w:r>
+            <w:r>
+              <w:rPr>
+                <w:b/>
+                <w:bCs/>
+                <w:lang w:val="vi-VN"/>
+              </w:rPr>
+              <w:t xml:space="preserve">và </w:t>
+            </w:r>
+            <w:r>
+              <w:rPr>
+                <w:b/>
+                <w:bCs/>
+                <w:lang w:val="vi-VN"/>
+              </w:rPr>
+              <w:t xml:space="preserve">tên </w:t>
+            </w:r>
+          </w:p>
+        </w:tc>
+        <w:tc>
+          <w:tcPr>
+            <w:tcW w:w="2354" w:type="dxa"/>
+          </w:tcPr>
+          <w:p>
+            <w:pPr>
+              <w:pStyle w:val="Nidung"/>
+              <w:jc w:val="center"/>
+              <w:rPr>
+                <w:b/>
+                <w:bCs/>
+                <w:lang w:val="vi-VN"/>
+              </w:rPr>
+            </w:pPr>
+            <w:r>
+              <w:rPr>
+                <w:b/>
+                <w:bCs/>
+                <w:lang w:val="vi-VN"/>
+              </w:rPr>
+              <w:t>Hostname</w:t>
+            </w:r>
+          </w:p>
+        </w:tc>
+        <w:tc>
+          <w:tcPr>
+            <w:tcW w:w="2737" w:type="dxa"/>
+          </w:tcPr>
+          <w:p>
+            <w:pPr>
+              <w:pStyle w:val="Nidung"/>
+              <w:jc w:val="center"/>
+              <w:rPr>
+                <w:b/>
+                <w:bCs/>
+                <w:lang w:val="vi-VN"/>
+              </w:rPr>
+            </w:pPr>
+            <w:r>
+              <w:rPr>
+                <w:b/>
+                <w:bCs/>
+                <w:lang w:val="vi-VN"/>
+              </w:rPr>
+              <w:t>Nhiệm vụ</w:t>
+            </w:r>
+          </w:p>
+        </w:tc>
+        <w:tc>
+          <w:tcPr>
+            <w:tcW w:w="1757" w:type="dxa"/>
+          </w:tcPr>
+          <w:p>
+            <w:pPr>
+              <w:pStyle w:val="Nidung"/>
+              <w:jc w:val="center"/>
+              <w:rPr>
+                <w:b/>
+                <w:bCs/>
+                <w:lang w:val="vi-VN"/>
+              </w:rPr>
+            </w:pPr>
+            <w:r>
+              <w:rPr>
+                <w:b/>
+                <w:bCs/>
+                <w:lang w:val="vi-VN"/>
+              </w:rPr>
+              <w:t>Hoàn thành</w:t>
+            </w:r>
+          </w:p>
+        </w:tc>
+      </w:tr>
+      <w:tr>
+        <w:trPr>
+          <w:jc w:val="center"/>
+        </w:trPr>
+        <w:tc>
+          <w:tcPr>
+            <w:tcW w:w="1447" w:type="dxa"/>
+          </w:tcPr>
+          <w:p>
+            <w:pPr>
+              <w:pStyle w:val="Nidung"/>
+              <w:jc w:val="center"/>
+              <w:rPr>
+                <w:lang w:val="vi-VN"/>
+              </w:rPr>
+            </w:pPr>
+            <w:r>
+              <w:rPr>
+                <w:lang w:val="vi-VN"/>
+              </w:rPr>
+              <w:t>24162006</w:t>
+            </w:r>
+          </w:p>
+        </w:tc>
+        <w:tc>
+          <w:tcPr>
+            <w:tcW w:w="1339" w:type="dxa"/>
+          </w:tcPr>
+          <w:p>
+            <w:pPr>
+              <w:pStyle w:val="Nidung"/>
+              <w:jc w:val="center"/>
+              <w:rPr>
+                <w:lang w:val="vi-VN"/>
+              </w:rPr>
+            </w:pPr>
+            <w:r>
+              <w:rPr>
+                <w:lang w:val="vi-VN"/>
+              </w:rPr>
+              <w:t>Lê Đặng Hoàng Anh</w:t>
+            </w:r>
+          </w:p>
+        </w:tc>
+        <w:tc>
+          <w:tcPr>
+            <w:tcW w:w="2354" w:type="dxa"/>
+          </w:tcPr>
+          <w:p>
+            <w:pPr>
+              <w:pStyle w:val="Nidung"/>
+              <w:jc w:val="center"/>
+            </w:pPr>
+            <w:r>
+              <w:rPr>
+                <w:lang w:val="vi-VN"/>
+              </w:rPr>
+              <w:t>hoanganh24162006</w:t>
+            </w:r>
+            <w:r>
+              <w:t>-master</w:t>
+            </w:r>
+          </w:p>
+        </w:tc>
+        <w:tc>
+          <w:tcPr>
+            <w:tcW w:w="2737" w:type="dxa"/>
+          </w:tcPr>
+          <w:p>
+            <w:pPr>
+              <w:pStyle w:val="Nidung"/>
+              <w:jc w:val="left"/>
+              <w:rPr>
+                <w:lang w:val="vi-VN"/>
+              </w:rPr>
+            </w:pPr>
+            <w:r>
+              <w:rPr>
+                <w:lang w:val="vi-VN"/>
+              </w:rPr>
+              <w:t xml:space="preserve">Cài đặt và cấu hình </w:t>
+            </w:r>
+            <w:r>
+              <w:rPr>
+                <w:lang w:val="vi-VN"/>
+              </w:rPr>
+              <w:t>M</w:t>
+            </w:r>
+            <w:r>
+              <w:rPr>
+                <w:lang w:val="vi-VN"/>
+              </w:rPr>
+              <w:t xml:space="preserve">aster </w:t>
+            </w:r>
+            <w:r>
+              <w:rPr>
+                <w:lang w:val="vi-VN"/>
+              </w:rPr>
+              <w:t>N</w:t>
+            </w:r>
+            <w:r>
+              <w:rPr>
+                <w:lang w:val="vi-VN"/>
+              </w:rPr>
+              <w:t xml:space="preserve">ode </w:t>
+            </w:r>
+            <w:r>
+              <w:rPr>
+                <w:lang w:val="vi-VN"/>
+              </w:rPr>
+              <w:t>trên Docker,</w:t>
+            </w:r>
+            <w:r>
+              <w:rPr>
+                <w:lang w:val="vi-VN"/>
+              </w:rPr>
+              <w:t xml:space="preserve"> thiết kế và khởi tạo Hive </w:t>
+            </w:r>
+            <w:r>
+              <w:rPr>
+                <w:lang w:val="vi-VN"/>
+              </w:rPr>
+              <w:t>database,</w:t>
+            </w:r>
+            <w:r>
+              <w:rPr>
+                <w:lang w:val="vi-VN"/>
+              </w:rPr>
+              <w:t xml:space="preserve"> viết và thực thi WordCount bằng PySpark</w:t>
+            </w:r>
+          </w:p>
+        </w:tc>
+        <w:tc>
+          <w:tcPr>
+            <w:tcW w:w="1757" w:type="dxa"/>
+          </w:tcPr>
+          <w:p>
+            <w:pPr>
+              <w:pStyle w:val="Nidung"/>
+              <w:jc w:val="center"/>
+              <w:rPr>
+                <w:lang w:val="vi-VN"/>
+              </w:rPr>
+            </w:pPr>
+            <w:r>
+              <w:rPr>
+                <w:lang w:val="vi-VN"/>
+              </w:rPr>
+              <w:t>100%</w:t>
+            </w:r>
+          </w:p>
+        </w:tc>
+      </w:tr>
+      <w:tr>
+        <w:trPr>
+          <w:jc w:val="center"/>
+        </w:trPr>
+        <w:tc>
+          <w:tcPr>
+            <w:tcW w:w="1447" w:type="dxa"/>
+          </w:tcPr>
+          <w:p>
+            <w:pPr>
+              <w:pStyle w:val="Nidung"/>
+              <w:jc w:val="center"/>
+              <w:rPr>
+                <w:lang w:val="vi-VN"/>
+              </w:rPr>
+            </w:pPr>
+            <w:r>
+              <w:rPr>
+                <w:lang w:val="vi-VN"/>
+              </w:rPr>
+              <w:t>24162039</w:t>
+            </w:r>
+          </w:p>
+        </w:tc>
+        <w:tc>
+          <w:tcPr>
+            <w:tcW w:w="1339" w:type="dxa"/>
+          </w:tcPr>
+          <w:p>
+            <w:pPr>
+              <w:pStyle w:val="Nidung"/>
+              <w:jc w:val="center"/>
+              <w:rPr>
+                <w:lang w:val="vi-VN"/>
+              </w:rPr>
+            </w:pPr>
+            <w:r>
+              <w:rPr>
+                <w:lang w:val="vi-VN"/>
+              </w:rPr>
+              <w:t>Nguyễn Đức Học</w:t>
+            </w:r>
+          </w:p>
+        </w:tc>
+        <w:tc>
+          <w:tcPr>
+            <w:tcW w:w="2354" w:type="dxa"/>
+          </w:tcPr>
+          <w:p>
+            <w:pPr>
+              <w:pStyle w:val="Nidung"/>
+              <w:jc w:val="center"/>
+            </w:pPr>
+            <w:r>
+              <w:t>hoc-slave1</w:t>
+            </w:r>
+          </w:p>
+        </w:tc>
+        <w:tc>
+          <w:tcPr>
+            <w:tcW w:w="2737" w:type="dxa"/>
+          </w:tcPr>
+          <w:p>
+            <w:pPr>
+              <w:pStyle w:val="Nidung"/>
+              <w:jc w:val="center"/>
+              <w:rPr>
+                <w:lang w:val="vi-VN"/>
+              </w:rPr>
+            </w:pPr>
+            <w:r>
+              <w:rPr>
+                <w:lang w:val="vi-VN"/>
+              </w:rPr>
+              <w:t xml:space="preserve">Cấu hình </w:t>
+            </w:r>
+            <w:r>
+              <w:rPr>
+                <w:lang w:val="vi-VN"/>
+              </w:rPr>
+              <w:t>S</w:t>
+            </w:r>
+            <w:r>
+              <w:rPr>
+                <w:lang w:val="vi-VN"/>
+              </w:rPr>
+              <w:t xml:space="preserve">lave </w:t>
+            </w:r>
+            <w:r>
+              <w:rPr>
+                <w:lang w:val="vi-VN"/>
+              </w:rPr>
+              <w:t>N</w:t>
+            </w:r>
+            <w:r>
+              <w:rPr>
+                <w:lang w:val="vi-VN"/>
+              </w:rPr>
+              <w:t xml:space="preserve">ode </w:t>
+            </w:r>
+            <w:r>
+              <w:rPr>
+                <w:lang w:val="vi-VN"/>
+              </w:rPr>
+              <w:t>1;</w:t>
+            </w:r>
+            <w:r>
+              <w:rPr>
+                <w:lang w:val="vi-VN"/>
+              </w:rPr>
+              <w:t xml:space="preserve"> viết và thực thi truy vấn</w:t>
+            </w:r>
+            <w:r>
+              <w:rPr>
+                <w:lang w:val="vi-VN"/>
+              </w:rPr>
+              <w:t xml:space="preserve"> thống kê số lượng đơn hàng và tổng doanh thu theo thành </w:t>
+            </w:r>
+            <w:r>
+              <w:rPr>
+                <w:lang w:val="vi-VN"/>
+              </w:rPr>
+              <w:t>phố;</w:t>
+            </w:r>
+            <w:r>
+              <w:rPr>
+                <w:lang w:val="vi-VN"/>
+              </w:rPr>
+              <w:t xml:space="preserve"> viết và thực thi chương trình</w:t>
+            </w:r>
+            <w:r>
+              <w:rPr>
+                <w:lang w:val="vi-VN"/>
+              </w:rPr>
+              <w:t xml:space="preserve"> WordMean bằng PySpark</w:t>
+            </w:r>
+          </w:p>
+        </w:tc>
+        <w:tc>
+          <w:tcPr>
+            <w:tcW w:w="1757" w:type="dxa"/>
+          </w:tcPr>
+          <w:p>
+            <w:pPr>
+              <w:pStyle w:val="Nidung"/>
+              <w:jc w:val="center"/>
+              <w:rPr>
+                <w:lang w:val="vi-VN"/>
+              </w:rPr>
+            </w:pPr>
+            <w:r>
+              <w:rPr>
+                <w:lang w:val="vi-VN"/>
+              </w:rPr>
+              <w:t>100%</w:t>
+            </w:r>
+          </w:p>
+        </w:tc>
+      </w:tr>
+      <w:tr>
+        <w:trPr>
+          <w:jc w:val="center"/>
+        </w:trPr>
+        <w:tc>
+          <w:tcPr>
+            <w:tcW w:w="1447" w:type="dxa"/>
+          </w:tcPr>
+          <w:p>
+            <w:pPr>
+              <w:pStyle w:val="Nidung"/>
+              <w:jc w:val="center"/>
+              <w:rPr>
+                <w:lang w:val="vi-VN"/>
+              </w:rPr>
+            </w:pPr>
+          </w:p>
+        </w:tc>
+        <w:tc>
+          <w:tcPr>
+            <w:tcW w:w="1339" w:type="dxa"/>
+          </w:tcPr>
+          <w:p>
+            <w:pPr>
+              <w:pStyle w:val="Nidung"/>
+              <w:jc w:val="center"/>
+              <w:rPr>
+                <w:lang w:val="vi-VN"/>
+              </w:rPr>
+            </w:pPr>
+            <w:r>
+              <w:rPr>
+                <w:lang w:val="vi-VN"/>
+              </w:rPr>
+              <w:t>Quách Lộc Nguyên</w:t>
+            </w:r>
+          </w:p>
+        </w:tc>
+        <w:tc>
+          <w:tcPr>
+            <w:tcW w:w="2354" w:type="dxa"/>
+          </w:tcPr>
+          <w:p>
+            <w:pPr>
+              <w:pStyle w:val="Nidung"/>
+              <w:jc w:val="center"/>
+            </w:pPr>
+            <w:r>
+              <w:t>nguyen-slave2</w:t>
+            </w:r>
+          </w:p>
+        </w:tc>
+        <w:tc>
+          <w:tcPr>
+            <w:tcW w:w="2737" w:type="dxa"/>
+          </w:tcPr>
+          <w:p>
+            <w:pPr>
+              <w:pStyle w:val="Nidung"/>
+              <w:jc w:val="center"/>
+            </w:pPr>
+            <w:r>
+              <w:rPr>
+                <w:lang w:val="vi-VN"/>
+              </w:rPr>
+              <w:t xml:space="preserve">Cấu hình Slave Node </w:t>
+            </w:r>
+            <w:r>
+              <w:rPr>
+                <w:lang w:val="vi-VN"/>
+              </w:rPr>
+              <w:t>2</w:t>
+            </w:r>
+            <w:r>
+              <w:rPr>
+                <w:lang w:val="vi-VN"/>
+              </w:rPr>
+              <w:t>;</w:t>
+            </w:r>
+            <w:r>
+              <w:rPr>
+                <w:lang w:val="vi-VN"/>
+              </w:rPr>
+              <w:t xml:space="preserve"> viết và thực thi truy vấn</w:t>
+            </w:r>
+            <w:r>
+              <w:rPr>
+                <w:lang w:val="vi-VN"/>
+              </w:rPr>
+              <w:t xml:space="preserve"> t</w:t>
+            </w:r>
+            <w:r>
+              <w:t xml:space="preserve">hống kê số lượng đơn hàng và tổng doanh thu theo hương thức thanh </w:t>
+            </w:r>
+            <w:r>
+              <w:t>toán</w:t>
+            </w:r>
+            <w:r>
+              <w:rPr>
+                <w:lang w:val="vi-VN"/>
+              </w:rPr>
+              <w:t>;</w:t>
+            </w:r>
+            <w:r>
+              <w:rPr>
+                <w:lang w:val="vi-VN"/>
+              </w:rPr>
+              <w:t xml:space="preserve"> viết và thực thi chương trình</w:t>
+            </w:r>
+            <w:r>
+              <w:rPr>
+                <w:lang w:val="vi-VN"/>
+              </w:rPr>
+              <w:t xml:space="preserve"> </w:t>
+            </w:r>
+            <w:r>
+              <w:rPr>
+                <w:rFonts w:cs="Times New Roman"/>
+                <w:szCs w:val="26"/>
+              </w:rPr>
+              <w:t>WordMedian</w:t>
+            </w:r>
+            <w:r>
+              <w:rPr>
+                <w:lang w:val="vi-VN"/>
+              </w:rPr>
+              <w:t xml:space="preserve"> bằng PySpark</w:t>
+            </w:r>
+          </w:p>
+        </w:tc>
+        <w:tc>
+          <w:tcPr>
+            <w:tcW w:w="1757" w:type="dxa"/>
+          </w:tcPr>
+          <w:p>
+            <w:pPr>
+              <w:pStyle w:val="Nidung"/>
+              <w:jc w:val="center"/>
+              <w:rPr>
+                <w:lang w:val="vi-VN"/>
+              </w:rPr>
+            </w:pPr>
+            <w:r>
+              <w:rPr>
+                <w:lang w:val="vi-VN"/>
+              </w:rPr>
+              <w:t>100%</w:t>
+            </w:r>
+          </w:p>
+        </w:tc>
+      </w:tr>
+      <w:tr>
+        <w:trPr>
+          <w:jc w:val="center"/>
+        </w:trPr>
+        <w:tc>
+          <w:tcPr>
+            <w:tcW w:w="1447" w:type="dxa"/>
+          </w:tcPr>
+          <w:p>
+            <w:pPr>
+              <w:pStyle w:val="Nidung"/>
+              <w:jc w:val="center"/>
+              <w:rPr>
+                <w:lang w:val="vi-VN"/>
+              </w:rPr>
+            </w:pPr>
+            <w:r>
+              <w:rPr>
+                <w:lang w:val="vi-VN"/>
+              </w:rPr>
+              <w:t>24133004</w:t>
+            </w:r>
+          </w:p>
+        </w:tc>
+        <w:tc>
+          <w:tcPr>
+            <w:tcW w:w="1339" w:type="dxa"/>
+          </w:tcPr>
+          <w:p>
+            <w:pPr>
+              <w:pStyle w:val="Nidung"/>
+              <w:jc w:val="center"/>
+              <w:rPr>
+                <w:lang w:val="vi-VN"/>
+              </w:rPr>
+            </w:pPr>
+            <w:r>
+              <w:rPr>
+                <w:lang w:val="vi-VN"/>
+              </w:rPr>
+              <w:t>Nguyễn Văn Hoàng</w:t>
+            </w:r>
+            <w:r>
+              <w:t xml:space="preserve"> </w:t>
+            </w:r>
+            <w:r>
+              <w:rPr>
+                <w:lang w:val="vi-VN"/>
+              </w:rPr>
+              <w:t>Anh</w:t>
+            </w:r>
+          </w:p>
+        </w:tc>
+        <w:tc>
+          <w:tcPr>
+            <w:tcW w:w="2354" w:type="dxa"/>
+          </w:tcPr>
+          <w:p>
+            <w:pPr>
+              <w:pStyle w:val="Nidung"/>
+              <w:jc w:val="center"/>
+            </w:pPr>
+            <w:r>
+              <w:t>hoanganh24133004-slave3</w:t>
+            </w:r>
+          </w:p>
+        </w:tc>
+        <w:tc>
+          <w:tcPr>
+            <w:tcW w:w="2737" w:type="dxa"/>
+          </w:tcPr>
+          <w:p>
+            <w:pPr>
+              <w:pStyle w:val="Nidung"/>
+              <w:jc w:val="center"/>
+            </w:pPr>
+            <w:r>
+              <w:rPr>
+                <w:lang w:val="vi-VN"/>
+              </w:rPr>
+              <w:t xml:space="preserve">Cấu hình Slave Node </w:t>
+            </w:r>
+            <w:r>
+              <w:rPr>
+                <w:lang w:val="vi-VN"/>
+              </w:rPr>
+              <w:t>3;</w:t>
+            </w:r>
+            <w:r>
+              <w:rPr>
+                <w:lang w:val="vi-VN"/>
+              </w:rPr>
+              <w:t xml:space="preserve"> viết và thực thi truy </w:t>
+            </w:r>
+            <w:r>
+              <w:rPr>
+                <w:lang w:val="vi-VN"/>
+              </w:rPr>
+              <w:t>vấn t</w:t>
+            </w:r>
+            <w:r>
+              <w:t xml:space="preserve">hống kê số lượng đơn hàng và tổng doanh thu theo </w:t>
+            </w:r>
+            <w:r>
+              <w:t>d</w:t>
+            </w:r>
+            <w:r>
+              <w:t>òng sản phẩm</w:t>
+            </w:r>
+            <w:r>
+              <w:rPr>
+                <w:lang w:val="vi-VN"/>
+              </w:rPr>
+              <w:t>;</w:t>
+            </w:r>
+            <w:r>
+              <w:rPr>
+                <w:lang w:val="vi-VN"/>
+              </w:rPr>
+              <w:t xml:space="preserve"> viết và thực thi chương trình</w:t>
+            </w:r>
+            <w:r>
+              <w:rPr>
+                <w:lang w:val="vi-VN"/>
+              </w:rPr>
+              <w:t xml:space="preserve"> </w:t>
+            </w:r>
+            <w:r>
+              <w:rPr>
+                <w:rFonts w:cs="Times New Roman"/>
+                <w:szCs w:val="26"/>
+              </w:rPr>
+              <w:t>WordStandardDeviation</w:t>
+            </w:r>
+            <w:r>
+              <w:rPr>
+                <w:rFonts w:cs="Times New Roman"/>
+                <w:szCs w:val="26"/>
+                <w:lang w:val="vi-VN"/>
+              </w:rPr>
+              <w:t xml:space="preserve"> bằng PySpark</w:t>
+            </w:r>
+          </w:p>
+        </w:tc>
+        <w:tc>
+          <w:tcPr>
+            <w:tcW w:w="1757" w:type="dxa"/>
+          </w:tcPr>
+          <w:p>
+            <w:pPr>
+              <w:pStyle w:val="Nidung"/>
+              <w:jc w:val="center"/>
+              <w:rPr>
+                <w:lang w:val="vi-VN"/>
+              </w:rPr>
+            </w:pPr>
+            <w:r>
+              <w:rPr>
+                <w:lang w:val="vi-VN"/>
+              </w:rPr>
+              <w:t>100%</w:t>
+            </w:r>
+          </w:p>
+        </w:tc>
+      </w:tr>
+    </w:tbl>
+    <w:p>
+      <w:pPr>
+        <w:pStyle w:val="Nidung"/>
+        <w:rPr>
+          <w:lang w:val="vi-VN"/>
+        </w:rPr>
+      </w:pPr>
+    </w:p>
+    <w:p>
+      <w:pPr>
+        <w:rPr>
+          <w:lang w:val="vi-VN"/>
+        </w:rPr>
+      </w:pPr>
+      <w:r>
+        <w:rPr>
+          <w:lang w:val="vi-VN"/>
+        </w:rPr>
         <w:br w:type="page"/>
       </w:r>
     </w:p>
@@ -1161,7 +2025,7 @@
           <w:rPr>
             <w:webHidden/>
           </w:rPr>
-          <w:t>III</w:t>
+          <w:t>IV</w:t>
         </w:r>
         <w:r>
           <w:rPr>
@@ -1218,7 +2082,7 @@
           <w:rPr>
             <w:webHidden/>
           </w:rPr>
-          <w:t>IV</w:t>
+          <w:t>V</w:t>
         </w:r>
         <w:r>
           <w:rPr>
@@ -1275,7 +2139,7 @@
           <w:rPr>
             <w:webHidden/>
           </w:rPr>
-          <w:t>V</w:t>
+          <w:t>VI</w:t>
         </w:r>
         <w:r>
           <w:rPr>
@@ -1558,15 +2422,72 @@
           <w:rPr>
             <w:webHidden/>
           </w:rPr>
-        </w:r>
-        <w:r>
-          <w:rPr>
-            <w:webHidden/>
-          </w:rPr>
           <w:fldChar w:fldCharType="separate"/>
         </w:r>
         <w:r>
           <w:rPr>
+            <w:b/>
+            <w:bCs/>
+            <w:webHidden/>
+          </w:rPr>
+          <w:t>Error! Bookmark not defined.</w:t>
+        </w:r>
+        <w:r>
+          <w:rPr>
+            <w:webHidden/>
+          </w:rPr>
+          <w:fldChar w:fldCharType="end"/>
+        </w:r>
+      </w:hyperlink>
+    </w:p>
+    <w:p>
+      <w:pPr>
+        <w:pStyle w:val="TOC3"/>
+        <w:tabs>
+          <w:tab w:val="right" w:leader="dot" w:pos="9062"/>
+        </w:tabs>
+        <w:rPr>
+          <w:rFonts w:eastAsiaTheme="minorEastAsia"/>
+        </w:rPr>
+      </w:pPr>
+      <w:hyperlink w:anchor="_Toc243211702" w:history="1">
+        <w:r>
+          <w:rPr>
+            <w:rStyle w:val="Hyperlink"/>
+          </w:rPr>
+          <w:t>2.2.1. Dockerfile</w:t>
+        </w:r>
+        <w:r>
+          <w:rPr>
+            <w:webHidden/>
+          </w:rPr>
+          <w:tab/>
+        </w:r>
+        <w:r>
+          <w:rPr>
+            <w:webHidden/>
+          </w:rPr>
+          <w:fldChar w:fldCharType="begin"/>
+        </w:r>
+        <w:r>
+          <w:rPr>
+            <w:webHidden/>
+          </w:rPr>
+          <w:instrText xml:space="preserve"> PAGEREF _Toc243211702 \h </w:instrText>
+        </w:r>
+        <w:r>
+          <w:rPr>
+            <w:webHidden/>
+          </w:rPr>
+        </w:r>
+        <w:r>
+          <w:rPr>
+            <w:webHidden/>
+          </w:rPr>
+          <w:fldChar w:fldCharType="separate"/>
+        </w:r>
+        <w:r>
+          <w:rPr>
             <w:webHidden/>
           </w:rPr>
           <w:t>2</w:t>
@@ -1589,12 +2510,12 @@
           <w:rFonts w:eastAsiaTheme="minorEastAsia"/>
         </w:rPr>
       </w:pPr>
-      <w:hyperlink w:anchor="_Toc243211702" w:history="1">
+      <w:hyperlink w:anchor="_Toc243211703" w:history="1">
         <w:r>
           <w:rPr>
             <w:rStyle w:val="Hyperlink"/>
           </w:rPr>
-          <w:t>2.2.1. Dockerfile</w:t>
+          <w:t>2.2.2. docker-compose.yml</w:t>
         </w:r>
         <w:r>
           <w:rPr>
@@ -1612,7 +2533,7 @@
           <w:rPr>
             <w:webHidden/>
           </w:rPr>
-          <w:instrText xml:space="preserve"> PAGEREF _Toc243211702 \h </w:instrText>
+          <w:instrText xml:space="preserve"> PAGEREF _Toc243211703 \h </w:instrText>
         </w:r>
         <w:r>
           <w:rPr>
@@ -1629,7 +2550,7 @@
           <w:rPr>
             <w:webHidden/>
           </w:rPr>
-          <w:t>2</w:t>
+          <w:t>3</w:t>
         </w:r>
         <w:r>
           <w:rPr>
@@ -1649,12 +2570,12 @@
           <w:rFonts w:eastAsiaTheme="minorEastAsia"/>
         </w:rPr>
       </w:pPr>
-      <w:hyperlink w:anchor="_Toc243211703" w:history="1">
+      <w:hyperlink w:anchor="_Toc243211704" w:history="1">
         <w:r>
           <w:rPr>
             <w:rStyle w:val="Hyperlink"/>
           </w:rPr>
-          <w:t>2.2.2. docker-compose.yml</w:t>
+          <w:t>2.2.3. entrypoint.sh</w:t>
         </w:r>
         <w:r>
           <w:rPr>
@@ -1672,7 +2593,7 @@
           <w:rPr>
             <w:webHidden/>
           </w:rPr>
-          <w:instrText xml:space="preserve"> PAGEREF _Toc243211703 \h </w:instrText>
+          <w:instrText xml:space="preserve"> PAGEREF _Toc243211704 \h </w:instrText>
         </w:r>
         <w:r>
           <w:rPr>
@@ -1689,7 +2610,7 @@
           <w:rPr>
             <w:webHidden/>
           </w:rPr>
-          <w:t>2</w:t>
+          <w:t>3</w:t>
         </w:r>
         <w:r>
           <w:rPr>
@@ -1701,6 +2622,63 @@
     </w:p>
     <w:p>
       <w:pPr>
+        <w:pStyle w:val="TOC2"/>
+        <w:tabs>
+          <w:tab w:val="right" w:leader="dot" w:pos="9062"/>
+        </w:tabs>
+        <w:rPr>
+          <w:rFonts w:eastAsiaTheme="minorEastAsia"/>
+        </w:rPr>
+      </w:pPr>
+      <w:hyperlink w:anchor="_Toc243211705" w:history="1">
+        <w:r>
+          <w:rPr>
+            <w:rStyle w:val="Hyperlink"/>
+          </w:rPr>
+          <w:t>2.3. Cấu hình các file Config Hadoop</w:t>
+        </w:r>
+        <w:r>
+          <w:rPr>
+            <w:webHidden/>
+          </w:rPr>
+          <w:tab/>
+        </w:r>
+        <w:r>
+          <w:rPr>
+            <w:webHidden/>
+          </w:rPr>
+          <w:fldChar w:fldCharType="begin"/>
+        </w:r>
+        <w:r>
+          <w:rPr>
+            <w:webHidden/>
+          </w:rPr>
+          <w:instrText xml:space="preserve"> PAGEREF _Toc243211705 \h </w:instrText>
+        </w:r>
+        <w:r>
+          <w:rPr>
+            <w:webHidden/>
+          </w:rPr>
+          <w:fldChar w:fldCharType="separate"/>
+        </w:r>
+        <w:r>
+          <w:rPr>
+            <w:b/>
+            <w:bCs/>
+            <w:webHidden/>
+          </w:rPr>
+          <w:t>Error! Bookmark not defined.</w:t>
+        </w:r>
+        <w:r>
+          <w:rPr>
+            <w:webHidden/>
+          </w:rPr>
+          <w:fldChar w:fldCharType="end"/>
+        </w:r>
+      </w:hyperlink>
+    </w:p>
+    <w:p>
+      <w:pPr>
         <w:pStyle w:val="TOC3"/>
         <w:tabs>
           <w:tab w:val="right" w:leader="dot" w:pos="9062"/>
@@ -1709,12 +2687,12 @@
           <w:rFonts w:eastAsiaTheme="minorEastAsia"/>
         </w:rPr>
       </w:pPr>
-      <w:hyperlink w:anchor="_Toc243211704" w:history="1">
+      <w:hyperlink w:anchor="_Toc243211706" w:history="1">
         <w:r>
           <w:rPr>
             <w:rStyle w:val="Hyperlink"/>
           </w:rPr>
-          <w:t>2.2.3. entrypoint.sh</w:t>
+          <w:t>2.3.1. core-site.xml</w:t>
         </w:r>
         <w:r>
           <w:rPr>
@@ -1732,7 +2710,7 @@
           <w:rPr>
             <w:webHidden/>
           </w:rPr>
-          <w:instrText xml:space="preserve"> PAGEREF _Toc243211704 \h </w:instrText>
+          <w:instrText xml:space="preserve"> PAGEREF _Toc243211706 \h </w:instrText>
         </w:r>
         <w:r>
           <w:rPr>
@@ -1749,7 +2727,7 @@
           <w:rPr>
             <w:webHidden/>
           </w:rPr>
-          <w:t>2</w:t>
+          <w:t>3</w:t>
         </w:r>
         <w:r>
           <w:rPr>
@@ -1761,6 +2739,306 @@
     </w:p>
     <w:p>
       <w:pPr>
+        <w:pStyle w:val="TOC3"/>
+        <w:tabs>
+          <w:tab w:val="right" w:leader="dot" w:pos="9062"/>
+        </w:tabs>
+        <w:rPr>
+          <w:rFonts w:eastAsiaTheme="minorEastAsia"/>
+        </w:rPr>
+      </w:pPr>
+      <w:hyperlink w:anchor="_Toc243211707" w:history="1">
+        <w:r>
+          <w:rPr>
+            <w:rStyle w:val="Hyperlink"/>
+          </w:rPr>
+          <w:t>2.3.2. hdfs-site.xml</w:t>
+        </w:r>
+        <w:r>
+          <w:rPr>
+            <w:webHidden/>
+          </w:rPr>
+          <w:tab/>
+        </w:r>
+        <w:r>
+          <w:rPr>
+            <w:webHidden/>
+          </w:rPr>
+          <w:fldChar w:fldCharType="begin"/>
+        </w:r>
+        <w:r>
+          <w:rPr>
+            <w:webHidden/>
+          </w:rPr>
+          <w:instrText xml:space="preserve"> PAGEREF _Toc243211707 \h </w:instrText>
+        </w:r>
+        <w:r>
+          <w:rPr>
+            <w:webHidden/>
+          </w:rPr>
+        </w:r>
+        <w:r>
+          <w:rPr>
+            <w:webHidden/>
+          </w:rPr>
+          <w:fldChar w:fldCharType="separate"/>
+        </w:r>
+        <w:r>
+          <w:rPr>
+            <w:webHidden/>
+          </w:rPr>
+          <w:t>3</w:t>
+        </w:r>
+        <w:r>
+          <w:rPr>
+            <w:webHidden/>
+          </w:rPr>
+          <w:fldChar w:fldCharType="end"/>
+        </w:r>
+      </w:hyperlink>
+    </w:p>
+    <w:p>
+      <w:pPr>
+        <w:pStyle w:val="TOC3"/>
+        <w:tabs>
+          <w:tab w:val="right" w:leader="dot" w:pos="9062"/>
+        </w:tabs>
+        <w:rPr>
+          <w:rFonts w:eastAsiaTheme="minorEastAsia"/>
+        </w:rPr>
+      </w:pPr>
+      <w:hyperlink w:anchor="_Toc243211708" w:history="1">
+        <w:r>
+          <w:rPr>
+            <w:rStyle w:val="Hyperlink"/>
+          </w:rPr>
+          <w:t>2.3.3. mapred-site.xml</w:t>
+        </w:r>
+        <w:r>
+          <w:rPr>
+            <w:webHidden/>
+          </w:rPr>
+          <w:tab/>
+        </w:r>
+        <w:r>
+          <w:rPr>
+            <w:webHidden/>
+          </w:rPr>
+          <w:fldChar w:fldCharType="begin"/>
+        </w:r>
+        <w:r>
+          <w:rPr>
+            <w:webHidden/>
+          </w:rPr>
+          <w:instrText xml:space="preserve"> PAGEREF _Toc243211708 \h </w:instrText>
+        </w:r>
+        <w:r>
+          <w:rPr>
+            <w:webHidden/>
+          </w:rPr>
+        </w:r>
+        <w:r>
+          <w:rPr>
+            <w:webHidden/>
+          </w:rPr>
+          <w:fldChar w:fldCharType="separate"/>
+        </w:r>
+        <w:r>
+          <w:rPr>
+            <w:webHidden/>
+          </w:rPr>
+          <w:t>3</w:t>
+        </w:r>
+        <w:r>
+          <w:rPr>
+            <w:webHidden/>
+          </w:rPr>
+          <w:fldChar w:fldCharType="end"/>
+        </w:r>
+      </w:hyperlink>
+    </w:p>
+    <w:p>
+      <w:pPr>
+        <w:pStyle w:val="TOC3"/>
+        <w:tabs>
+          <w:tab w:val="right" w:leader="dot" w:pos="9062"/>
+        </w:tabs>
+        <w:rPr>
+          <w:rFonts w:eastAsiaTheme="minorEastAsia"/>
+        </w:rPr>
+      </w:pPr>
+      <w:hyperlink w:anchor="_Toc243211709" w:history="1">
+        <w:r>
+          <w:rPr>
+            <w:rStyle w:val="Hyperlink"/>
+          </w:rPr>
+          <w:t>2.3.4. yarn-site.xml</w:t>
+        </w:r>
+        <w:r>
+          <w:rPr>
+            <w:webHidden/>
+          </w:rPr>
+          <w:tab/>
+        </w:r>
+        <w:r>
+          <w:rPr>
+            <w:webHidden/>
+          </w:rPr>
+          <w:fldChar w:fldCharType="begin"/>
+        </w:r>
+        <w:r>
+          <w:rPr>
+            <w:webHidden/>
+          </w:rPr>
+          <w:instrText xml:space="preserve"> PAGEREF _Toc243211709 \h </w:instrText>
+        </w:r>
+        <w:r>
+          <w:rPr>
+            <w:webHidden/>
+          </w:rPr>
+        </w:r>
+        <w:r>
+          <w:rPr>
+            <w:webHidden/>
+          </w:rPr>
+          <w:fldChar w:fldCharType="separate"/>
+        </w:r>
+        <w:r>
+          <w:rPr>
+            <w:webHidden/>
+          </w:rPr>
+          <w:t>3</w:t>
+        </w:r>
+        <w:r>
+          <w:rPr>
+            <w:webHidden/>
+          </w:rPr>
+          <w:fldChar w:fldCharType="end"/>
+        </w:r>
+      </w:hyperlink>
+    </w:p>
+    <w:p>
+      <w:pPr>
+        <w:pStyle w:val="TOC3"/>
+        <w:tabs>
+          <w:tab w:val="right" w:leader="dot" w:pos="9062"/>
+        </w:tabs>
+        <w:rPr>
+          <w:rFonts w:eastAsiaTheme="minorEastAsia"/>
+        </w:rPr>
+      </w:pPr>
+      <w:hyperlink w:anchor="_Toc243211710" w:history="1">
+        <w:r>
+          <w:rPr>
+            <w:rStyle w:val="Hyperlink"/>
+          </w:rPr>
+          <w:t>2.3.5. hive-site.xml</w:t>
+        </w:r>
+        <w:r>
+          <w:rPr>
+            <w:webHidden/>
+          </w:rPr>
+          <w:tab/>
+        </w:r>
+        <w:r>
+          <w:rPr>
+            <w:webHidden/>
+          </w:rPr>
+          <w:fldChar w:fldCharType="begin"/>
+        </w:r>
+        <w:r>
+          <w:rPr>
+            <w:webHidden/>
+          </w:rPr>
+          <w:instrText xml:space="preserve"> PAGEREF _Toc243211710 \h </w:instrText>
+        </w:r>
+        <w:r>
+          <w:rPr>
+            <w:webHidden/>
+          </w:rPr>
+        </w:r>
+        <w:r>
+          <w:rPr>
+            <w:webHidden/>
+          </w:rPr>
+          <w:fldChar w:fldCharType="separate"/>
+        </w:r>
+        <w:r>
+          <w:rPr>
+            <w:webHidden/>
+          </w:rPr>
+          <w:t>3</w:t>
+        </w:r>
+        <w:r>
+          <w:rPr>
+            <w:webHidden/>
+          </w:rPr>
+          <w:fldChar w:fldCharType="end"/>
+        </w:r>
+      </w:hyperlink>
+    </w:p>
+    <w:p>
+      <w:pPr>
+        <w:pStyle w:val="TOC3"/>
+        <w:tabs>
+          <w:tab w:val="right" w:leader="dot" w:pos="9062"/>
+        </w:tabs>
+        <w:rPr>
+          <w:rFonts w:eastAsiaTheme="minorEastAsia"/>
+        </w:rPr>
+      </w:pPr>
+      <w:hyperlink w:anchor="_Toc243211711" w:history="1">
+        <w:r>
+          <w:rPr>
+            <w:rStyle w:val="Hyperlink"/>
+          </w:rPr>
+          <w:t>2.3.6. workers.xml</w:t>
+        </w:r>
+        <w:r>
+          <w:rPr>
+            <w:webHidden/>
+          </w:rPr>
+          <w:tab/>
+        </w:r>
+        <w:r>
+          <w:rPr>
+            <w:webHidden/>
+          </w:rPr>
+          <w:fldChar w:fldCharType="begin"/>
+        </w:r>
+        <w:r>
+          <w:rPr>
+            <w:webHidden/>
+          </w:rPr>
+          <w:instrText xml:space="preserve"> PAGEREF _Toc243211711 \h </w:instrText>
+        </w:r>
+        <w:r>
+          <w:rPr>
+            <w:webHidden/>
+          </w:rPr>
+        </w:r>
+        <w:r>
+          <w:rPr>
+            <w:webHidden/>
+          </w:rPr>
+          <w:fldChar w:fldCharType="separate"/>
+        </w:r>
+        <w:r>
+          <w:rPr>
+            <w:webHidden/>
+          </w:rPr>
+          <w:t>3</w:t>
+        </w:r>
+        <w:r>
+          <w:rPr>
+            <w:webHidden/>
+          </w:rPr>
+          <w:fldChar w:fldCharType="end"/>
+        </w:r>
+      </w:hyperlink>
+    </w:p>
+    <w:p>
+      <w:pPr>
         <w:pStyle w:val="TOC2"/>
         <w:tabs>
           <w:tab w:val="right" w:leader="dot" w:pos="9062"/>
@@ -1769,12 +3047,12 @@
           <w:rFonts w:eastAsiaTheme="minorEastAsia"/>
         </w:rPr>
       </w:pPr>
-      <w:hyperlink w:anchor="_Toc243211705" w:history="1">
+      <w:hyperlink w:anchor="_Toc243211712" w:history="1">
         <w:r>
           <w:rPr>
             <w:rStyle w:val="Hyperlink"/>
           </w:rPr>
-          <w:t>2.3. Cấu hình các file Config Hadoop</w:t>
+          <w:t>2.4. Cài đặt Tailscale</w:t>
         </w:r>
         <w:r>
           <w:rPr>
@@ -1792,12 +3070,7 @@
           <w:rPr>
             <w:webHidden/>
           </w:rPr>
-          <w:instrText xml:space="preserve"> PAGEREF _Toc243211705 \h </w:instrText>
-        </w:r>
-        <w:r>
-          <w:rPr>
-            <w:webHidden/>
-          </w:rPr>
+          <w:instrText xml:space="preserve"> PAGEREF _Toc243211712 \h </w:instrText>
         </w:r>
         <w:r>
           <w:rPr>
@@ -1807,9 +3080,11 @@
         </w:r>
         <w:r>
           <w:rPr>
-            <w:webHidden/>
-          </w:rPr>
-          <w:t>3</w:t>
+            <w:b/>
+            <w:bCs/>
+            <w:webHidden/>
+          </w:rPr>
+          <w:t>Error! Bookmark not defined.</w:t>
         </w:r>
         <w:r>
           <w:rPr>
@@ -1821,7 +3096,7 @@
     </w:p>
     <w:p>
       <w:pPr>
-        <w:pStyle w:val="TOC3"/>
+        <w:pStyle w:val="TOC2"/>
         <w:tabs>
           <w:tab w:val="right" w:leader="dot" w:pos="9062"/>
         </w:tabs>
@@ -1829,12 +3104,12 @@
           <w:rFonts w:eastAsiaTheme="minorEastAsia"/>
         </w:rPr>
       </w:pPr>
-      <w:hyperlink w:anchor="_Toc243211706" w:history="1">
+      <w:hyperlink w:anchor="_Toc243211713" w:history="1">
         <w:r>
           <w:rPr>
             <w:rStyle w:val="Hyperlink"/>
           </w:rPr>
-          <w:t>2.3.1. core-site.xml</w:t>
+          <w:t>2.5. Kiểm thử hệ thống</w:t>
         </w:r>
         <w:r>
           <w:rPr>
@@ -1852,12 +3127,7 @@
           <w:rPr>
             <w:webHidden/>
           </w:rPr>
-          <w:instrText xml:space="preserve"> PAGEREF _Toc243211706 \h </w:instrText>
-        </w:r>
-        <w:r>
-          <w:rPr>
-            <w:webHidden/>
-          </w:rPr>
+          <w:instrText xml:space="preserve"> PAGEREF _Toc243211713 \h </w:instrText>
         </w:r>
         <w:r>
           <w:rPr>
@@ -1867,429 +3137,11 @@
         </w:r>
         <w:r>
           <w:rPr>
-            <w:webHidden/>
-          </w:rPr>
-          <w:t>3</w:t>
-        </w:r>
-        <w:r>
-          <w:rPr>
-            <w:webHidden/>
-          </w:rPr>
-          <w:fldChar w:fldCharType="end"/>
-        </w:r>
-      </w:hyperlink>
-    </w:p>
-    <w:p>
-      <w:pPr>
-        <w:pStyle w:val="TOC3"/>
-        <w:tabs>
-          <w:tab w:val="right" w:leader="dot" w:pos="9062"/>
-        </w:tabs>
-        <w:rPr>
-          <w:rFonts w:eastAsiaTheme="minorEastAsia"/>
-        </w:rPr>
-      </w:pPr>
-      <w:hyperlink w:anchor="_Toc243211707" w:history="1">
-        <w:r>
-          <w:rPr>
-            <w:rStyle w:val="Hyperlink"/>
-          </w:rPr>
-          <w:t>2.3.2. hdfs-site.xml</w:t>
-        </w:r>
-        <w:r>
-          <w:rPr>
-            <w:webHidden/>
-          </w:rPr>
-          <w:tab/>
-        </w:r>
-        <w:r>
-          <w:rPr>
-            <w:webHidden/>
-          </w:rPr>
-          <w:fldChar w:fldCharType="begin"/>
-        </w:r>
-        <w:r>
-          <w:rPr>
-            <w:webHidden/>
-          </w:rPr>
-          <w:instrText xml:space="preserve"> PAGEREF _Toc243211707 \h </w:instrText>
-        </w:r>
-        <w:r>
-          <w:rPr>
-            <w:webHidden/>
-          </w:rPr>
-        </w:r>
-        <w:r>
-          <w:rPr>
-            <w:webHidden/>
-          </w:rPr>
-          <w:fldChar w:fldCharType="separate"/>
-        </w:r>
-        <w:r>
-          <w:rPr>
-            <w:webHidden/>
-          </w:rPr>
-          <w:t>3</w:t>
-        </w:r>
-        <w:r>
-          <w:rPr>
-            <w:webHidden/>
-          </w:rPr>
-          <w:fldChar w:fldCharType="end"/>
-        </w:r>
-      </w:hyperlink>
-    </w:p>
-    <w:p>
-      <w:pPr>
-        <w:pStyle w:val="TOC3"/>
-        <w:tabs>
-          <w:tab w:val="right" w:leader="dot" w:pos="9062"/>
-        </w:tabs>
-        <w:rPr>
-          <w:rFonts w:eastAsiaTheme="minorEastAsia"/>
-        </w:rPr>
-      </w:pPr>
-      <w:hyperlink w:anchor="_Toc243211708" w:history="1">
-        <w:r>
-          <w:rPr>
-            <w:rStyle w:val="Hyperlink"/>
-          </w:rPr>
-          <w:t>2.3.3. mapred-site.xml</w:t>
-        </w:r>
-        <w:r>
-          <w:rPr>
-            <w:webHidden/>
-          </w:rPr>
-          <w:tab/>
-        </w:r>
-        <w:r>
-          <w:rPr>
-            <w:webHidden/>
-          </w:rPr>
-          <w:fldChar w:fldCharType="begin"/>
-        </w:r>
-        <w:r>
-          <w:rPr>
-            <w:webHidden/>
-          </w:rPr>
-          <w:instrText xml:space="preserve"> PAGEREF _Toc243211708 \h </w:instrText>
-        </w:r>
-        <w:r>
-          <w:rPr>
-            <w:webHidden/>
-          </w:rPr>
-        </w:r>
-        <w:r>
-          <w:rPr>
-            <w:webHidden/>
-          </w:rPr>
-          <w:fldChar w:fldCharType="separate"/>
-        </w:r>
-        <w:r>
-          <w:rPr>
-            <w:webHidden/>
-          </w:rPr>
-          <w:t>3</w:t>
-        </w:r>
-        <w:r>
-          <w:rPr>
-            <w:webHidden/>
-          </w:rPr>
-          <w:fldChar w:fldCharType="end"/>
-        </w:r>
-      </w:hyperlink>
-    </w:p>
-    <w:p>
-      <w:pPr>
-        <w:pStyle w:val="TOC3"/>
-        <w:tabs>
-          <w:tab w:val="right" w:leader="dot" w:pos="9062"/>
-        </w:tabs>
-        <w:rPr>
-          <w:rFonts w:eastAsiaTheme="minorEastAsia"/>
-        </w:rPr>
-      </w:pPr>
-      <w:hyperlink w:anchor="_Toc243211709" w:history="1">
-        <w:r>
-          <w:rPr>
-            <w:rStyle w:val="Hyperlink"/>
-          </w:rPr>
-          <w:t>2.3.4. yarn-site.xml</w:t>
-        </w:r>
-        <w:r>
-          <w:rPr>
-            <w:webHidden/>
-          </w:rPr>
-          <w:tab/>
-        </w:r>
-        <w:r>
-          <w:rPr>
-            <w:webHidden/>
-          </w:rPr>
-          <w:fldChar w:fldCharType="begin"/>
-        </w:r>
-        <w:r>
-          <w:rPr>
-            <w:webHidden/>
-          </w:rPr>
-          <w:instrText xml:space="preserve"> PAGEREF _Toc243211709 \h </w:instrText>
-        </w:r>
-        <w:r>
-          <w:rPr>
-            <w:webHidden/>
-          </w:rPr>
-        </w:r>
-        <w:r>
-          <w:rPr>
-            <w:webHidden/>
-          </w:rPr>
-          <w:fldChar w:fldCharType="separate"/>
-        </w:r>
-        <w:r>
-          <w:rPr>
-            <w:webHidden/>
-          </w:rPr>
-          <w:t>3</w:t>
-        </w:r>
-        <w:r>
-          <w:rPr>
-            <w:webHidden/>
-          </w:rPr>
-          <w:fldChar w:fldCharType="end"/>
-        </w:r>
-      </w:hyperlink>
-    </w:p>
-    <w:p>
-      <w:pPr>
-        <w:pStyle w:val="TOC3"/>
-        <w:tabs>
-          <w:tab w:val="right" w:leader="dot" w:pos="9062"/>
-        </w:tabs>
-        <w:rPr>
-          <w:rFonts w:eastAsiaTheme="minorEastAsia"/>
-        </w:rPr>
-      </w:pPr>
-      <w:hyperlink w:anchor="_Toc243211710" w:history="1">
-        <w:r>
-          <w:rPr>
-            <w:rStyle w:val="Hyperlink"/>
-          </w:rPr>
-          <w:t>2.3.5. hive-site.xml</w:t>
-        </w:r>
-        <w:r>
-          <w:rPr>
-            <w:webHidden/>
-          </w:rPr>
-          <w:tab/>
-        </w:r>
-        <w:r>
-          <w:rPr>
-            <w:webHidden/>
-          </w:rPr>
-          <w:fldChar w:fldCharType="begin"/>
-        </w:r>
-        <w:r>
-          <w:rPr>
-            <w:webHidden/>
-          </w:rPr>
-          <w:instrText xml:space="preserve"> PAGEREF _Toc243211710 \h </w:instrText>
-        </w:r>
-        <w:r>
-          <w:rPr>
-            <w:webHidden/>
-          </w:rPr>
-        </w:r>
-        <w:r>
-          <w:rPr>
-            <w:webHidden/>
-          </w:rPr>
-          <w:fldChar w:fldCharType="separate"/>
-        </w:r>
-        <w:r>
-          <w:rPr>
-            <w:webHidden/>
-          </w:rPr>
-          <w:t>3</w:t>
-        </w:r>
-        <w:r>
-          <w:rPr>
-            <w:webHidden/>
-          </w:rPr>
-          <w:fldChar w:fldCharType="end"/>
-        </w:r>
-      </w:hyperlink>
-    </w:p>
-    <w:p>
-      <w:pPr>
-        <w:pStyle w:val="TOC3"/>
-        <w:tabs>
-          <w:tab w:val="right" w:leader="dot" w:pos="9062"/>
-        </w:tabs>
-        <w:rPr>
-          <w:rFonts w:eastAsiaTheme="minorEastAsia"/>
-        </w:rPr>
-      </w:pPr>
-      <w:hyperlink w:anchor="_Toc243211711" w:history="1">
-        <w:r>
-          <w:rPr>
-            <w:rStyle w:val="Hyperlink"/>
-          </w:rPr>
-          <w:t>2.3.6. workers.xml</w:t>
-        </w:r>
-        <w:r>
-          <w:rPr>
-            <w:webHidden/>
-          </w:rPr>
-          <w:tab/>
-        </w:r>
-        <w:r>
-          <w:rPr>
-            <w:webHidden/>
-          </w:rPr>
-          <w:fldChar w:fldCharType="begin"/>
-        </w:r>
-        <w:r>
-          <w:rPr>
-            <w:webHidden/>
-          </w:rPr>
-          <w:instrText xml:space="preserve"> PAGEREF _Toc243211711 \h </w:instrText>
-        </w:r>
-        <w:r>
-          <w:rPr>
-            <w:webHidden/>
-          </w:rPr>
-        </w:r>
-        <w:r>
-          <w:rPr>
-            <w:webHidden/>
-          </w:rPr>
-          <w:fldChar w:fldCharType="separate"/>
-        </w:r>
-        <w:r>
-          <w:rPr>
-            <w:webHidden/>
-          </w:rPr>
-          <w:t>3</w:t>
-        </w:r>
-        <w:r>
-          <w:rPr>
-            <w:webHidden/>
-          </w:rPr>
-          <w:fldChar w:fldCharType="end"/>
-        </w:r>
-      </w:hyperlink>
-    </w:p>
-    <w:p>
-      <w:pPr>
-        <w:pStyle w:val="TOC2"/>
-        <w:tabs>
-          <w:tab w:val="right" w:leader="dot" w:pos="9062"/>
-        </w:tabs>
-        <w:rPr>
-          <w:rFonts w:eastAsiaTheme="minorEastAsia"/>
-        </w:rPr>
-      </w:pPr>
-      <w:hyperlink w:anchor="_Toc243211712" w:history="1">
-        <w:r>
-          <w:rPr>
-            <w:rStyle w:val="Hyperlink"/>
-          </w:rPr>
-          <w:t>2.4. Cài đặt Tailscale</w:t>
-        </w:r>
-        <w:r>
-          <w:rPr>
-            <w:webHidden/>
-          </w:rPr>
-          <w:tab/>
-        </w:r>
-        <w:r>
-          <w:rPr>
-            <w:webHidden/>
-          </w:rPr>
-          <w:fldChar w:fldCharType="begin"/>
-        </w:r>
-        <w:r>
-          <w:rPr>
-            <w:webHidden/>
-          </w:rPr>
-          <w:instrText xml:space="preserve"> PAGEREF _Toc243211712 \h </w:instrText>
-        </w:r>
-        <w:r>
-          <w:rPr>
-            <w:webHidden/>
-          </w:rPr>
-        </w:r>
-        <w:r>
-          <w:rPr>
-            <w:webHidden/>
-          </w:rPr>
-          <w:fldChar w:fldCharType="separate"/>
-        </w:r>
-        <w:r>
-          <w:rPr>
-            <w:webHidden/>
-          </w:rPr>
-          <w:t>3</w:t>
-        </w:r>
-        <w:r>
-          <w:rPr>
-            <w:webHidden/>
-          </w:rPr>
-          <w:fldChar w:fldCharType="end"/>
-        </w:r>
-      </w:hyperlink>
-    </w:p>
-    <w:p>
-      <w:pPr>
-        <w:pStyle w:val="TOC2"/>
-        <w:tabs>
-          <w:tab w:val="right" w:leader="dot" w:pos="9062"/>
-        </w:tabs>
-        <w:rPr>
-          <w:rFonts w:eastAsiaTheme="minorEastAsia"/>
-        </w:rPr>
-      </w:pPr>
-      <w:hyperlink w:anchor="_Toc243211713" w:history="1">
-        <w:r>
-          <w:rPr>
-            <w:rStyle w:val="Hyperlink"/>
-          </w:rPr>
-          <w:t>2.5. Kiểm thử hệ thống</w:t>
-        </w:r>
-        <w:r>
-          <w:rPr>
-            <w:webHidden/>
-          </w:rPr>
-          <w:tab/>
-        </w:r>
-        <w:r>
-          <w:rPr>
-            <w:webHidden/>
-          </w:rPr>
-          <w:fldChar w:fldCharType="begin"/>
-        </w:r>
-        <w:r>
-          <w:rPr>
-            <w:webHidden/>
-          </w:rPr>
-          <w:instrText xml:space="preserve"> PAGEREF _Toc243211713 \h </w:instrText>
-        </w:r>
-        <w:r>
-          <w:rPr>
-            <w:webHidden/>
-          </w:rPr>
-        </w:r>
-        <w:r>
-          <w:rPr>
-            <w:webHidden/>
-          </w:rPr>
-          <w:fldChar w:fldCharType="separate"/>
-        </w:r>
-        <w:r>
-          <w:rPr>
-            <w:webHidden/>
-          </w:rPr>
-          <w:t>3</w:t>
+            <w:b/>
+            <w:bCs/>
+            <w:webHidden/>
+          </w:rPr>
+          <w:t>Error! Bookmark not defined.</w:t>
         </w:r>
         <w:r>
           <w:rPr>
@@ -2572,20 +3424,16 @@
             <w:rFonts w:ascii="Times New Roman" w:hAnsi="Times New Roman" w:cs="Times New Roman"/>
             <w:webHidden/>
           </w:rPr>
-        </w:r>
-        <w:r>
-          <w:rPr>
-            <w:rFonts w:ascii="Times New Roman" w:hAnsi="Times New Roman" w:cs="Times New Roman"/>
-            <w:webHidden/>
-          </w:rPr>
           <w:fldChar w:fldCharType="separate"/>
         </w:r>
         <w:r>
           <w:rPr>
             <w:rFonts w:ascii="Times New Roman" w:hAnsi="Times New Roman" w:cs="Times New Roman"/>
-            <w:webHidden/>
-          </w:rPr>
-          <w:t>6</w:t>
+            <w:b/>
+            <w:bCs/>
+            <w:webHidden/>
+          </w:rPr>
+          <w:t>Error! Bookmark not defined.</w:t>
         </w:r>
         <w:r>
           <w:rPr>
@@ -2640,20 +3488,16 @@
             <w:rFonts w:ascii="Times New Roman" w:hAnsi="Times New Roman" w:cs="Times New Roman"/>
             <w:webHidden/>
           </w:rPr>
-        </w:r>
-        <w:r>
-          <w:rPr>
-            <w:rFonts w:ascii="Times New Roman" w:hAnsi="Times New Roman" w:cs="Times New Roman"/>
-            <w:webHidden/>
-          </w:rPr>
           <w:fldChar w:fldCharType="separate"/>
         </w:r>
         <w:r>
           <w:rPr>
             <w:rFonts w:ascii="Times New Roman" w:hAnsi="Times New Roman" w:cs="Times New Roman"/>
-            <w:webHidden/>
-          </w:rPr>
-          <w:t>6</w:t>
+            <w:b/>
+            <w:bCs/>
+            <w:webHidden/>
+          </w:rPr>
+          <w:t>Error! Bookmark not defined.</w:t>
         </w:r>
         <w:r>
           <w:rPr>
@@ -2708,20 +3552,16 @@
             <w:rFonts w:ascii="Times New Roman" w:hAnsi="Times New Roman" w:cs="Times New Roman"/>
             <w:webHidden/>
           </w:rPr>
-        </w:r>
-        <w:r>
-          <w:rPr>
-            <w:rFonts w:ascii="Times New Roman" w:hAnsi="Times New Roman" w:cs="Times New Roman"/>
-            <w:webHidden/>
-          </w:rPr>
           <w:fldChar w:fldCharType="separate"/>
         </w:r>
         <w:r>
           <w:rPr>
             <w:rFonts w:ascii="Times New Roman" w:hAnsi="Times New Roman" w:cs="Times New Roman"/>
-            <w:webHidden/>
-          </w:rPr>
-          <w:t>7</w:t>
+            <w:b/>
+            <w:bCs/>
+            <w:webHidden/>
+          </w:rPr>
+          <w:t>Error! Bookmark not defined.</w:t>
         </w:r>
         <w:r>
           <w:rPr>
@@ -2776,20 +3616,16 @@
             <w:rFonts w:ascii="Times New Roman" w:hAnsi="Times New Roman" w:cs="Times New Roman"/>
             <w:webHidden/>
           </w:rPr>
-        </w:r>
-        <w:r>
-          <w:rPr>
-            <w:rFonts w:ascii="Times New Roman" w:hAnsi="Times New Roman" w:cs="Times New Roman"/>
-            <w:webHidden/>
-          </w:rPr>
           <w:fldChar w:fldCharType="separate"/>
         </w:r>
         <w:r>
           <w:rPr>
             <w:rFonts w:ascii="Times New Roman" w:hAnsi="Times New Roman" w:cs="Times New Roman"/>
-            <w:webHidden/>
-          </w:rPr>
-          <w:t>7</w:t>
+            <w:b/>
+            <w:bCs/>
+            <w:webHidden/>
+          </w:rPr>
+          <w:t>Error! Bookmark not defined.</w:t>
         </w:r>
         <w:r>
           <w:rPr>
@@ -2844,20 +3680,16 @@
             <w:rFonts w:ascii="Times New Roman" w:hAnsi="Times New Roman" w:cs="Times New Roman"/>
             <w:webHidden/>
           </w:rPr>
-        </w:r>
-        <w:r>
-          <w:rPr>
-            <w:rFonts w:ascii="Times New Roman" w:hAnsi="Times New Roman" w:cs="Times New Roman"/>
-            <w:webHidden/>
-          </w:rPr>
           <w:fldChar w:fldCharType="separate"/>
         </w:r>
         <w:r>
           <w:rPr>
             <w:rFonts w:ascii="Times New Roman" w:hAnsi="Times New Roman" w:cs="Times New Roman"/>
-            <w:webHidden/>
-          </w:rPr>
-          <w:t>8</w:t>
+            <w:b/>
+            <w:bCs/>
+            <w:webHidden/>
+          </w:rPr>
+          <w:t>Error! Bookmark not defined.</w:t>
         </w:r>
         <w:r>
           <w:rPr>
@@ -2912,20 +3744,16 @@
             <w:rFonts w:ascii="Times New Roman" w:hAnsi="Times New Roman" w:cs="Times New Roman"/>
             <w:webHidden/>
           </w:rPr>
-        </w:r>
-        <w:r>
-          <w:rPr>
-            <w:rFonts w:ascii="Times New Roman" w:hAnsi="Times New Roman" w:cs="Times New Roman"/>
-            <w:webHidden/>
-          </w:rPr>
           <w:fldChar w:fldCharType="separate"/>
         </w:r>
         <w:r>
           <w:rPr>
             <w:rFonts w:ascii="Times New Roman" w:hAnsi="Times New Roman" w:cs="Times New Roman"/>
-            <w:webHidden/>
-          </w:rPr>
-          <w:t>9</w:t>
+            <w:b/>
+            <w:bCs/>
+            <w:webHidden/>
+          </w:rPr>
+          <w:t>Error! Bookmark not defined.</w:t>
         </w:r>
         <w:r>
           <w:rPr>
@@ -2980,20 +3808,16 @@
             <w:rFonts w:ascii="Times New Roman" w:hAnsi="Times New Roman" w:cs="Times New Roman"/>
             <w:webHidden/>
           </w:rPr>
-        </w:r>
-        <w:r>
-          <w:rPr>
-            <w:rFonts w:ascii="Times New Roman" w:hAnsi="Times New Roman" w:cs="Times New Roman"/>
-            <w:webHidden/>
-          </w:rPr>
           <w:fldChar w:fldCharType="separate"/>
         </w:r>
         <w:r>
           <w:rPr>
             <w:rFonts w:ascii="Times New Roman" w:hAnsi="Times New Roman" w:cs="Times New Roman"/>
-            <w:webHidden/>
-          </w:rPr>
-          <w:t>10</w:t>
+            <w:b/>
+            <w:bCs/>
+            <w:webHidden/>
+          </w:rPr>
+          <w:t>Error! Bookmark not defined.</w:t>
         </w:r>
         <w:r>
           <w:rPr>
@@ -3048,20 +3872,16 @@
             <w:rFonts w:ascii="Times New Roman" w:hAnsi="Times New Roman" w:cs="Times New Roman"/>
             <w:webHidden/>
           </w:rPr>
-        </w:r>
-        <w:r>
-          <w:rPr>
-            <w:rFonts w:ascii="Times New Roman" w:hAnsi="Times New Roman" w:cs="Times New Roman"/>
-            <w:webHidden/>
-          </w:rPr>
           <w:fldChar w:fldCharType="separate"/>
         </w:r>
         <w:r>
           <w:rPr>
             <w:rFonts w:ascii="Times New Roman" w:hAnsi="Times New Roman" w:cs="Times New Roman"/>
-            <w:webHidden/>
-          </w:rPr>
-          <w:t>11</w:t>
+            <w:b/>
+            <w:bCs/>
+            <w:webHidden/>
+          </w:rPr>
+          <w:t>Error! Bookmark not defined.</w:t>
         </w:r>
         <w:r>
           <w:rPr>
@@ -3116,20 +3936,16 @@
             <w:rFonts w:ascii="Times New Roman" w:hAnsi="Times New Roman" w:cs="Times New Roman"/>
             <w:webHidden/>
           </w:rPr>
-        </w:r>
-        <w:r>
-          <w:rPr>
-            <w:rFonts w:ascii="Times New Roman" w:hAnsi="Times New Roman" w:cs="Times New Roman"/>
-            <w:webHidden/>
-          </w:rPr>
           <w:fldChar w:fldCharType="separate"/>
         </w:r>
         <w:r>
           <w:rPr>
             <w:rFonts w:ascii="Times New Roman" w:hAnsi="Times New Roman" w:cs="Times New Roman"/>
-            <w:webHidden/>
-          </w:rPr>
-          <w:t>12</w:t>
+            <w:b/>
+            <w:bCs/>
+            <w:webHidden/>
+          </w:rPr>
+          <w:t>Error! Bookmark not defined.</w:t>
         </w:r>
         <w:r>
           <w:rPr>
@@ -3184,20 +4000,16 @@
             <w:rFonts w:ascii="Times New Roman" w:hAnsi="Times New Roman" w:cs="Times New Roman"/>
             <w:webHidden/>
           </w:rPr>
-        </w:r>
-        <w:r>
-          <w:rPr>
-            <w:rFonts w:ascii="Times New Roman" w:hAnsi="Times New Roman" w:cs="Times New Roman"/>
-            <w:webHidden/>
-          </w:rPr>
           <w:fldChar w:fldCharType="separate"/>
         </w:r>
         <w:r>
           <w:rPr>
             <w:rFonts w:ascii="Times New Roman" w:hAnsi="Times New Roman" w:cs="Times New Roman"/>
-            <w:webHidden/>
-          </w:rPr>
-          <w:t>13</w:t>
+            <w:b/>
+            <w:bCs/>
+            <w:webHidden/>
+          </w:rPr>
+          <w:t>Error! Bookmark not defined.</w:t>
         </w:r>
         <w:r>
           <w:rPr>
@@ -3252,20 +4064,16 @@
             <w:rFonts w:ascii="Times New Roman" w:hAnsi="Times New Roman" w:cs="Times New Roman"/>
             <w:webHidden/>
           </w:rPr>
-        </w:r>
-        <w:r>
-          <w:rPr>
-            <w:rFonts w:ascii="Times New Roman" w:hAnsi="Times New Roman" w:cs="Times New Roman"/>
-            <w:webHidden/>
-          </w:rPr>
           <w:fldChar w:fldCharType="separate"/>
         </w:r>
         <w:r>
           <w:rPr>
             <w:rFonts w:ascii="Times New Roman" w:hAnsi="Times New Roman" w:cs="Times New Roman"/>
-            <w:webHidden/>
-          </w:rPr>
-          <w:t>16</w:t>
+            <w:b/>
+            <w:bCs/>
+            <w:webHidden/>
+          </w:rPr>
+          <w:t>Error! Bookmark not defined.</w:t>
         </w:r>
         <w:r>
           <w:rPr>
@@ -3320,20 +4128,16 @@
             <w:rFonts w:ascii="Times New Roman" w:hAnsi="Times New Roman" w:cs="Times New Roman"/>
             <w:webHidden/>
           </w:rPr>
-        </w:r>
-        <w:r>
-          <w:rPr>
-            <w:rFonts w:ascii="Times New Roman" w:hAnsi="Times New Roman" w:cs="Times New Roman"/>
-            <w:webHidden/>
-          </w:rPr>
           <w:fldChar w:fldCharType="separate"/>
         </w:r>
         <w:r>
           <w:rPr>
             <w:rFonts w:ascii="Times New Roman" w:hAnsi="Times New Roman" w:cs="Times New Roman"/>
-            <w:webHidden/>
-          </w:rPr>
-          <w:t>16</w:t>
+            <w:b/>
+            <w:bCs/>
+            <w:webHidden/>
+          </w:rPr>
+          <w:t>Error! Bookmark not defined.</w:t>
         </w:r>
         <w:r>
           <w:rPr>
@@ -3388,20 +4192,16 @@
             <w:rFonts w:ascii="Times New Roman" w:hAnsi="Times New Roman" w:cs="Times New Roman"/>
             <w:webHidden/>
           </w:rPr>
-        </w:r>
-        <w:r>
-          <w:rPr>
-            <w:rFonts w:ascii="Times New Roman" w:hAnsi="Times New Roman" w:cs="Times New Roman"/>
-            <w:webHidden/>
-          </w:rPr>
           <w:fldChar w:fldCharType="separate"/>
         </w:r>
         <w:r>
           <w:rPr>
             <w:rFonts w:ascii="Times New Roman" w:hAnsi="Times New Roman" w:cs="Times New Roman"/>
-            <w:webHidden/>
-          </w:rPr>
-          <w:t>17</w:t>
+            <w:b/>
+            <w:bCs/>
+            <w:webHidden/>
+          </w:rPr>
+          <w:t>Error! Bookmark not defined.</w:t>
         </w:r>
         <w:r>
           <w:rPr>
@@ -3456,20 +4256,16 @@
             <w:rFonts w:ascii="Times New Roman" w:hAnsi="Times New Roman" w:cs="Times New Roman"/>
             <w:webHidden/>
           </w:rPr>
-        </w:r>
-        <w:r>
-          <w:rPr>
-            <w:rFonts w:ascii="Times New Roman" w:hAnsi="Times New Roman" w:cs="Times New Roman"/>
-            <w:webHidden/>
-          </w:rPr>
           <w:fldChar w:fldCharType="separate"/>
         </w:r>
         <w:r>
           <w:rPr>
             <w:rFonts w:ascii="Times New Roman" w:hAnsi="Times New Roman" w:cs="Times New Roman"/>
-            <w:webHidden/>
-          </w:rPr>
-          <w:t>17</w:t>
+            <w:b/>
+            <w:bCs/>
+            <w:webHidden/>
+          </w:rPr>
+          <w:t>Error! Bookmark not defined.</w:t>
         </w:r>
         <w:r>
           <w:rPr>
@@ -3524,20 +4320,16 @@
             <w:rFonts w:ascii="Times New Roman" w:hAnsi="Times New Roman" w:cs="Times New Roman"/>
             <w:webHidden/>
           </w:rPr>
-        </w:r>
-        <w:r>
-          <w:rPr>
-            <w:rFonts w:ascii="Times New Roman" w:hAnsi="Times New Roman" w:cs="Times New Roman"/>
-            <w:webHidden/>
-          </w:rPr>
           <w:fldChar w:fldCharType="separate"/>
         </w:r>
         <w:r>
           <w:rPr>
             <w:rFonts w:ascii="Times New Roman" w:hAnsi="Times New Roman" w:cs="Times New Roman"/>
-            <w:webHidden/>
-          </w:rPr>
-          <w:t>18</w:t>
+            <w:b/>
+            <w:bCs/>
+            <w:webHidden/>
+          </w:rPr>
+          <w:t>Error! Bookmark not defined.</w:t>
         </w:r>
         <w:r>
           <w:rPr>
@@ -3592,20 +4384,16 @@
             <w:rFonts w:ascii="Times New Roman" w:hAnsi="Times New Roman" w:cs="Times New Roman"/>
             <w:webHidden/>
           </w:rPr>
-        </w:r>
-        <w:r>
-          <w:rPr>
-            <w:rFonts w:ascii="Times New Roman" w:hAnsi="Times New Roman" w:cs="Times New Roman"/>
-            <w:webHidden/>
-          </w:rPr>
           <w:fldChar w:fldCharType="separate"/>
         </w:r>
         <w:r>
           <w:rPr>
             <w:rFonts w:ascii="Times New Roman" w:hAnsi="Times New Roman" w:cs="Times New Roman"/>
-            <w:webHidden/>
-          </w:rPr>
-          <w:t>18</w:t>
+            <w:b/>
+            <w:bCs/>
+            <w:webHidden/>
+          </w:rPr>
+          <w:t>Error! Bookmark not defined.</w:t>
         </w:r>
         <w:r>
           <w:rPr>
@@ -3660,20 +4448,16 @@
             <w:rFonts w:ascii="Times New Roman" w:hAnsi="Times New Roman" w:cs="Times New Roman"/>
             <w:webHidden/>
           </w:rPr>
-        </w:r>
-        <w:r>
-          <w:rPr>
-            <w:rFonts w:ascii="Times New Roman" w:hAnsi="Times New Roman" w:cs="Times New Roman"/>
-            <w:webHidden/>
-          </w:rPr>
           <w:fldChar w:fldCharType="separate"/>
         </w:r>
         <w:r>
           <w:rPr>
             <w:rFonts w:ascii="Times New Roman" w:hAnsi="Times New Roman" w:cs="Times New Roman"/>
-            <w:webHidden/>
-          </w:rPr>
-          <w:t>19</w:t>
+            <w:b/>
+            <w:bCs/>
+            <w:webHidden/>
+          </w:rPr>
+          <w:t>Error! Bookmark not defined.</w:t>
         </w:r>
         <w:r>
           <w:rPr>
@@ -3728,20 +4512,16 @@
             <w:rFonts w:ascii="Times New Roman" w:hAnsi="Times New Roman" w:cs="Times New Roman"/>
             <w:webHidden/>
           </w:rPr>
-        </w:r>
-        <w:r>
-          <w:rPr>
-            <w:rFonts w:ascii="Times New Roman" w:hAnsi="Times New Roman" w:cs="Times New Roman"/>
-            <w:webHidden/>
-          </w:rPr>
           <w:fldChar w:fldCharType="separate"/>
         </w:r>
         <w:r>
           <w:rPr>
             <w:rFonts w:ascii="Times New Roman" w:hAnsi="Times New Roman" w:cs="Times New Roman"/>
-            <w:webHidden/>
-          </w:rPr>
-          <w:t>19</w:t>
+            <w:b/>
+            <w:bCs/>
+            <w:webHidden/>
+          </w:rPr>
+          <w:t>Error! Bookmark not defined.</w:t>
         </w:r>
         <w:r>
           <w:rPr>
@@ -3796,20 +4576,16 @@
             <w:rFonts w:ascii="Times New Roman" w:hAnsi="Times New Roman" w:cs="Times New Roman"/>
             <w:webHidden/>
           </w:rPr>
-        </w:r>
-        <w:r>
-          <w:rPr>
-            <w:rFonts w:ascii="Times New Roman" w:hAnsi="Times New Roman" w:cs="Times New Roman"/>
-            <w:webHidden/>
-          </w:rPr>
           <w:fldChar w:fldCharType="separate"/>
         </w:r>
         <w:r>
           <w:rPr>
             <w:rFonts w:ascii="Times New Roman" w:hAnsi="Times New Roman" w:cs="Times New Roman"/>
-            <w:webHidden/>
-          </w:rPr>
-          <w:t>25</w:t>
+            <w:b/>
+            <w:bCs/>
+            <w:webHidden/>
+          </w:rPr>
+          <w:t>Error! Bookmark not defined.</w:t>
         </w:r>
         <w:r>
           <w:rPr>
@@ -3864,20 +4640,16 @@
             <w:rFonts w:ascii="Times New Roman" w:hAnsi="Times New Roman" w:cs="Times New Roman"/>
             <w:webHidden/>
           </w:rPr>
-        </w:r>
-        <w:r>
-          <w:rPr>
-            <w:rFonts w:ascii="Times New Roman" w:hAnsi="Times New Roman" w:cs="Times New Roman"/>
-            <w:webHidden/>
-          </w:rPr>
           <w:fldChar w:fldCharType="separate"/>
         </w:r>
         <w:r>
           <w:rPr>
             <w:rFonts w:ascii="Times New Roman" w:hAnsi="Times New Roman" w:cs="Times New Roman"/>
-            <w:webHidden/>
-          </w:rPr>
-          <w:t>29</w:t>
+            <w:b/>
+            <w:bCs/>
+            <w:webHidden/>
+          </w:rPr>
+          <w:t>Error! Bookmark not defined.</w:t>
         </w:r>
         <w:r>
           <w:rPr>
@@ -3932,20 +4704,16 @@
             <w:rFonts w:ascii="Times New Roman" w:hAnsi="Times New Roman" w:cs="Times New Roman"/>
             <w:webHidden/>
           </w:rPr>
-        </w:r>
-        <w:r>
-          <w:rPr>
-            <w:rFonts w:ascii="Times New Roman" w:hAnsi="Times New Roman" w:cs="Times New Roman"/>
-            <w:webHidden/>
-          </w:rPr>
           <w:fldChar w:fldCharType="separate"/>
         </w:r>
         <w:r>
           <w:rPr>
             <w:rFonts w:ascii="Times New Roman" w:hAnsi="Times New Roman" w:cs="Times New Roman"/>
-            <w:webHidden/>
-          </w:rPr>
-          <w:t>31</w:t>
+            <w:b/>
+            <w:bCs/>
+            <w:webHidden/>
+          </w:rPr>
+          <w:t>Error! Bookmark not defined.</w:t>
         </w:r>
         <w:r>
           <w:rPr>
@@ -4000,20 +4768,16 @@
             <w:rFonts w:ascii="Times New Roman" w:hAnsi="Times New Roman" w:cs="Times New Roman"/>
             <w:webHidden/>
           </w:rPr>
-        </w:r>
-        <w:r>
-          <w:rPr>
-            <w:rFonts w:ascii="Times New Roman" w:hAnsi="Times New Roman" w:cs="Times New Roman"/>
-            <w:webHidden/>
-          </w:rPr>
           <w:fldChar w:fldCharType="separate"/>
         </w:r>
         <w:r>
           <w:rPr>
             <w:rFonts w:ascii="Times New Roman" w:hAnsi="Times New Roman" w:cs="Times New Roman"/>
-            <w:webHidden/>
-          </w:rPr>
-          <w:t>32</w:t>
+            <w:b/>
+            <w:bCs/>
+            <w:webHidden/>
+          </w:rPr>
+          <w:t>Error! Bookmark not defined.</w:t>
         </w:r>
         <w:r>
           <w:rPr>
@@ -4068,20 +4832,16 @@
             <w:rFonts w:ascii="Times New Roman" w:hAnsi="Times New Roman" w:cs="Times New Roman"/>
             <w:webHidden/>
           </w:rPr>
-        </w:r>
-        <w:r>
-          <w:rPr>
-            <w:rFonts w:ascii="Times New Roman" w:hAnsi="Times New Roman" w:cs="Times New Roman"/>
-            <w:webHidden/>
-          </w:rPr>
           <w:fldChar w:fldCharType="separate"/>
         </w:r>
         <w:r>
           <w:rPr>
             <w:rFonts w:ascii="Times New Roman" w:hAnsi="Times New Roman" w:cs="Times New Roman"/>
-            <w:webHidden/>
-          </w:rPr>
-          <w:t>33</w:t>
+            <w:b/>
+            <w:bCs/>
+            <w:webHidden/>
+          </w:rPr>
+          <w:t>Error! Bookmark not defined.</w:t>
         </w:r>
         <w:r>
           <w:rPr>
@@ -4136,20 +4896,16 @@
             <w:rFonts w:ascii="Times New Roman" w:hAnsi="Times New Roman" w:cs="Times New Roman"/>
             <w:webHidden/>
           </w:rPr>
-        </w:r>
-        <w:r>
-          <w:rPr>
-            <w:rFonts w:ascii="Times New Roman" w:hAnsi="Times New Roman" w:cs="Times New Roman"/>
-            <w:webHidden/>
-          </w:rPr>
           <w:fldChar w:fldCharType="separate"/>
         </w:r>
         <w:r>
           <w:rPr>
             <w:rFonts w:ascii="Times New Roman" w:hAnsi="Times New Roman" w:cs="Times New Roman"/>
-            <w:webHidden/>
-          </w:rPr>
-          <w:t>35</w:t>
+            <w:b/>
+            <w:bCs/>
+            <w:webHidden/>
+          </w:rPr>
+          <w:t>Error! Bookmark not defined.</w:t>
         </w:r>
         <w:r>
           <w:rPr>
@@ -4204,20 +4960,16 @@
             <w:rFonts w:ascii="Times New Roman" w:hAnsi="Times New Roman" w:cs="Times New Roman"/>
             <w:webHidden/>
           </w:rPr>
-        </w:r>
-        <w:r>
-          <w:rPr>
-            <w:rFonts w:ascii="Times New Roman" w:hAnsi="Times New Roman" w:cs="Times New Roman"/>
-            <w:webHidden/>
-          </w:rPr>
           <w:fldChar w:fldCharType="separate"/>
         </w:r>
         <w:r>
           <w:rPr>
             <w:rFonts w:ascii="Times New Roman" w:hAnsi="Times New Roman" w:cs="Times New Roman"/>
-            <w:webHidden/>
-          </w:rPr>
-          <w:t>43</w:t>
+            <w:b/>
+            <w:bCs/>
+            <w:webHidden/>
+          </w:rPr>
+          <w:t>Error! Bookmark not defined.</w:t>
         </w:r>
         <w:r>
           <w:rPr>
@@ -4272,20 +5024,16 @@
             <w:rFonts w:ascii="Times New Roman" w:hAnsi="Times New Roman" w:cs="Times New Roman"/>
             <w:webHidden/>
           </w:rPr>
-        </w:r>
-        <w:r>
-          <w:rPr>
-            <w:rFonts w:ascii="Times New Roman" w:hAnsi="Times New Roman" w:cs="Times New Roman"/>
-            <w:webHidden/>
-          </w:rPr>
           <w:fldChar w:fldCharType="separate"/>
         </w:r>
         <w:r>
           <w:rPr>
             <w:rFonts w:ascii="Times New Roman" w:hAnsi="Times New Roman" w:cs="Times New Roman"/>
-            <w:webHidden/>
-          </w:rPr>
-          <w:t>44</w:t>
+            <w:b/>
+            <w:bCs/>
+            <w:webHidden/>
+          </w:rPr>
+          <w:t>Error! Bookmark not defined.</w:t>
         </w:r>
         <w:r>
           <w:rPr>
@@ -4340,20 +5088,16 @@
             <w:rFonts w:ascii="Times New Roman" w:hAnsi="Times New Roman" w:cs="Times New Roman"/>
             <w:webHidden/>
           </w:rPr>
-        </w:r>
-        <w:r>
-          <w:rPr>
-            <w:rFonts w:ascii="Times New Roman" w:hAnsi="Times New Roman" w:cs="Times New Roman"/>
-            <w:webHidden/>
-          </w:rPr>
           <w:fldChar w:fldCharType="separate"/>
         </w:r>
         <w:r>
           <w:rPr>
             <w:rFonts w:ascii="Times New Roman" w:hAnsi="Times New Roman" w:cs="Times New Roman"/>
-            <w:webHidden/>
-          </w:rPr>
-          <w:t>46</w:t>
+            <w:b/>
+            <w:bCs/>
+            <w:webHidden/>
+          </w:rPr>
+          <w:t>Error! Bookmark not defined.</w:t>
         </w:r>
         <w:r>
           <w:rPr>
@@ -4408,20 +5152,16 @@
             <w:rFonts w:ascii="Times New Roman" w:hAnsi="Times New Roman" w:cs="Times New Roman"/>
             <w:webHidden/>
           </w:rPr>
-        </w:r>
-        <w:r>
-          <w:rPr>
-            <w:rFonts w:ascii="Times New Roman" w:hAnsi="Times New Roman" w:cs="Times New Roman"/>
-            <w:webHidden/>
-          </w:rPr>
           <w:fldChar w:fldCharType="separate"/>
         </w:r>
         <w:r>
           <w:rPr>
             <w:rFonts w:ascii="Times New Roman" w:hAnsi="Times New Roman" w:cs="Times New Roman"/>
-            <w:webHidden/>
-          </w:rPr>
-          <w:t>47</w:t>
+            <w:b/>
+            <w:bCs/>
+            <w:webHidden/>
+          </w:rPr>
+          <w:t>Error! Bookmark not defined.</w:t>
         </w:r>
         <w:r>
           <w:rPr>
@@ -4476,20 +5216,16 @@
             <w:rFonts w:ascii="Times New Roman" w:hAnsi="Times New Roman" w:cs="Times New Roman"/>
             <w:webHidden/>
           </w:rPr>
-        </w:r>
-        <w:r>
-          <w:rPr>
-            <w:rFonts w:ascii="Times New Roman" w:hAnsi="Times New Roman" w:cs="Times New Roman"/>
-            <w:webHidden/>
-          </w:rPr>
           <w:fldChar w:fldCharType="separate"/>
         </w:r>
         <w:r>
           <w:rPr>
             <w:rFonts w:ascii="Times New Roman" w:hAnsi="Times New Roman" w:cs="Times New Roman"/>
-            <w:webHidden/>
-          </w:rPr>
-          <w:t>48</w:t>
+            <w:b/>
+            <w:bCs/>
+            <w:webHidden/>
+          </w:rPr>
+          <w:t>Error! Bookmark not defined.</w:t>
         </w:r>
         <w:r>
           <w:rPr>
@@ -4544,20 +5280,16 @@
             <w:rFonts w:ascii="Times New Roman" w:hAnsi="Times New Roman" w:cs="Times New Roman"/>
             <w:webHidden/>
           </w:rPr>
-        </w:r>
-        <w:r>
-          <w:rPr>
-            <w:rFonts w:ascii="Times New Roman" w:hAnsi="Times New Roman" w:cs="Times New Roman"/>
-            <w:webHidden/>
-          </w:rPr>
           <w:fldChar w:fldCharType="separate"/>
         </w:r>
         <w:r>
           <w:rPr>
             <w:rFonts w:ascii="Times New Roman" w:hAnsi="Times New Roman" w:cs="Times New Roman"/>
-            <w:webHidden/>
-          </w:rPr>
-          <w:t>49</w:t>
+            <w:b/>
+            <w:bCs/>
+            <w:webHidden/>
+          </w:rPr>
+          <w:t>Error! Bookmark not defined.</w:t>
         </w:r>
         <w:r>
           <w:rPr>
@@ -4612,20 +5344,16 @@
             <w:rFonts w:ascii="Times New Roman" w:hAnsi="Times New Roman" w:cs="Times New Roman"/>
             <w:webHidden/>
           </w:rPr>
-        </w:r>
-        <w:r>
-          <w:rPr>
-            <w:rFonts w:ascii="Times New Roman" w:hAnsi="Times New Roman" w:cs="Times New Roman"/>
-            <w:webHidden/>
-          </w:rPr>
           <w:fldChar w:fldCharType="separate"/>
         </w:r>
         <w:r>
           <w:rPr>
             <w:rFonts w:ascii="Times New Roman" w:hAnsi="Times New Roman" w:cs="Times New Roman"/>
-            <w:webHidden/>
-          </w:rPr>
-          <w:t>50</w:t>
+            <w:b/>
+            <w:bCs/>
+            <w:webHidden/>
+          </w:rPr>
+          <w:t>Error! Bookmark not defined.</w:t>
         </w:r>
         <w:r>
           <w:rPr>
@@ -4680,20 +5408,16 @@
             <w:rFonts w:ascii="Times New Roman" w:hAnsi="Times New Roman" w:cs="Times New Roman"/>
             <w:webHidden/>
           </w:rPr>
-        </w:r>
-        <w:r>
-          <w:rPr>
-            <w:rFonts w:ascii="Times New Roman" w:hAnsi="Times New Roman" w:cs="Times New Roman"/>
-            <w:webHidden/>
-          </w:rPr>
           <w:fldChar w:fldCharType="separate"/>
         </w:r>
         <w:r>
           <w:rPr>
             <w:rFonts w:ascii="Times New Roman" w:hAnsi="Times New Roman" w:cs="Times New Roman"/>
-            <w:webHidden/>
-          </w:rPr>
-          <w:t>51</w:t>
+            <w:b/>
+            <w:bCs/>
+            <w:webHidden/>
+          </w:rPr>
+          <w:t>Error! Bookmark not defined.</w:t>
         </w:r>
         <w:r>
           <w:rPr>
@@ -4815,20 +5539,16 @@
             <w:rFonts w:ascii="Times New Roman" w:hAnsi="Times New Roman" w:cs="Times New Roman"/>
             <w:webHidden/>
           </w:rPr>
-        </w:r>
-        <w:r>
-          <w:rPr>
-            <w:rFonts w:ascii="Times New Roman" w:hAnsi="Times New Roman" w:cs="Times New Roman"/>
-            <w:webHidden/>
-          </w:rPr>
           <w:fldChar w:fldCharType="separate"/>
         </w:r>
         <w:r>
           <w:rPr>
             <w:rFonts w:ascii="Times New Roman" w:hAnsi="Times New Roman" w:cs="Times New Roman"/>
-            <w:webHidden/>
-          </w:rPr>
-          <w:t>4</w:t>
+            <w:b/>
+            <w:bCs/>
+            <w:webHidden/>
+          </w:rPr>
+          <w:t>Error! Bookmark not defined.</w:t>
         </w:r>
         <w:r>
           <w:rPr>
@@ -4883,20 +5603,16 @@
             <w:rFonts w:ascii="Times New Roman" w:hAnsi="Times New Roman" w:cs="Times New Roman"/>
             <w:webHidden/>
           </w:rPr>
-        </w:r>
-        <w:r>
-          <w:rPr>
-            <w:rFonts w:ascii="Times New Roman" w:hAnsi="Times New Roman" w:cs="Times New Roman"/>
-            <w:webHidden/>
-          </w:rPr>
           <w:fldChar w:fldCharType="separate"/>
         </w:r>
         <w:r>
           <w:rPr>
             <w:rFonts w:ascii="Times New Roman" w:hAnsi="Times New Roman" w:cs="Times New Roman"/>
-            <w:webHidden/>
-          </w:rPr>
-          <w:t>15</w:t>
+            <w:b/>
+            <w:bCs/>
+            <w:webHidden/>
+          </w:rPr>
+          <w:t>Error! Bookmark not defined.</w:t>
         </w:r>
         <w:r>
           <w:rPr>
@@ -4951,20 +5667,16 @@
             <w:rFonts w:ascii="Times New Roman" w:hAnsi="Times New Roman" w:cs="Times New Roman"/>
             <w:webHidden/>
           </w:rPr>
-        </w:r>
-        <w:r>
-          <w:rPr>
-            <w:rFonts w:ascii="Times New Roman" w:hAnsi="Times New Roman" w:cs="Times New Roman"/>
-            <w:webHidden/>
-          </w:rPr>
           <w:fldChar w:fldCharType="separate"/>
         </w:r>
         <w:r>
           <w:rPr>
             <w:rFonts w:ascii="Times New Roman" w:hAnsi="Times New Roman" w:cs="Times New Roman"/>
-            <w:webHidden/>
-          </w:rPr>
-          <w:t>21</w:t>
+            <w:b/>
+            <w:bCs/>
+            <w:webHidden/>
+          </w:rPr>
+          <w:t>Error! Bookmark not defined.</w:t>
         </w:r>
         <w:r>
           <w:rPr>
@@ -5019,20 +5731,16 @@
             <w:rFonts w:ascii="Times New Roman" w:hAnsi="Times New Roman" w:cs="Times New Roman"/>
             <w:webHidden/>
           </w:rPr>
-        </w:r>
-        <w:r>
-          <w:rPr>
-            <w:rFonts w:ascii="Times New Roman" w:hAnsi="Times New Roman" w:cs="Times New Roman"/>
-            <w:webHidden/>
-          </w:rPr>
           <w:fldChar w:fldCharType="separate"/>
         </w:r>
         <w:r>
           <w:rPr>
             <w:rFonts w:ascii="Times New Roman" w:hAnsi="Times New Roman" w:cs="Times New Roman"/>
-            <w:webHidden/>
-          </w:rPr>
-          <w:t>24</w:t>
+            <w:b/>
+            <w:bCs/>
+            <w:webHidden/>
+          </w:rPr>
+          <w:t>Error! Bookmark not defined.</w:t>
         </w:r>
         <w:r>
           <w:rPr>
@@ -5087,20 +5795,16 @@
             <w:rFonts w:ascii="Times New Roman" w:hAnsi="Times New Roman" w:cs="Times New Roman"/>
             <w:webHidden/>
           </w:rPr>
-        </w:r>
-        <w:r>
-          <w:rPr>
-            <w:rFonts w:ascii="Times New Roman" w:hAnsi="Times New Roman" w:cs="Times New Roman"/>
-            <w:webHidden/>
-          </w:rPr>
           <w:fldChar w:fldCharType="separate"/>
         </w:r>
         <w:r>
           <w:rPr>
             <w:rFonts w:ascii="Times New Roman" w:hAnsi="Times New Roman" w:cs="Times New Roman"/>
-            <w:webHidden/>
-          </w:rPr>
-          <w:t>26</w:t>
+            <w:b/>
+            <w:bCs/>
+            <w:webHidden/>
+          </w:rPr>
+          <w:t>Error! Bookmark not defined.</w:t>
         </w:r>
         <w:r>
           <w:rPr>
@@ -5155,20 +5859,16 @@
             <w:rFonts w:ascii="Times New Roman" w:hAnsi="Times New Roman" w:cs="Times New Roman"/>
             <w:webHidden/>
           </w:rPr>
-        </w:r>
-        <w:r>
-          <w:rPr>
-            <w:rFonts w:ascii="Times New Roman" w:hAnsi="Times New Roman" w:cs="Times New Roman"/>
-            <w:webHidden/>
-          </w:rPr>
           <w:fldChar w:fldCharType="separate"/>
         </w:r>
         <w:r>
           <w:rPr>
             <w:rFonts w:ascii="Times New Roman" w:hAnsi="Times New Roman" w:cs="Times New Roman"/>
-            <w:webHidden/>
-          </w:rPr>
-          <w:t>41</w:t>
+            <w:b/>
+            <w:bCs/>
+            <w:webHidden/>
+          </w:rPr>
+          <w:t>Error! Bookmark not defined.</w:t>
         </w:r>
         <w:r>
           <w:rPr>
@@ -5244,6 +5944,22 @@
     </w:p>
     <w:p>
       <w:pPr>
+        <w:pStyle w:val="Nidung"/>
+        <w:rPr>
+          <w:lang w:val="vi-VN"/>
+        </w:rPr>
+      </w:pPr>
+    </w:p>
+    <w:p>
+      <w:pPr>
+        <w:pStyle w:val="Nidung"/>
+        <w:rPr>
+          <w:lang w:val="vi-VN"/>
+        </w:rPr>
+      </w:pPr>
+    </w:p>
+    <w:p>
+      <w:pPr>
         <w:rPr>
           <w:rFonts w:ascii="Times New Roman" w:eastAsiaTheme="majorEastAsia" w:hAnsi="Times New Roman" w:cs="Times New Roman"/>
           <w:b/>
@@ -5274,6 +5990,12 @@
       </w:pPr>
       <w:r>
         <w:t>CÀI ĐẶT TAILSCALE</w:t>
+      </w:r>
+      <w:r>
+        <w:t xml:space="preserve"> VÀ CẤU HÌNH KẾT NỐI</w:t>
+      </w:r>
+      <w:r>
+        <w:t xml:space="preserve"> GIỮA CÁC MÁY</w:t>
       </w:r>
     </w:p>
     <w:p>
@@ -5933,6 +6655,29 @@
     </w:p>
     <w:p>
       <w:pPr>
+        <w:pStyle w:val="Nidung"/>
+        <w:rPr>
+          <w:lang w:val="vi-VN"/>
+        </w:rPr>
+      </w:pPr>
+    </w:p>
+    <w:p>
+      <w:pPr>
+        <w:rPr>
+          <w:rFonts w:ascii="Times New Roman" w:eastAsiaTheme="majorEastAsia" w:hAnsi="Times New Roman" w:cs="Times New Roman"/>
+          <w:b/>
+          <w:caps/>
+          <w:sz w:val="28"/>
+          <w:szCs w:val="40"/>
+        </w:rPr>
+      </w:pPr>
+      <w:bookmarkStart w:id="20" w:name="_Toc243211715"/>
+      <w:r>
+        <w:br w:type="page"/>
+      </w:r>
+    </w:p>
+    <w:p>
+      <w:pPr>
         <w:pStyle w:val="Heading1"/>
         <w:numPr>
           <w:ilvl w:val="0"/>
@@ -5943,11 +6688,11 @@
           <w:lang w:val="en-US"/>
         </w:rPr>
       </w:pPr>
-      <w:bookmarkStart w:id="20" w:name="_Toc243211715"/>
       <w:r>
         <w:rPr>
           <w:lang w:val="en-US"/>
         </w:rPr>
+        <w:lastRenderedPageBreak/>
         <w:t>KẾT LUẬN</w:t>
       </w:r>
       <w:bookmarkEnd w:id="6"/>
@@ -9281,7 +10026,6 @@
   <w:style w:type="character" w:default="1" w:styleId="DefaultParagraphFont">
     <w:name w:val="Default Paragraph Font"/>
     <w:uiPriority w:val="1"/>
-    <w:semiHidden/>
     <w:unhideWhenUsed/>
   </w:style>
   <w:style w:type="table" w:default="1" w:styleId="TableNormal">

</xml_diff>

<commit_message>
fix(hive): change the hive 4.2.0 to hive 4.1.0 to support the jdk 17
</commit_message>
<xml_diff>
--- a/docs/baocao.docx
+++ b/docs/baocao.docx
@@ -2422,6 +2422,11 @@
           <w:rPr>
             <w:webHidden/>
           </w:rPr>
+        </w:r>
+        <w:r>
+          <w:rPr>
+            <w:webHidden/>
+          </w:rPr>
           <w:fldChar w:fldCharType="separate"/>
         </w:r>
         <w:r>
@@ -2659,6 +2664,11 @@
           <w:rPr>
             <w:webHidden/>
           </w:rPr>
+        </w:r>
+        <w:r>
+          <w:rPr>
+            <w:webHidden/>
+          </w:rPr>
           <w:fldChar w:fldCharType="separate"/>
         </w:r>
         <w:r>
@@ -3076,6 +3086,11 @@
           <w:rPr>
             <w:webHidden/>
           </w:rPr>
+        </w:r>
+        <w:r>
+          <w:rPr>
+            <w:webHidden/>
+          </w:rPr>
           <w:fldChar w:fldCharType="separate"/>
         </w:r>
         <w:r>
@@ -3128,6 +3143,11 @@
             <w:webHidden/>
           </w:rPr>
           <w:instrText xml:space="preserve"> PAGEREF _Toc243211713 \h </w:instrText>
+        </w:r>
+        <w:r>
+          <w:rPr>
+            <w:webHidden/>
+          </w:rPr>
         </w:r>
         <w:r>
           <w:rPr>
@@ -3424,6 +3444,12 @@
             <w:rFonts w:ascii="Times New Roman" w:hAnsi="Times New Roman" w:cs="Times New Roman"/>
             <w:webHidden/>
           </w:rPr>
+        </w:r>
+        <w:r>
+          <w:rPr>
+            <w:rFonts w:ascii="Times New Roman" w:hAnsi="Times New Roman" w:cs="Times New Roman"/>
+            <w:webHidden/>
+          </w:rPr>
           <w:fldChar w:fldCharType="separate"/>
         </w:r>
         <w:r>
@@ -3488,6 +3514,12 @@
             <w:rFonts w:ascii="Times New Roman" w:hAnsi="Times New Roman" w:cs="Times New Roman"/>
             <w:webHidden/>
           </w:rPr>
+        </w:r>
+        <w:r>
+          <w:rPr>
+            <w:rFonts w:ascii="Times New Roman" w:hAnsi="Times New Roman" w:cs="Times New Roman"/>
+            <w:webHidden/>
+          </w:rPr>
           <w:fldChar w:fldCharType="separate"/>
         </w:r>
         <w:r>
@@ -3552,6 +3584,12 @@
             <w:rFonts w:ascii="Times New Roman" w:hAnsi="Times New Roman" w:cs="Times New Roman"/>
             <w:webHidden/>
           </w:rPr>
+        </w:r>
+        <w:r>
+          <w:rPr>
+            <w:rFonts w:ascii="Times New Roman" w:hAnsi="Times New Roman" w:cs="Times New Roman"/>
+            <w:webHidden/>
+          </w:rPr>
           <w:fldChar w:fldCharType="separate"/>
         </w:r>
         <w:r>
@@ -3616,6 +3654,12 @@
             <w:rFonts w:ascii="Times New Roman" w:hAnsi="Times New Roman" w:cs="Times New Roman"/>
             <w:webHidden/>
           </w:rPr>
+        </w:r>
+        <w:r>
+          <w:rPr>
+            <w:rFonts w:ascii="Times New Roman" w:hAnsi="Times New Roman" w:cs="Times New Roman"/>
+            <w:webHidden/>
+          </w:rPr>
           <w:fldChar w:fldCharType="separate"/>
         </w:r>
         <w:r>
@@ -3680,6 +3724,12 @@
             <w:rFonts w:ascii="Times New Roman" w:hAnsi="Times New Roman" w:cs="Times New Roman"/>
             <w:webHidden/>
           </w:rPr>
+        </w:r>
+        <w:r>
+          <w:rPr>
+            <w:rFonts w:ascii="Times New Roman" w:hAnsi="Times New Roman" w:cs="Times New Roman"/>
+            <w:webHidden/>
+          </w:rPr>
           <w:fldChar w:fldCharType="separate"/>
         </w:r>
         <w:r>
@@ -3744,6 +3794,12 @@
             <w:rFonts w:ascii="Times New Roman" w:hAnsi="Times New Roman" w:cs="Times New Roman"/>
             <w:webHidden/>
           </w:rPr>
+        </w:r>
+        <w:r>
+          <w:rPr>
+            <w:rFonts w:ascii="Times New Roman" w:hAnsi="Times New Roman" w:cs="Times New Roman"/>
+            <w:webHidden/>
+          </w:rPr>
           <w:fldChar w:fldCharType="separate"/>
         </w:r>
         <w:r>
@@ -3808,6 +3864,12 @@
             <w:rFonts w:ascii="Times New Roman" w:hAnsi="Times New Roman" w:cs="Times New Roman"/>
             <w:webHidden/>
           </w:rPr>
+        </w:r>
+        <w:r>
+          <w:rPr>
+            <w:rFonts w:ascii="Times New Roman" w:hAnsi="Times New Roman" w:cs="Times New Roman"/>
+            <w:webHidden/>
+          </w:rPr>
           <w:fldChar w:fldCharType="separate"/>
         </w:r>
         <w:r>
@@ -3872,6 +3934,12 @@
             <w:rFonts w:ascii="Times New Roman" w:hAnsi="Times New Roman" w:cs="Times New Roman"/>
             <w:webHidden/>
           </w:rPr>
+        </w:r>
+        <w:r>
+          <w:rPr>
+            <w:rFonts w:ascii="Times New Roman" w:hAnsi="Times New Roman" w:cs="Times New Roman"/>
+            <w:webHidden/>
+          </w:rPr>
           <w:fldChar w:fldCharType="separate"/>
         </w:r>
         <w:r>
@@ -3936,6 +4004,12 @@
             <w:rFonts w:ascii="Times New Roman" w:hAnsi="Times New Roman" w:cs="Times New Roman"/>
             <w:webHidden/>
           </w:rPr>
+        </w:r>
+        <w:r>
+          <w:rPr>
+            <w:rFonts w:ascii="Times New Roman" w:hAnsi="Times New Roman" w:cs="Times New Roman"/>
+            <w:webHidden/>
+          </w:rPr>
           <w:fldChar w:fldCharType="separate"/>
         </w:r>
         <w:r>
@@ -4000,6 +4074,12 @@
             <w:rFonts w:ascii="Times New Roman" w:hAnsi="Times New Roman" w:cs="Times New Roman"/>
             <w:webHidden/>
           </w:rPr>
+        </w:r>
+        <w:r>
+          <w:rPr>
+            <w:rFonts w:ascii="Times New Roman" w:hAnsi="Times New Roman" w:cs="Times New Roman"/>
+            <w:webHidden/>
+          </w:rPr>
           <w:fldChar w:fldCharType="separate"/>
         </w:r>
         <w:r>
@@ -4064,6 +4144,12 @@
             <w:rFonts w:ascii="Times New Roman" w:hAnsi="Times New Roman" w:cs="Times New Roman"/>
             <w:webHidden/>
           </w:rPr>
+        </w:r>
+        <w:r>
+          <w:rPr>
+            <w:rFonts w:ascii="Times New Roman" w:hAnsi="Times New Roman" w:cs="Times New Roman"/>
+            <w:webHidden/>
+          </w:rPr>
           <w:fldChar w:fldCharType="separate"/>
         </w:r>
         <w:r>
@@ -4128,6 +4214,12 @@
             <w:rFonts w:ascii="Times New Roman" w:hAnsi="Times New Roman" w:cs="Times New Roman"/>
             <w:webHidden/>
           </w:rPr>
+        </w:r>
+        <w:r>
+          <w:rPr>
+            <w:rFonts w:ascii="Times New Roman" w:hAnsi="Times New Roman" w:cs="Times New Roman"/>
+            <w:webHidden/>
+          </w:rPr>
           <w:fldChar w:fldCharType="separate"/>
         </w:r>
         <w:r>
@@ -4192,6 +4284,12 @@
             <w:rFonts w:ascii="Times New Roman" w:hAnsi="Times New Roman" w:cs="Times New Roman"/>
             <w:webHidden/>
           </w:rPr>
+        </w:r>
+        <w:r>
+          <w:rPr>
+            <w:rFonts w:ascii="Times New Roman" w:hAnsi="Times New Roman" w:cs="Times New Roman"/>
+            <w:webHidden/>
+          </w:rPr>
           <w:fldChar w:fldCharType="separate"/>
         </w:r>
         <w:r>
@@ -4256,6 +4354,12 @@
             <w:rFonts w:ascii="Times New Roman" w:hAnsi="Times New Roman" w:cs="Times New Roman"/>
             <w:webHidden/>
           </w:rPr>
+        </w:r>
+        <w:r>
+          <w:rPr>
+            <w:rFonts w:ascii="Times New Roman" w:hAnsi="Times New Roman" w:cs="Times New Roman"/>
+            <w:webHidden/>
+          </w:rPr>
           <w:fldChar w:fldCharType="separate"/>
         </w:r>
         <w:r>
@@ -4320,6 +4424,12 @@
             <w:rFonts w:ascii="Times New Roman" w:hAnsi="Times New Roman" w:cs="Times New Roman"/>
             <w:webHidden/>
           </w:rPr>
+        </w:r>
+        <w:r>
+          <w:rPr>
+            <w:rFonts w:ascii="Times New Roman" w:hAnsi="Times New Roman" w:cs="Times New Roman"/>
+            <w:webHidden/>
+          </w:rPr>
           <w:fldChar w:fldCharType="separate"/>
         </w:r>
         <w:r>
@@ -4384,6 +4494,12 @@
             <w:rFonts w:ascii="Times New Roman" w:hAnsi="Times New Roman" w:cs="Times New Roman"/>
             <w:webHidden/>
           </w:rPr>
+        </w:r>
+        <w:r>
+          <w:rPr>
+            <w:rFonts w:ascii="Times New Roman" w:hAnsi="Times New Roman" w:cs="Times New Roman"/>
+            <w:webHidden/>
+          </w:rPr>
           <w:fldChar w:fldCharType="separate"/>
         </w:r>
         <w:r>
@@ -4448,6 +4564,12 @@
             <w:rFonts w:ascii="Times New Roman" w:hAnsi="Times New Roman" w:cs="Times New Roman"/>
             <w:webHidden/>
           </w:rPr>
+        </w:r>
+        <w:r>
+          <w:rPr>
+            <w:rFonts w:ascii="Times New Roman" w:hAnsi="Times New Roman" w:cs="Times New Roman"/>
+            <w:webHidden/>
+          </w:rPr>
           <w:fldChar w:fldCharType="separate"/>
         </w:r>
         <w:r>
@@ -4512,6 +4634,12 @@
             <w:rFonts w:ascii="Times New Roman" w:hAnsi="Times New Roman" w:cs="Times New Roman"/>
             <w:webHidden/>
           </w:rPr>
+        </w:r>
+        <w:r>
+          <w:rPr>
+            <w:rFonts w:ascii="Times New Roman" w:hAnsi="Times New Roman" w:cs="Times New Roman"/>
+            <w:webHidden/>
+          </w:rPr>
           <w:fldChar w:fldCharType="separate"/>
         </w:r>
         <w:r>
@@ -4576,6 +4704,12 @@
             <w:rFonts w:ascii="Times New Roman" w:hAnsi="Times New Roman" w:cs="Times New Roman"/>
             <w:webHidden/>
           </w:rPr>
+        </w:r>
+        <w:r>
+          <w:rPr>
+            <w:rFonts w:ascii="Times New Roman" w:hAnsi="Times New Roman" w:cs="Times New Roman"/>
+            <w:webHidden/>
+          </w:rPr>
           <w:fldChar w:fldCharType="separate"/>
         </w:r>
         <w:r>
@@ -4640,6 +4774,12 @@
             <w:rFonts w:ascii="Times New Roman" w:hAnsi="Times New Roman" w:cs="Times New Roman"/>
             <w:webHidden/>
           </w:rPr>
+        </w:r>
+        <w:r>
+          <w:rPr>
+            <w:rFonts w:ascii="Times New Roman" w:hAnsi="Times New Roman" w:cs="Times New Roman"/>
+            <w:webHidden/>
+          </w:rPr>
           <w:fldChar w:fldCharType="separate"/>
         </w:r>
         <w:r>
@@ -4704,6 +4844,12 @@
             <w:rFonts w:ascii="Times New Roman" w:hAnsi="Times New Roman" w:cs="Times New Roman"/>
             <w:webHidden/>
           </w:rPr>
+        </w:r>
+        <w:r>
+          <w:rPr>
+            <w:rFonts w:ascii="Times New Roman" w:hAnsi="Times New Roman" w:cs="Times New Roman"/>
+            <w:webHidden/>
+          </w:rPr>
           <w:fldChar w:fldCharType="separate"/>
         </w:r>
         <w:r>
@@ -4768,6 +4914,12 @@
             <w:rFonts w:ascii="Times New Roman" w:hAnsi="Times New Roman" w:cs="Times New Roman"/>
             <w:webHidden/>
           </w:rPr>
+        </w:r>
+        <w:r>
+          <w:rPr>
+            <w:rFonts w:ascii="Times New Roman" w:hAnsi="Times New Roman" w:cs="Times New Roman"/>
+            <w:webHidden/>
+          </w:rPr>
           <w:fldChar w:fldCharType="separate"/>
         </w:r>
         <w:r>
@@ -4832,6 +4984,12 @@
             <w:rFonts w:ascii="Times New Roman" w:hAnsi="Times New Roman" w:cs="Times New Roman"/>
             <w:webHidden/>
           </w:rPr>
+        </w:r>
+        <w:r>
+          <w:rPr>
+            <w:rFonts w:ascii="Times New Roman" w:hAnsi="Times New Roman" w:cs="Times New Roman"/>
+            <w:webHidden/>
+          </w:rPr>
           <w:fldChar w:fldCharType="separate"/>
         </w:r>
         <w:r>
@@ -4896,6 +5054,12 @@
             <w:rFonts w:ascii="Times New Roman" w:hAnsi="Times New Roman" w:cs="Times New Roman"/>
             <w:webHidden/>
           </w:rPr>
+        </w:r>
+        <w:r>
+          <w:rPr>
+            <w:rFonts w:ascii="Times New Roman" w:hAnsi="Times New Roman" w:cs="Times New Roman"/>
+            <w:webHidden/>
+          </w:rPr>
           <w:fldChar w:fldCharType="separate"/>
         </w:r>
         <w:r>
@@ -4960,6 +5124,12 @@
             <w:rFonts w:ascii="Times New Roman" w:hAnsi="Times New Roman" w:cs="Times New Roman"/>
             <w:webHidden/>
           </w:rPr>
+        </w:r>
+        <w:r>
+          <w:rPr>
+            <w:rFonts w:ascii="Times New Roman" w:hAnsi="Times New Roman" w:cs="Times New Roman"/>
+            <w:webHidden/>
+          </w:rPr>
           <w:fldChar w:fldCharType="separate"/>
         </w:r>
         <w:r>
@@ -5024,6 +5194,12 @@
             <w:rFonts w:ascii="Times New Roman" w:hAnsi="Times New Roman" w:cs="Times New Roman"/>
             <w:webHidden/>
           </w:rPr>
+        </w:r>
+        <w:r>
+          <w:rPr>
+            <w:rFonts w:ascii="Times New Roman" w:hAnsi="Times New Roman" w:cs="Times New Roman"/>
+            <w:webHidden/>
+          </w:rPr>
           <w:fldChar w:fldCharType="separate"/>
         </w:r>
         <w:r>
@@ -5088,6 +5264,12 @@
             <w:rFonts w:ascii="Times New Roman" w:hAnsi="Times New Roman" w:cs="Times New Roman"/>
             <w:webHidden/>
           </w:rPr>
+        </w:r>
+        <w:r>
+          <w:rPr>
+            <w:rFonts w:ascii="Times New Roman" w:hAnsi="Times New Roman" w:cs="Times New Roman"/>
+            <w:webHidden/>
+          </w:rPr>
           <w:fldChar w:fldCharType="separate"/>
         </w:r>
         <w:r>
@@ -5152,6 +5334,12 @@
             <w:rFonts w:ascii="Times New Roman" w:hAnsi="Times New Roman" w:cs="Times New Roman"/>
             <w:webHidden/>
           </w:rPr>
+        </w:r>
+        <w:r>
+          <w:rPr>
+            <w:rFonts w:ascii="Times New Roman" w:hAnsi="Times New Roman" w:cs="Times New Roman"/>
+            <w:webHidden/>
+          </w:rPr>
           <w:fldChar w:fldCharType="separate"/>
         </w:r>
         <w:r>
@@ -5216,6 +5404,12 @@
             <w:rFonts w:ascii="Times New Roman" w:hAnsi="Times New Roman" w:cs="Times New Roman"/>
             <w:webHidden/>
           </w:rPr>
+        </w:r>
+        <w:r>
+          <w:rPr>
+            <w:rFonts w:ascii="Times New Roman" w:hAnsi="Times New Roman" w:cs="Times New Roman"/>
+            <w:webHidden/>
+          </w:rPr>
           <w:fldChar w:fldCharType="separate"/>
         </w:r>
         <w:r>
@@ -5280,6 +5474,12 @@
             <w:rFonts w:ascii="Times New Roman" w:hAnsi="Times New Roman" w:cs="Times New Roman"/>
             <w:webHidden/>
           </w:rPr>
+        </w:r>
+        <w:r>
+          <w:rPr>
+            <w:rFonts w:ascii="Times New Roman" w:hAnsi="Times New Roman" w:cs="Times New Roman"/>
+            <w:webHidden/>
+          </w:rPr>
           <w:fldChar w:fldCharType="separate"/>
         </w:r>
         <w:r>
@@ -5344,6 +5544,12 @@
             <w:rFonts w:ascii="Times New Roman" w:hAnsi="Times New Roman" w:cs="Times New Roman"/>
             <w:webHidden/>
           </w:rPr>
+        </w:r>
+        <w:r>
+          <w:rPr>
+            <w:rFonts w:ascii="Times New Roman" w:hAnsi="Times New Roman" w:cs="Times New Roman"/>
+            <w:webHidden/>
+          </w:rPr>
           <w:fldChar w:fldCharType="separate"/>
         </w:r>
         <w:r>
@@ -5402,6 +5608,12 @@
             <w:webHidden/>
           </w:rPr>
           <w:instrText xml:space="preserve"> PAGEREF _Toc242479817 \h </w:instrText>
+        </w:r>
+        <w:r>
+          <w:rPr>
+            <w:rFonts w:ascii="Times New Roman" w:hAnsi="Times New Roman" w:cs="Times New Roman"/>
+            <w:webHidden/>
+          </w:rPr>
         </w:r>
         <w:r>
           <w:rPr>
@@ -5539,6 +5751,12 @@
             <w:rFonts w:ascii="Times New Roman" w:hAnsi="Times New Roman" w:cs="Times New Roman"/>
             <w:webHidden/>
           </w:rPr>
+        </w:r>
+        <w:r>
+          <w:rPr>
+            <w:rFonts w:ascii="Times New Roman" w:hAnsi="Times New Roman" w:cs="Times New Roman"/>
+            <w:webHidden/>
+          </w:rPr>
           <w:fldChar w:fldCharType="separate"/>
         </w:r>
         <w:r>
@@ -5603,6 +5821,12 @@
             <w:rFonts w:ascii="Times New Roman" w:hAnsi="Times New Roman" w:cs="Times New Roman"/>
             <w:webHidden/>
           </w:rPr>
+        </w:r>
+        <w:r>
+          <w:rPr>
+            <w:rFonts w:ascii="Times New Roman" w:hAnsi="Times New Roman" w:cs="Times New Roman"/>
+            <w:webHidden/>
+          </w:rPr>
           <w:fldChar w:fldCharType="separate"/>
         </w:r>
         <w:r>
@@ -5667,6 +5891,12 @@
             <w:rFonts w:ascii="Times New Roman" w:hAnsi="Times New Roman" w:cs="Times New Roman"/>
             <w:webHidden/>
           </w:rPr>
+        </w:r>
+        <w:r>
+          <w:rPr>
+            <w:rFonts w:ascii="Times New Roman" w:hAnsi="Times New Roman" w:cs="Times New Roman"/>
+            <w:webHidden/>
+          </w:rPr>
           <w:fldChar w:fldCharType="separate"/>
         </w:r>
         <w:r>
@@ -5731,6 +5961,12 @@
             <w:rFonts w:ascii="Times New Roman" w:hAnsi="Times New Roman" w:cs="Times New Roman"/>
             <w:webHidden/>
           </w:rPr>
+        </w:r>
+        <w:r>
+          <w:rPr>
+            <w:rFonts w:ascii="Times New Roman" w:hAnsi="Times New Roman" w:cs="Times New Roman"/>
+            <w:webHidden/>
+          </w:rPr>
           <w:fldChar w:fldCharType="separate"/>
         </w:r>
         <w:r>
@@ -5795,6 +6031,12 @@
             <w:rFonts w:ascii="Times New Roman" w:hAnsi="Times New Roman" w:cs="Times New Roman"/>
             <w:webHidden/>
           </w:rPr>
+        </w:r>
+        <w:r>
+          <w:rPr>
+            <w:rFonts w:ascii="Times New Roman" w:hAnsi="Times New Roman" w:cs="Times New Roman"/>
+            <w:webHidden/>
+          </w:rPr>
           <w:fldChar w:fldCharType="separate"/>
         </w:r>
         <w:r>
@@ -5853,6 +6095,12 @@
             <w:webHidden/>
           </w:rPr>
           <w:instrText xml:space="preserve"> PAGEREF _Toc242479823 \h </w:instrText>
+        </w:r>
+        <w:r>
+          <w:rPr>
+            <w:rFonts w:ascii="Times New Roman" w:hAnsi="Times New Roman" w:cs="Times New Roman"/>
+            <w:webHidden/>
+          </w:rPr>
         </w:r>
         <w:r>
           <w:rPr>
@@ -5983,45 +6231,6 @@
         <w:t>CÀI ĐẶT HỆ SINH THÁI</w:t>
       </w:r>
       <w:bookmarkEnd w:id="7"/>
-    </w:p>
-    <w:p>
-      <w:pPr>
-        <w:pStyle w:val="Heading2"/>
-      </w:pPr>
-      <w:r>
-        <w:t>CÀI ĐẶT TAILSCALE</w:t>
-      </w:r>
-      <w:r>
-        <w:t xml:space="preserve"> VÀ CẤU HÌNH KẾT NỐI</w:t>
-      </w:r>
-      <w:r>
-        <w:t xml:space="preserve"> GIỮA CÁC MÁY</w:t>
-      </w:r>
-    </w:p>
-    <w:p>
-      <w:pPr>
-        <w:pStyle w:val="Nidung"/>
-        <w:rPr>
-          <w:lang w:val="vi-VN"/>
-        </w:rPr>
-      </w:pPr>
-      <w:r>
-        <w:rPr>
-          <w:lang w:val="vi-VN"/>
-        </w:rPr>
-        <w:t xml:space="preserve">Để làm việc từ xa mà vẫn có thể kết nối với nhau như đang ở cùng mạng LAN thì sẽ cần đến </w:t>
-      </w:r>
-      <w:r>
-        <w:rPr>
-          <w:lang w:val="vi-VN"/>
-        </w:rPr>
-        <w:t>Tailscale.</w:t>
-      </w:r>
-    </w:p>
-    <w:p>
-      <w:pPr>
-        <w:pStyle w:val="Heading3"/>
-      </w:pPr>
     </w:p>
     <w:p>
       <w:pPr>
@@ -6406,10 +6615,44 @@
       </w:pPr>
       <w:bookmarkStart w:id="11" w:name="_Toc243211703"/>
       <w:r>
+        <w:t>docker-compose.yml</w:t>
+      </w:r>
+      <w:bookmarkEnd w:id="11"/>
+    </w:p>
+    <w:p>
+      <w:pPr>
+        <w:pStyle w:val="Nidung"/>
+        <w:rPr>
+          <w:lang w:val="vi-VN"/>
+        </w:rPr>
+      </w:pPr>
+    </w:p>
+    <w:p>
+      <w:pPr>
+        <w:pStyle w:val="Heading3"/>
+      </w:pPr>
+      <w:bookmarkStart w:id="12" w:name="_Toc243211704"/>
+      <w:r>
+        <w:t>entrypoint.sh</w:t>
+      </w:r>
+      <w:bookmarkEnd w:id="12"/>
+    </w:p>
+    <w:p>
+      <w:pPr>
+        <w:pStyle w:val="Nidung"/>
+        <w:rPr>
+          <w:lang w:val="vi-VN"/>
+        </w:rPr>
+      </w:pPr>
+    </w:p>
+    <w:p>
+      <w:pPr>
+        <w:pStyle w:val="Heading3"/>
+      </w:pPr>
+      <w:r>
         <w:lastRenderedPageBreak/>
-        <w:t>docker-compose.yml</w:t>
-      </w:r>
-      <w:bookmarkEnd w:id="11"/>
+        <w:t>workers</w:t>
+      </w:r>
     </w:p>
     <w:p>
       <w:pPr>
@@ -6421,13 +6664,21 @@
     </w:p>
     <w:p>
       <w:pPr>
+        <w:pStyle w:val="Heading2"/>
+      </w:pPr>
+      <w:r>
+        <w:t>CẤU HÌNH CÁC FILE HADOOP</w:t>
+      </w:r>
+    </w:p>
+    <w:p>
+      <w:pPr>
         <w:pStyle w:val="Heading3"/>
       </w:pPr>
-      <w:bookmarkStart w:id="12" w:name="_Toc243211704"/>
-      <w:r>
-        <w:t>entrypoint.sh</w:t>
-      </w:r>
-      <w:bookmarkEnd w:id="12"/>
+      <w:bookmarkStart w:id="13" w:name="_Toc243211706"/>
+      <w:r>
+        <w:t>core-site.xml</w:t>
+      </w:r>
+      <w:bookmarkEnd w:id="13"/>
     </w:p>
     <w:p>
       <w:pPr>
@@ -6441,9 +6692,11 @@
       <w:pPr>
         <w:pStyle w:val="Heading3"/>
       </w:pPr>
-      <w:r>
-        <w:t>workers</w:t>
-      </w:r>
+      <w:bookmarkStart w:id="14" w:name="_Toc243211707"/>
+      <w:r>
+        <w:t>hdfs-site.xml</w:t>
+      </w:r>
+      <w:bookmarkEnd w:id="14"/>
     </w:p>
     <w:p>
       <w:pPr>
@@ -6455,21 +6708,108 @@
     </w:p>
     <w:p>
       <w:pPr>
+        <w:pStyle w:val="Heading3"/>
+      </w:pPr>
+      <w:bookmarkStart w:id="15" w:name="_Toc243211708"/>
+      <w:r>
+        <w:t>mapred</w:t>
+      </w:r>
+      <w:r>
+        <w:t>-site.xml</w:t>
+      </w:r>
+      <w:bookmarkEnd w:id="15"/>
+    </w:p>
+    <w:p>
+      <w:pPr>
+        <w:pStyle w:val="Nidung"/>
+        <w:rPr>
+          <w:lang w:val="vi-VN"/>
+        </w:rPr>
+      </w:pPr>
+    </w:p>
+    <w:p>
+      <w:pPr>
+        <w:pStyle w:val="Heading3"/>
+      </w:pPr>
+      <w:bookmarkStart w:id="16" w:name="_Toc243211709"/>
+      <w:r>
+        <w:t>yarn-site.xml</w:t>
+      </w:r>
+      <w:bookmarkEnd w:id="16"/>
+    </w:p>
+    <w:p>
+      <w:pPr>
+        <w:pStyle w:val="Nidung"/>
+        <w:rPr>
+          <w:lang w:val="vi-VN"/>
+        </w:rPr>
+      </w:pPr>
+    </w:p>
+    <w:p>
+      <w:pPr>
+        <w:pStyle w:val="Heading3"/>
+      </w:pPr>
+      <w:bookmarkStart w:id="17" w:name="_Toc243211710"/>
+      <w:r>
+        <w:t>hive-site.xml</w:t>
+      </w:r>
+      <w:bookmarkEnd w:id="17"/>
+    </w:p>
+    <w:p>
+      <w:pPr>
+        <w:pStyle w:val="Nidung"/>
+        <w:rPr>
+          <w:lang w:val="vi-VN"/>
+        </w:rPr>
+      </w:pPr>
+    </w:p>
+    <w:p>
+      <w:pPr>
+        <w:pStyle w:val="Heading3"/>
+      </w:pPr>
+      <w:bookmarkStart w:id="18" w:name="_Toc243211711"/>
+      <w:r>
+        <w:t>workers.xml</w:t>
+      </w:r>
+      <w:bookmarkEnd w:id="18"/>
+    </w:p>
+    <w:p>
+      <w:pPr>
+        <w:pStyle w:val="Nidung"/>
+        <w:rPr>
+          <w:lang w:val="vi-VN"/>
+        </w:rPr>
+      </w:pPr>
+    </w:p>
+    <w:p>
+      <w:pPr>
         <w:pStyle w:val="Heading2"/>
       </w:pPr>
       <w:r>
-        <w:t>CẤU HÌNH CÁC FILE HADOOP</w:t>
+        <w:t>CÀI ĐẶT TAILSCALE VÀ CẤU HÌNH KẾT NỐI GIỮA CÁC MÁY</w:t>
+      </w:r>
+    </w:p>
+    <w:p>
+      <w:pPr>
+        <w:pStyle w:val="Nidung"/>
+        <w:rPr>
+          <w:lang w:val="vi-VN"/>
+        </w:rPr>
+      </w:pPr>
+      <w:r>
+        <w:rPr>
+          <w:lang w:val="vi-VN"/>
+        </w:rPr>
+        <w:t>Để làm việc từ xa mà vẫn có thể kết nối với nhau như đang ở cùng mạng LAN thì sẽ cần đến Tailscale.</w:t>
       </w:r>
     </w:p>
     <w:p>
       <w:pPr>
         <w:pStyle w:val="Heading3"/>
       </w:pPr>
-      <w:bookmarkStart w:id="13" w:name="_Toc243211706"/>
-      <w:r>
-        <w:t>core-site.xml</w:t>
-      </w:r>
-      <w:bookmarkEnd w:id="13"/>
+      <w:r>
+        <w:t>Tạo mạng ảo Tailscale</w:t>
+      </w:r>
     </w:p>
     <w:p>
       <w:pPr>
@@ -6483,11 +6823,9 @@
       <w:pPr>
         <w:pStyle w:val="Heading3"/>
       </w:pPr>
-      <w:bookmarkStart w:id="14" w:name="_Toc243211707"/>
-      <w:r>
-        <w:t>hdfs-site.xml</w:t>
-      </w:r>
-      <w:bookmarkEnd w:id="14"/>
+      <w:r>
+        <w:t xml:space="preserve"> Mở cổng 2222 trên máy tính</w:t>
+      </w:r>
     </w:p>
     <w:p>
       <w:pPr>
@@ -6496,19 +6834,68 @@
           <w:lang w:val="vi-VN"/>
         </w:rPr>
       </w:pPr>
+      <w:r>
+        <w:rPr>
+          <w:lang w:val="vi-VN"/>
+        </w:rPr>
+        <w:drawing>
+          <wp:inline distT="0" distB="0" distL="0" distR="0" wp14:anchorId="7F728AAD" wp14:editId="2ED47BD8">
+            <wp:extent cx="5760720" cy="1878965"/>
+            <wp:effectExtent l="0" t="0" r="0" b="6985"/>
+            <wp:docPr id="104244037" name="Picture 1"/>
+            <wp:cNvGraphicFramePr>
+              <a:graphicFrameLocks xmlns:a="http://schemas.openxmlformats.org/drawingml/2006/main" noChangeAspect="1"/>
+            </wp:cNvGraphicFramePr>
+            <a:graphic xmlns:a="http://schemas.openxmlformats.org/drawingml/2006/main">
+              <a:graphicData uri="http://schemas.openxmlformats.org/drawingml/2006/picture">
+                <pic:pic xmlns:pic="http://schemas.openxmlformats.org/drawingml/2006/picture">
+                  <pic:nvPicPr>
+                    <pic:cNvPr id="104244037" name=""/>
+                    <pic:cNvPicPr/>
+                  </pic:nvPicPr>
+                  <pic:blipFill>
+                    <a:blip r:embed="rId12"/>
+                    <a:stretch>
+                      <a:fillRect/>
+                    </a:stretch>
+                  </pic:blipFill>
+                  <pic:spPr>
+                    <a:xfrm>
+                      <a:off x="0" y="0"/>
+                      <a:ext cx="5760720" cy="1878965"/>
+                    </a:xfrm>
+                    <a:prstGeom prst="rect">
+                      <a:avLst/>
+                    </a:prstGeom>
+                  </pic:spPr>
+                </pic:pic>
+              </a:graphicData>
+            </a:graphic>
+          </wp:inline>
+        </w:drawing>
+      </w:r>
+    </w:p>
+    <w:p>
+      <w:pPr>
+        <w:pStyle w:val="Nidung"/>
+        <w:rPr>
+          <w:lang w:val="vi-VN"/>
+        </w:rPr>
+      </w:pPr>
     </w:p>
     <w:p>
       <w:pPr>
         <w:pStyle w:val="Heading3"/>
       </w:pPr>
-      <w:bookmarkStart w:id="15" w:name="_Toc243211708"/>
-      <w:r>
-        <w:t>mapred</w:t>
-      </w:r>
-      <w:r>
-        <w:t>-site.xml</w:t>
-      </w:r>
-      <w:bookmarkEnd w:id="15"/>
+      <w:r>
+        <w:t>Tạo</w:t>
+      </w:r>
+      <w:r>
+        <w:t xml:space="preserve"> và trao đổi</w:t>
+      </w:r>
+      <w:r>
+        <w:t xml:space="preserve"> khóa ssh</w:t>
+      </w:r>
     </w:p>
     <w:p>
       <w:pPr>
@@ -6517,52 +6904,6 @@
           <w:lang w:val="vi-VN"/>
         </w:rPr>
       </w:pPr>
-    </w:p>
-    <w:p>
-      <w:pPr>
-        <w:pStyle w:val="Heading3"/>
-      </w:pPr>
-      <w:bookmarkStart w:id="16" w:name="_Toc243211709"/>
-      <w:r>
-        <w:t>yarn-site.xml</w:t>
-      </w:r>
-      <w:bookmarkEnd w:id="16"/>
-    </w:p>
-    <w:p>
-      <w:pPr>
-        <w:pStyle w:val="Nidung"/>
-        <w:rPr>
-          <w:lang w:val="vi-VN"/>
-        </w:rPr>
-      </w:pPr>
-    </w:p>
-    <w:p>
-      <w:pPr>
-        <w:pStyle w:val="Heading3"/>
-      </w:pPr>
-      <w:bookmarkStart w:id="17" w:name="_Toc243211710"/>
-      <w:r>
-        <w:t>hive-site.xml</w:t>
-      </w:r>
-      <w:bookmarkEnd w:id="17"/>
-    </w:p>
-    <w:p>
-      <w:pPr>
-        <w:pStyle w:val="Nidung"/>
-        <w:rPr>
-          <w:lang w:val="vi-VN"/>
-        </w:rPr>
-      </w:pPr>
-    </w:p>
-    <w:p>
-      <w:pPr>
-        <w:pStyle w:val="Heading3"/>
-      </w:pPr>
-      <w:bookmarkStart w:id="18" w:name="_Toc243211711"/>
-      <w:r>
-        <w:t>workers.xml</w:t>
-      </w:r>
-      <w:bookmarkEnd w:id="18"/>
     </w:p>
     <w:p>
       <w:pPr>
@@ -6760,7 +7101,7 @@
       <w:r>
         <w:t xml:space="preserve">Shivam Bansal, “Netflix Movies and TV Shows,” Kaggle. [Trực tuyến]. Có tại: </w:t>
       </w:r>
-      <w:hyperlink r:id="rId12" w:history="1">
+      <w:hyperlink r:id="rId13" w:history="1">
         <w:r>
           <w:rPr>
             <w:rStyle w:val="Hyperlink"/>
@@ -6779,7 +7120,7 @@
       <w:r>
         <w:t xml:space="preserve">Microsoft, “Power BI report and dashboard creation documentation,” Microsoft Learn. [Trực tuyến]. Có tại: </w:t>
       </w:r>
-      <w:hyperlink r:id="rId13" w:history="1">
+      <w:hyperlink r:id="rId14" w:history="1">
         <w:r>
           <w:rPr>
             <w:rStyle w:val="Hyperlink"/>
@@ -6798,7 +7139,7 @@
       <w:r>
         <w:t xml:space="preserve">pandas Development Team, “User Guide” pandas Documentation. [Trực tuyến]. Có tại: </w:t>
       </w:r>
-      <w:hyperlink r:id="rId14" w:history="1">
+      <w:hyperlink r:id="rId15" w:history="1">
         <w:r>
           <w:rPr>
             <w:rStyle w:val="Hyperlink"/>
@@ -6817,7 +7158,7 @@
       <w:r>
         <w:t xml:space="preserve">scikit-learn developers, “LinearRegression”, scikit-learn Documentation. [Trực tuyến]. Có tại: </w:t>
       </w:r>
-      <w:hyperlink r:id="rId15" w:history="1">
+      <w:hyperlink r:id="rId16" w:history="1">
         <w:r>
           <w:rPr>
             <w:rStyle w:val="Hyperlink"/>
@@ -6836,7 +7177,7 @@
       <w:r>
         <w:t xml:space="preserve">scikit-learn developers, “Model evaluation,” scikit-learn Documentation. [Trực tuyến]. Có tại: </w:t>
       </w:r>
-      <w:hyperlink r:id="rId16" w:history="1">
+      <w:hyperlink r:id="rId17" w:history="1">
         <w:r>
           <w:rPr>
             <w:rStyle w:val="Hyperlink"/>
@@ -10026,6 +10367,7 @@
   <w:style w:type="character" w:default="1" w:styleId="DefaultParagraphFont">
     <w:name w:val="Default Paragraph Font"/>
     <w:uiPriority w:val="1"/>
+    <w:semiHidden/>
     <w:unhideWhenUsed/>
   </w:style>
   <w:style w:type="table" w:default="1" w:styleId="TableNormal">

</xml_diff>

<commit_message>
fix(docker): change the hoanganh24162006 user passowrd
</commit_message>
<xml_diff>
--- a/docs/baocao.docx
+++ b/docs/baocao.docx
@@ -6814,6 +6814,53 @@
     <w:p>
       <w:pPr>
         <w:pStyle w:val="Nidung"/>
+      </w:pPr>
+    </w:p>
+    <w:p>
+      <w:pPr>
+        <w:pStyle w:val="Nidung"/>
+      </w:pPr>
+      <w:r>
+        <w:drawing>
+          <wp:inline distT="0" distB="0" distL="0" distR="0" wp14:anchorId="6B9EA9E0" wp14:editId="40E7D682">
+            <wp:extent cx="2339543" cy="990686"/>
+            <wp:effectExtent l="0" t="0" r="3810" b="0"/>
+            <wp:docPr id="333330788" name="Picture 1"/>
+            <wp:cNvGraphicFramePr>
+              <a:graphicFrameLocks xmlns:a="http://schemas.openxmlformats.org/drawingml/2006/main" noChangeAspect="1"/>
+            </wp:cNvGraphicFramePr>
+            <a:graphic xmlns:a="http://schemas.openxmlformats.org/drawingml/2006/main">
+              <a:graphicData uri="http://schemas.openxmlformats.org/drawingml/2006/picture">
+                <pic:pic xmlns:pic="http://schemas.openxmlformats.org/drawingml/2006/picture">
+                  <pic:nvPicPr>
+                    <pic:cNvPr id="333330788" name=""/>
+                    <pic:cNvPicPr/>
+                  </pic:nvPicPr>
+                  <pic:blipFill>
+                    <a:blip r:embed="rId12"/>
+                    <a:stretch>
+                      <a:fillRect/>
+                    </a:stretch>
+                  </pic:blipFill>
+                  <pic:spPr>
+                    <a:xfrm>
+                      <a:off x="0" y="0"/>
+                      <a:ext cx="2339543" cy="990686"/>
+                    </a:xfrm>
+                    <a:prstGeom prst="rect">
+                      <a:avLst/>
+                    </a:prstGeom>
+                  </pic:spPr>
+                </pic:pic>
+              </a:graphicData>
+            </a:graphic>
+          </wp:inline>
+        </w:drawing>
+      </w:r>
+    </w:p>
+    <w:p>
+      <w:pPr>
+        <w:pStyle w:val="Nidung"/>
         <w:rPr>
           <w:lang w:val="vi-VN"/>
         </w:rPr>
@@ -6824,6 +6871,7 @@
         <w:pStyle w:val="Heading3"/>
       </w:pPr>
       <w:r>
+        <w:lastRenderedPageBreak/>
         <w:t xml:space="preserve"> Mở cổng 2222 trên máy tính</w:t>
       </w:r>
     </w:p>
@@ -6854,7 +6902,7 @@
                     <pic:cNvPicPr/>
                   </pic:nvPicPr>
                   <pic:blipFill>
-                    <a:blip r:embed="rId12"/>
+                    <a:blip r:embed="rId13"/>
                     <a:stretch>
                       <a:fillRect/>
                     </a:stretch>
@@ -6900,6 +6948,202 @@
     <w:p>
       <w:pPr>
         <w:pStyle w:val="Nidung"/>
+      </w:pPr>
+      <w:r>
+        <w:t xml:space="preserve">Cấu hình SSH không mật khẩu giữa Master và các Worker </w:t>
+      </w:r>
+      <w:r>
+        <w:t>Node</w:t>
+      </w:r>
+      <w:r>
+        <w:rPr>
+          <w:lang w:val="vi-VN"/>
+        </w:rPr>
+        <w:t xml:space="preserve">. </w:t>
+      </w:r>
+      <w:r>
+        <w:t>Trong kiến trúc Hadoop Cluster, node Master (hoanganh24162006-master) cần sử dụng giao thức SSH để điều khiển từ xa việc khởi động và dừng các tiến trình DataNode, NodeManager và Spark Worker trên các máy Slave (hoc-slave1, locnguyen21139037-slave2, hoanganh24133004-slave3). Để tăng tính bảo mật và tránh xung đột với dịch vụ OpenSSH mặc định trên hệ điều hành Windows Host (cổng 22), nhóm cấu hình dịch vụ SSH trong các container Ubuntu 24.04 hoạt động trên cổng 2222 và thiết lập biến HADOOP_SSH_OPTS="-p 2222" trong hadoop-env.sh.</w:t>
+      </w:r>
+    </w:p>
+    <w:p>
+      <w:pPr>
+        <w:pStyle w:val="Nidung"/>
+      </w:pPr>
+      <w:r>
+        <w:t>Quy trình thiết lập SSH không mật khẩu (Passwordless SSH) được thực hiện như sau:</w:t>
+      </w:r>
+    </w:p>
+    <w:p>
+      <w:pPr>
+        <w:pStyle w:val="Nidung"/>
+        <w:numPr>
+          <w:ilvl w:val="0"/>
+          <w:numId w:val="21"/>
+        </w:numPr>
+      </w:pPr>
+      <w:r>
+        <w:t xml:space="preserve">Khởi tạo cặp khóa RSA trên các node: Sử dụng lệnh </w:t>
+      </w:r>
+    </w:p>
+    <w:p>
+      <w:pPr>
+        <w:pStyle w:val="Nidung"/>
+        <w:pBdr>
+          <w:top w:val="single" w:sz="4" w:space="1" w:color="auto"/>
+          <w:left w:val="single" w:sz="4" w:space="4" w:color="auto"/>
+          <w:bottom w:val="single" w:sz="4" w:space="1" w:color="auto"/>
+          <w:right w:val="single" w:sz="4" w:space="4" w:color="auto"/>
+        </w:pBdr>
+        <w:ind w:left="720"/>
+        <w:rPr>
+          <w:lang w:val="vi-VN"/>
+        </w:rPr>
+      </w:pPr>
+      <w:r>
+        <w:t xml:space="preserve">ssh-keygen -t rsa -P "" -f ~/.ssh/id_rsa </w:t>
+      </w:r>
+    </w:p>
+    <w:p>
+      <w:pPr>
+        <w:pStyle w:val="Nidung"/>
+        <w:ind w:left="720"/>
+      </w:pPr>
+      <w:r>
+        <w:t>D</w:t>
+      </w:r>
+      <w:r>
+        <w:t>ưới tài khoản hadoophoanganh24162006 để sinh khóa bí mật (id_rsa) và khóa công khai (id_rsa.pub).</w:t>
+      </w:r>
+    </w:p>
+    <w:p>
+      <w:pPr>
+        <w:pStyle w:val="Nidung"/>
+        <w:ind w:left="720"/>
+      </w:pPr>
+      <w:r>
+        <w:drawing>
+          <wp:inline distT="0" distB="0" distL="0" distR="0" wp14:anchorId="1D9ACF44" wp14:editId="570E2D48">
+            <wp:extent cx="5395428" cy="2575783"/>
+            <wp:effectExtent l="0" t="0" r="0" b="0"/>
+            <wp:docPr id="1227800538" name="Picture 1"/>
+            <wp:cNvGraphicFramePr>
+              <a:graphicFrameLocks xmlns:a="http://schemas.openxmlformats.org/drawingml/2006/main" noChangeAspect="1"/>
+            </wp:cNvGraphicFramePr>
+            <a:graphic xmlns:a="http://schemas.openxmlformats.org/drawingml/2006/main">
+              <a:graphicData uri="http://schemas.openxmlformats.org/drawingml/2006/picture">
+                <pic:pic xmlns:pic="http://schemas.openxmlformats.org/drawingml/2006/picture">
+                  <pic:nvPicPr>
+                    <pic:cNvPr id="1227800538" name=""/>
+                    <pic:cNvPicPr/>
+                  </pic:nvPicPr>
+                  <pic:blipFill>
+                    <a:blip r:embed="rId14"/>
+                    <a:stretch>
+                      <a:fillRect/>
+                    </a:stretch>
+                  </pic:blipFill>
+                  <pic:spPr>
+                    <a:xfrm>
+                      <a:off x="0" y="0"/>
+                      <a:ext cx="5395428" cy="2575783"/>
+                    </a:xfrm>
+                    <a:prstGeom prst="rect">
+                      <a:avLst/>
+                    </a:prstGeom>
+                  </pic:spPr>
+                </pic:pic>
+              </a:graphicData>
+            </a:graphic>
+          </wp:inline>
+        </w:drawing>
+      </w:r>
+    </w:p>
+    <w:p>
+      <w:pPr>
+        <w:pStyle w:val="Nidung"/>
+        <w:numPr>
+          <w:ilvl w:val="0"/>
+          <w:numId w:val="21"/>
+        </w:numPr>
+      </w:pPr>
+      <w:r>
+        <w:lastRenderedPageBreak/>
+        <w:t xml:space="preserve">Trao đổi khóa công khai từ Master sang các Slave: Từ node hoanganh24162006-master, nhóm sử dụng công cụ ssh-copy-id qua cổng 2222 để sao chép khóa công khai sang file ~/.ssh/authorized_keys của ba node Slave: </w:t>
+      </w:r>
+    </w:p>
+    <w:p>
+      <w:pPr>
+        <w:pStyle w:val="Nidung"/>
+        <w:pBdr>
+          <w:top w:val="single" w:sz="4" w:space="1" w:color="auto"/>
+          <w:left w:val="single" w:sz="4" w:space="4" w:color="auto"/>
+          <w:bottom w:val="single" w:sz="4" w:space="1" w:color="auto"/>
+          <w:right w:val="single" w:sz="4" w:space="4" w:color="auto"/>
+        </w:pBdr>
+      </w:pPr>
+      <w:r>
+        <w:t>ssh-copy-id -p 2222 hadoophoanganh24162006@hoc-slave1</w:t>
+      </w:r>
+    </w:p>
+    <w:p>
+      <w:pPr>
+        <w:pStyle w:val="Nidung"/>
+        <w:pBdr>
+          <w:top w:val="single" w:sz="4" w:space="1" w:color="auto"/>
+          <w:left w:val="single" w:sz="4" w:space="4" w:color="auto"/>
+          <w:bottom w:val="single" w:sz="4" w:space="1" w:color="auto"/>
+          <w:right w:val="single" w:sz="4" w:space="4" w:color="auto"/>
+        </w:pBdr>
+      </w:pPr>
+      <w:r>
+        <w:t>ssh-copy-id -p 2222 hadoophoanganh24162006@locnguyen21139037-slave2</w:t>
+      </w:r>
+    </w:p>
+    <w:p>
+      <w:pPr>
+        <w:pStyle w:val="Nidung"/>
+        <w:pBdr>
+          <w:top w:val="single" w:sz="4" w:space="1" w:color="auto"/>
+          <w:left w:val="single" w:sz="4" w:space="4" w:color="auto"/>
+          <w:bottom w:val="single" w:sz="4" w:space="1" w:color="auto"/>
+          <w:right w:val="single" w:sz="4" w:space="4" w:color="auto"/>
+        </w:pBdr>
+        <w:rPr>
+          <w:lang w:val="vi-VN"/>
+        </w:rPr>
+      </w:pPr>
+      <w:r>
+        <w:t>ssh-copy-id -p 2222 hadoophoanganh24162006@hoanganh24133004-slave3</w:t>
+      </w:r>
+    </w:p>
+    <w:p>
+      <w:pPr>
+        <w:pStyle w:val="Nidung"/>
+        <w:rPr>
+          <w:lang w:val="vi-VN"/>
+        </w:rPr>
+      </w:pPr>
+    </w:p>
+    <w:p>
+      <w:pPr>
+        <w:pStyle w:val="Nidung"/>
+      </w:pPr>
+    </w:p>
+    <w:p>
+      <w:pPr>
+        <w:pStyle w:val="Nidung"/>
+        <w:numPr>
+          <w:ilvl w:val="0"/>
+          <w:numId w:val="21"/>
+        </w:numPr>
+      </w:pPr>
+      <w:r>
+        <w:t>Kiểm thử kết nối SSH toàn cụm: Sau khi sao chép khóa, nhóm thực hiện kiểm tra kết nối SSH từ hoanganh24162006-master đến toàn bộ các node trong cluster. Kết quả trả về đúng hostname của từng node mà không yêu cầu nhập mật khẩu, đảm bảo cụm Hadoop sẵn sàng cho bước khởi chạy các dịch vụ phân tán bằng lệnh start-all.sh.</w:t>
+      </w:r>
+    </w:p>
+    <w:p>
+      <w:pPr>
+        <w:pStyle w:val="Nidung"/>
         <w:rPr>
           <w:lang w:val="vi-VN"/>
         </w:rPr>
@@ -7101,7 +7345,7 @@
       <w:r>
         <w:t xml:space="preserve">Shivam Bansal, “Netflix Movies and TV Shows,” Kaggle. [Trực tuyến]. Có tại: </w:t>
       </w:r>
-      <w:hyperlink r:id="rId13" w:history="1">
+      <w:hyperlink r:id="rId15" w:history="1">
         <w:r>
           <w:rPr>
             <w:rStyle w:val="Hyperlink"/>
@@ -7120,7 +7364,7 @@
       <w:r>
         <w:t xml:space="preserve">Microsoft, “Power BI report and dashboard creation documentation,” Microsoft Learn. [Trực tuyến]. Có tại: </w:t>
       </w:r>
-      <w:hyperlink r:id="rId14" w:history="1">
+      <w:hyperlink r:id="rId16" w:history="1">
         <w:r>
           <w:rPr>
             <w:rStyle w:val="Hyperlink"/>
@@ -7139,7 +7383,7 @@
       <w:r>
         <w:t xml:space="preserve">pandas Development Team, “User Guide” pandas Documentation. [Trực tuyến]. Có tại: </w:t>
       </w:r>
-      <w:hyperlink r:id="rId15" w:history="1">
+      <w:hyperlink r:id="rId17" w:history="1">
         <w:r>
           <w:rPr>
             <w:rStyle w:val="Hyperlink"/>
@@ -7158,7 +7402,7 @@
       <w:r>
         <w:t xml:space="preserve">scikit-learn developers, “LinearRegression”, scikit-learn Documentation. [Trực tuyến]. Có tại: </w:t>
       </w:r>
-      <w:hyperlink r:id="rId16" w:history="1">
+      <w:hyperlink r:id="rId18" w:history="1">
         <w:r>
           <w:rPr>
             <w:rStyle w:val="Hyperlink"/>
@@ -7177,7 +7421,7 @@
       <w:r>
         <w:t xml:space="preserve">scikit-learn developers, “Model evaluation,” scikit-learn Documentation. [Trực tuyến]. Có tại: </w:t>
       </w:r>
-      <w:hyperlink r:id="rId17" w:history="1">
+      <w:hyperlink r:id="rId19" w:history="1">
         <w:r>
           <w:rPr>
             <w:rStyle w:val="Hyperlink"/>
@@ -9564,6 +9808,119 @@
     </w:lvl>
   </w:abstractNum>
   <w:abstractNum w:abstractNumId="18" w15:restartNumberingAfterBreak="0">
+    <w:nsid w:val="627F6A2E"/>
+    <w:multiLevelType w:val="multilevel"/>
+    <w:tmpl w:val="8BCED998"/>
+    <w:lvl w:ilvl="0">
+      <w:start w:val="1"/>
+      <w:numFmt w:val="decimal"/>
+      <w:lvlText w:val="%1."/>
+      <w:lvlJc w:val="left"/>
+      <w:pPr>
+        <w:tabs>
+          <w:tab w:val="num" w:pos="720"/>
+        </w:tabs>
+        <w:ind w:left="720" w:hanging="360"/>
+      </w:pPr>
+    </w:lvl>
+    <w:lvl w:ilvl="1" w:tentative="1">
+      <w:start w:val="1"/>
+      <w:numFmt w:val="decimal"/>
+      <w:lvlText w:val="%2."/>
+      <w:lvlJc w:val="left"/>
+      <w:pPr>
+        <w:tabs>
+          <w:tab w:val="num" w:pos="1440"/>
+        </w:tabs>
+        <w:ind w:left="1440" w:hanging="360"/>
+      </w:pPr>
+    </w:lvl>
+    <w:lvl w:ilvl="2" w:tentative="1">
+      <w:start w:val="1"/>
+      <w:numFmt w:val="decimal"/>
+      <w:lvlText w:val="%3."/>
+      <w:lvlJc w:val="left"/>
+      <w:pPr>
+        <w:tabs>
+          <w:tab w:val="num" w:pos="2160"/>
+        </w:tabs>
+        <w:ind w:left="2160" w:hanging="360"/>
+      </w:pPr>
+    </w:lvl>
+    <w:lvl w:ilvl="3" w:tentative="1">
+      <w:start w:val="1"/>
+      <w:numFmt w:val="decimal"/>
+      <w:lvlText w:val="%4."/>
+      <w:lvlJc w:val="left"/>
+      <w:pPr>
+        <w:tabs>
+          <w:tab w:val="num" w:pos="2880"/>
+        </w:tabs>
+        <w:ind w:left="2880" w:hanging="360"/>
+      </w:pPr>
+    </w:lvl>
+    <w:lvl w:ilvl="4" w:tentative="1">
+      <w:start w:val="1"/>
+      <w:numFmt w:val="decimal"/>
+      <w:lvlText w:val="%5."/>
+      <w:lvlJc w:val="left"/>
+      <w:pPr>
+        <w:tabs>
+          <w:tab w:val="num" w:pos="3600"/>
+        </w:tabs>
+        <w:ind w:left="3600" w:hanging="360"/>
+      </w:pPr>
+    </w:lvl>
+    <w:lvl w:ilvl="5" w:tentative="1">
+      <w:start w:val="1"/>
+      <w:numFmt w:val="decimal"/>
+      <w:lvlText w:val="%6."/>
+      <w:lvlJc w:val="left"/>
+      <w:pPr>
+        <w:tabs>
+          <w:tab w:val="num" w:pos="4320"/>
+        </w:tabs>
+        <w:ind w:left="4320" w:hanging="360"/>
+      </w:pPr>
+    </w:lvl>
+    <w:lvl w:ilvl="6" w:tentative="1">
+      <w:start w:val="1"/>
+      <w:numFmt w:val="decimal"/>
+      <w:lvlText w:val="%7."/>
+      <w:lvlJc w:val="left"/>
+      <w:pPr>
+        <w:tabs>
+          <w:tab w:val="num" w:pos="5040"/>
+        </w:tabs>
+        <w:ind w:left="5040" w:hanging="360"/>
+      </w:pPr>
+    </w:lvl>
+    <w:lvl w:ilvl="7" w:tentative="1">
+      <w:start w:val="1"/>
+      <w:numFmt w:val="decimal"/>
+      <w:lvlText w:val="%8."/>
+      <w:lvlJc w:val="left"/>
+      <w:pPr>
+        <w:tabs>
+          <w:tab w:val="num" w:pos="5760"/>
+        </w:tabs>
+        <w:ind w:left="5760" w:hanging="360"/>
+      </w:pPr>
+    </w:lvl>
+    <w:lvl w:ilvl="8" w:tentative="1">
+      <w:start w:val="1"/>
+      <w:numFmt w:val="decimal"/>
+      <w:lvlText w:val="%9."/>
+      <w:lvlJc w:val="left"/>
+      <w:pPr>
+        <w:tabs>
+          <w:tab w:val="num" w:pos="6480"/>
+        </w:tabs>
+        <w:ind w:left="6480" w:hanging="360"/>
+      </w:pPr>
+    </w:lvl>
+  </w:abstractNum>
+  <w:abstractNum w:abstractNumId="19" w15:restartNumberingAfterBreak="0">
     <w:nsid w:val="6A1F7C22"/>
     <w:multiLevelType w:val="hybridMultilevel"/>
     <w:tmpl w:val="08A64CF2"/>
@@ -9659,7 +10016,7 @@
     <w:abstractNumId w:val="7"/>
   </w:num>
   <w:num w:numId="3" w16cid:durableId="1834909631">
-    <w:abstractNumId w:val="18"/>
+    <w:abstractNumId w:val="19"/>
   </w:num>
   <w:num w:numId="4" w16cid:durableId="364214517">
     <w:abstractNumId w:val="5"/>
@@ -9738,6 +10095,9 @@
   </w:num>
   <w:num w:numId="20" w16cid:durableId="638611874">
     <w:abstractNumId w:val="2"/>
+  </w:num>
+  <w:num w:numId="21" w16cid:durableId="442844359">
+    <w:abstractNumId w:val="18"/>
   </w:num>
 </w:numbering>
 </file>
@@ -10367,7 +10727,6 @@
   <w:style w:type="character" w:default="1" w:styleId="DefaultParagraphFont">
     <w:name w:val="Default Paragraph Font"/>
     <w:uiPriority w:val="1"/>
-    <w:semiHidden/>
     <w:unhideWhenUsed/>
   </w:style>
   <w:style w:type="table" w:default="1" w:styleId="TableNormal">

</xml_diff>

<commit_message>
fix(docker): run the test.sh file and fix the relatives problems
</commit_message>
<xml_diff>
--- a/docs/baocao.docx
+++ b/docs/baocao.docx
@@ -6620,14 +6620,6 @@
     </w:p>
     <w:p>
       <w:pPr>
-        <w:pStyle w:val="Nidung"/>
-        <w:rPr>
-          <w:lang w:val="vi-VN"/>
-        </w:rPr>
-      </w:pPr>
-    </w:p>
-    <w:p>
-      <w:pPr>
         <w:pStyle w:val="Heading3"/>
       </w:pPr>
       <w:bookmarkStart w:id="11" w:name="_Toc243211703"/>
@@ -18160,6 +18152,7 @@
           <w:bottom w:val="single" w:sz="4" w:space="1" w:color="auto"/>
           <w:right w:val="single" w:sz="4" w:space="4" w:color="auto"/>
         </w:pBdr>
+        <w:jc w:val="left"/>
         <w:rPr>
           <w:lang w:val="vi-VN"/>
         </w:rPr>
@@ -18180,6 +18173,7 @@
           <w:bottom w:val="single" w:sz="4" w:space="1" w:color="auto"/>
           <w:right w:val="single" w:sz="4" w:space="4" w:color="auto"/>
         </w:pBdr>
+        <w:jc w:val="left"/>
         <w:rPr>
           <w:lang w:val="vi-VN"/>
         </w:rPr>
@@ -18200,6 +18194,7 @@
           <w:bottom w:val="single" w:sz="4" w:space="1" w:color="auto"/>
           <w:right w:val="single" w:sz="4" w:space="4" w:color="auto"/>
         </w:pBdr>
+        <w:jc w:val="left"/>
         <w:rPr>
           <w:lang w:val="vi-VN"/>
         </w:rPr>
@@ -18252,15 +18247,100 @@
     <w:p>
       <w:pPr>
         <w:pStyle w:val="Nidung"/>
-      </w:pPr>
+        <w:jc w:val="center"/>
+      </w:pPr>
+      <w:r>
+        <w:drawing>
+          <wp:inline distT="0" distB="0" distL="0" distR="0" wp14:anchorId="3BD66AA7" wp14:editId="494981FC">
+            <wp:extent cx="5760720" cy="1139825"/>
+            <wp:effectExtent l="0" t="0" r="0" b="3175"/>
+            <wp:docPr id="668128107" name="Picture 1"/>
+            <wp:cNvGraphicFramePr>
+              <a:graphicFrameLocks xmlns:a="http://schemas.openxmlformats.org/drawingml/2006/main" noChangeAspect="1"/>
+            </wp:cNvGraphicFramePr>
+            <a:graphic xmlns:a="http://schemas.openxmlformats.org/drawingml/2006/main">
+              <a:graphicData uri="http://schemas.openxmlformats.org/drawingml/2006/picture">
+                <pic:pic xmlns:pic="http://schemas.openxmlformats.org/drawingml/2006/picture">
+                  <pic:nvPicPr>
+                    <pic:cNvPr id="668128107" name=""/>
+                    <pic:cNvPicPr/>
+                  </pic:nvPicPr>
+                  <pic:blipFill>
+                    <a:blip r:embed="rId12"/>
+                    <a:stretch>
+                      <a:fillRect/>
+                    </a:stretch>
+                  </pic:blipFill>
+                  <pic:spPr>
+                    <a:xfrm>
+                      <a:off x="0" y="0"/>
+                      <a:ext cx="5760720" cy="1139825"/>
+                    </a:xfrm>
+                    <a:prstGeom prst="rect">
+                      <a:avLst/>
+                    </a:prstGeom>
+                  </pic:spPr>
+                </pic:pic>
+              </a:graphicData>
+            </a:graphic>
+          </wp:inline>
+        </w:drawing>
+      </w:r>
     </w:p>
     <w:p>
       <w:pPr>
         <w:pStyle w:val="Nidung"/>
-      </w:pPr>
-      <w:r>
+        <w:jc w:val="center"/>
+      </w:pPr>
+      <w:r>
+        <w:rPr>
+          <w:lang w:val="vi-VN"/>
+        </w:rPr>
         <w:drawing>
-          <wp:inline distT="0" distB="0" distL="0" distR="0" wp14:anchorId="6B9EA9E0" wp14:editId="40E7D682">
+          <wp:inline distT="0" distB="0" distL="0" distR="0" wp14:anchorId="02AF5866" wp14:editId="67FF38FA">
+            <wp:extent cx="5760720" cy="2597150"/>
+            <wp:effectExtent l="0" t="0" r="0" b="0"/>
+            <wp:docPr id="1129397318" name="Picture 1"/>
+            <wp:cNvGraphicFramePr>
+              <a:graphicFrameLocks xmlns:a="http://schemas.openxmlformats.org/drawingml/2006/main" noChangeAspect="1"/>
+            </wp:cNvGraphicFramePr>
+            <a:graphic xmlns:a="http://schemas.openxmlformats.org/drawingml/2006/main">
+              <a:graphicData uri="http://schemas.openxmlformats.org/drawingml/2006/picture">
+                <pic:pic xmlns:pic="http://schemas.openxmlformats.org/drawingml/2006/picture">
+                  <pic:nvPicPr>
+                    <pic:cNvPr id="1129397318" name=""/>
+                    <pic:cNvPicPr/>
+                  </pic:nvPicPr>
+                  <pic:blipFill>
+                    <a:blip r:embed="rId13"/>
+                    <a:stretch>
+                      <a:fillRect/>
+                    </a:stretch>
+                  </pic:blipFill>
+                  <pic:spPr>
+                    <a:xfrm>
+                      <a:off x="0" y="0"/>
+                      <a:ext cx="5760720" cy="2597150"/>
+                    </a:xfrm>
+                    <a:prstGeom prst="rect">
+                      <a:avLst/>
+                    </a:prstGeom>
+                  </pic:spPr>
+                </pic:pic>
+              </a:graphicData>
+            </a:graphic>
+          </wp:inline>
+        </w:drawing>
+      </w:r>
+    </w:p>
+    <w:p>
+      <w:pPr>
+        <w:pStyle w:val="Nidung"/>
+        <w:jc w:val="center"/>
+      </w:pPr>
+      <w:r>
+        <w:drawing>
+          <wp:inline distT="0" distB="0" distL="0" distR="0" wp14:anchorId="0F4A2C27" wp14:editId="2B8C8C37">
             <wp:extent cx="2339543" cy="990686"/>
             <wp:effectExtent l="0" t="0" r="3810" b="0"/>
             <wp:docPr id="333330788" name="Picture 1"/>
@@ -18275,7 +18355,7 @@
                     <pic:cNvPicPr/>
                   </pic:nvPicPr>
                   <pic:blipFill>
-                    <a:blip r:embed="rId12"/>
+                    <a:blip r:embed="rId14"/>
                     <a:stretch>
                       <a:fillRect/>
                     </a:stretch>
@@ -18299,9 +18379,6 @@
     <w:p>
       <w:pPr>
         <w:pStyle w:val="Nidung"/>
-        <w:rPr>
-          <w:lang w:val="vi-VN"/>
-        </w:rPr>
       </w:pPr>
     </w:p>
     <w:p>
@@ -18309,12 +18386,20 @@
         <w:pStyle w:val="Heading3"/>
       </w:pPr>
       <w:r>
-        <w:t xml:space="preserve"> Mở cổng 2222 trên máy tính</w:t>
+        <w:lastRenderedPageBreak/>
+        <w:t xml:space="preserve"> Mở cổng 2222 trên </w:t>
+      </w:r>
+      <w:r>
+        <w:t xml:space="preserve">các </w:t>
+      </w:r>
+      <w:r>
+        <w:t>máy</w:t>
       </w:r>
     </w:p>
     <w:p>
       <w:pPr>
         <w:pStyle w:val="Nidung"/>
+        <w:jc w:val="center"/>
         <w:rPr>
           <w:lang w:val="vi-VN"/>
         </w:rPr>
@@ -18339,7 +18424,7 @@
                     <pic:cNvPicPr/>
                   </pic:nvPicPr>
                   <pic:blipFill>
-                    <a:blip r:embed="rId13"/>
+                    <a:blip r:embed="rId15"/>
                     <a:stretch>
                       <a:fillRect/>
                     </a:stretch>
@@ -18385,6 +18470,9 @@
     <w:p>
       <w:pPr>
         <w:pStyle w:val="Nidung"/>
+        <w:rPr>
+          <w:lang w:val="vi-VN"/>
+        </w:rPr>
       </w:pPr>
       <w:r>
         <w:t xml:space="preserve">Cấu hình SSH không mật khẩu giữa Master và các Worker </w:t>
@@ -18399,31 +18487,36 @@
         <w:t xml:space="preserve">. </w:t>
       </w:r>
       <w:r>
-        <w:t xml:space="preserve">Trong kiến trúc Hadoop Cluster, node Master (hoanganh24162006-master) cần sử dụng giao thức SSH để điều khiển từ xa việc khởi động và dừng các tiến trình DataNode, NodeManager và Spark Worker trên các máy Slave (hoc-slave1, locnguyen21139037-slave2, hoanganh24133004-slave3). Để tăng tính bảo mật và tránh xung đột với dịch vụ OpenSSH mặc định trên hệ điều hành Windows Host (cổng 22), nhóm cấu hình dịch vụ </w:t>
-      </w:r>
-      <w:r>
-        <w:lastRenderedPageBreak/>
-        <w:t>SSH trong các container Ubuntu 24.04 hoạt động trên cổng 2222 và thiết lập biến HADOOP_SSH_OPTS="-p 2222" trong hadoop-env.sh.</w:t>
+        <w:t>Trong kiến trúc Hadoop Cluster, node Master (hoanganh24162006-master) cần sử dụng giao thức SSH để điều khiển từ xa việc khởi động và dừng các tiến trình DataNode, NodeManager và Spark Worker trên các máy Slave (hoc-slave1, locnguyen21139037-slave2, hoanganh24133004-slave3). Để tăng tính bảo mật và tránh xung đột với dịch vụ OpenSSH mặc định trên hệ điều hành Windows Host (cổng 22), nhóm cấu hình dịch vụ SSH trong các container Ubuntu 24.04 hoạt động trên cổng 2222 và thiết lập biến HADOOP_SSH_OPTS="-p 2222" trong hadoop-env.sh.</w:t>
       </w:r>
     </w:p>
     <w:p>
       <w:pPr>
         <w:pStyle w:val="Nidung"/>
       </w:pPr>
+    </w:p>
+    <w:p>
+      <w:pPr>
+        <w:pStyle w:val="Nidung"/>
+      </w:pPr>
       <w:r>
         <w:t>Quy trình thiết lập SSH không mật khẩu (Passwordless SSH) được thực hiện như sau:</w:t>
       </w:r>
     </w:p>
     <w:p>
       <w:pPr>
+        <w:pStyle w:val="Heading4"/>
+      </w:pPr>
+      <w:r>
+        <w:t>Khởi tạo cặp khóa RSA trên các node</w:t>
+      </w:r>
+    </w:p>
+    <w:p>
+      <w:pPr>
         <w:pStyle w:val="Nidung"/>
-        <w:numPr>
-          <w:ilvl w:val="0"/>
-          <w:numId w:val="21"/>
-        </w:numPr>
-      </w:pPr>
-      <w:r>
-        <w:t xml:space="preserve">Khởi tạo cặp khóa RSA trên các node: Sử dụng lệnh </w:t>
+      </w:pPr>
+      <w:r>
+        <w:t xml:space="preserve">Sử dụng lệnh </w:t>
       </w:r>
     </w:p>
     <w:p>
@@ -18460,13 +18553,15 @@
       <w:pPr>
         <w:pStyle w:val="Nidung"/>
         <w:ind w:left="720"/>
-      </w:pPr>
-      <w:r>
+        <w:jc w:val="center"/>
+      </w:pPr>
+      <w:r>
+        <w:lastRenderedPageBreak/>
         <w:drawing>
-          <wp:inline distT="0" distB="0" distL="0" distR="0" wp14:anchorId="1D9ACF44" wp14:editId="570E2D48">
-            <wp:extent cx="5395428" cy="2575783"/>
+          <wp:inline distT="0" distB="0" distL="0" distR="0" wp14:anchorId="197FEDC3" wp14:editId="5BD11AF8">
+            <wp:extent cx="4922947" cy="2895851"/>
             <wp:effectExtent l="0" t="0" r="0" b="0"/>
-            <wp:docPr id="1227800538" name="Picture 1"/>
+            <wp:docPr id="1056921791" name="Picture 1"/>
             <wp:cNvGraphicFramePr>
               <a:graphicFrameLocks xmlns:a="http://schemas.openxmlformats.org/drawingml/2006/main" noChangeAspect="1"/>
             </wp:cNvGraphicFramePr>
@@ -18474,11 +18569,11 @@
               <a:graphicData uri="http://schemas.openxmlformats.org/drawingml/2006/picture">
                 <pic:pic xmlns:pic="http://schemas.openxmlformats.org/drawingml/2006/picture">
                   <pic:nvPicPr>
-                    <pic:cNvPr id="1227800538" name=""/>
+                    <pic:cNvPr id="1056921791" name=""/>
                     <pic:cNvPicPr/>
                   </pic:nvPicPr>
                   <pic:blipFill>
-                    <a:blip r:embed="rId14"/>
+                    <a:blip r:embed="rId16"/>
                     <a:stretch>
                       <a:fillRect/>
                     </a:stretch>
@@ -18486,7 +18581,7 @@
                   <pic:spPr>
                     <a:xfrm>
                       <a:off x="0" y="0"/>
-                      <a:ext cx="5395428" cy="2575783"/>
+                      <a:ext cx="4922947" cy="2895851"/>
                     </a:xfrm>
                     <a:prstGeom prst="rect">
                       <a:avLst/>
@@ -18502,13 +18597,28 @@
     <w:p>
       <w:pPr>
         <w:pStyle w:val="Nidung"/>
-        <w:numPr>
-          <w:ilvl w:val="0"/>
-          <w:numId w:val="21"/>
-        </w:numPr>
-      </w:pPr>
-      <w:r>
-        <w:t xml:space="preserve">Trao đổi khóa công khai từ Master sang các Slave: Từ node hoanganh24162006-master, nhóm sử dụng công cụ ssh-copy-id qua cổng 2222 để sao chép khóa công khai sang file ~/.ssh/authorized_keys của ba node Slave: </w:t>
+        <w:pBdr>
+          <w:top w:val="single" w:sz="4" w:space="1" w:color="auto"/>
+          <w:left w:val="single" w:sz="4" w:space="4" w:color="auto"/>
+          <w:bottom w:val="single" w:sz="4" w:space="1" w:color="auto"/>
+          <w:right w:val="single" w:sz="4" w:space="4" w:color="auto"/>
+        </w:pBdr>
+        <w:jc w:val="left"/>
+      </w:pPr>
+      <w:r>
+        <w:t>cat /home/</w:t>
+      </w:r>
+      <w:r>
+        <w:t>hadoopanh24162006</w:t>
+      </w:r>
+      <w:r>
+        <w:t>/.ssh/id_rsa.pub &gt;&gt; /home/</w:t>
+      </w:r>
+      <w:r>
+        <w:t>hadoopanh24162006</w:t>
+      </w:r>
+      <w:r>
+        <w:t>/.ssh/authorized_keys.pub</w:t>
       </w:r>
     </w:p>
     <w:p>
@@ -18520,10 +18630,77 @@
           <w:bottom w:val="single" w:sz="4" w:space="1" w:color="auto"/>
           <w:right w:val="single" w:sz="4" w:space="4" w:color="auto"/>
         </w:pBdr>
-      </w:pPr>
-      <w:r>
-        <w:t>ssh-copy-id -p 2222 hadoophoanganh24162006@hoc-slave1</w:t>
-      </w:r>
+        <w:jc w:val="left"/>
+      </w:pPr>
+      <w:r>
+        <w:t>cat /home/</w:t>
+      </w:r>
+      <w:r>
+        <w:t>hadoopanh24162006</w:t>
+      </w:r>
+      <w:r>
+        <w:t>/.ssh/id_rsa &gt;&gt;</w:t>
+      </w:r>
+      <w:r>
+        <w:t xml:space="preserve"> </w:t>
+      </w:r>
+      <w:r>
+        <w:t>/home/</w:t>
+      </w:r>
+      <w:r>
+        <w:t>hadoopanh24162006</w:t>
+      </w:r>
+      <w:r>
+        <w:t>/.ssh/authorized_keys</w:t>
+      </w:r>
+    </w:p>
+    <w:p>
+      <w:pPr>
+        <w:pStyle w:val="Nidung"/>
+        <w:jc w:val="center"/>
+      </w:pPr>
+      <w:r>
+        <w:drawing>
+          <wp:inline distT="0" distB="0" distL="0" distR="0" wp14:anchorId="7AF83C97" wp14:editId="476A542A">
+            <wp:extent cx="5760720" cy="731520"/>
+            <wp:effectExtent l="0" t="0" r="0" b="0"/>
+            <wp:docPr id="2058737536" name="Picture 1"/>
+            <wp:cNvGraphicFramePr>
+              <a:graphicFrameLocks xmlns:a="http://schemas.openxmlformats.org/drawingml/2006/main" noChangeAspect="1"/>
+            </wp:cNvGraphicFramePr>
+            <a:graphic xmlns:a="http://schemas.openxmlformats.org/drawingml/2006/main">
+              <a:graphicData uri="http://schemas.openxmlformats.org/drawingml/2006/picture">
+                <pic:pic xmlns:pic="http://schemas.openxmlformats.org/drawingml/2006/picture">
+                  <pic:nvPicPr>
+                    <pic:cNvPr id="2058737536" name=""/>
+                    <pic:cNvPicPr/>
+                  </pic:nvPicPr>
+                  <pic:blipFill>
+                    <a:blip r:embed="rId17"/>
+                    <a:stretch>
+                      <a:fillRect/>
+                    </a:stretch>
+                  </pic:blipFill>
+                  <pic:spPr>
+                    <a:xfrm>
+                      <a:off x="0" y="0"/>
+                      <a:ext cx="5760720" cy="731520"/>
+                    </a:xfrm>
+                    <a:prstGeom prst="rect">
+                      <a:avLst/>
+                    </a:prstGeom>
+                  </pic:spPr>
+                </pic:pic>
+              </a:graphicData>
+            </a:graphic>
+          </wp:inline>
+        </w:drawing>
+      </w:r>
+    </w:p>
+    <w:p>
+      <w:pPr>
+        <w:pStyle w:val="Nidung"/>
+      </w:pPr>
     </w:p>
     <w:p>
       <w:pPr>
@@ -18536,7 +18713,13 @@
         </w:pBdr>
       </w:pPr>
       <w:r>
-        <w:t>ssh-copy-id -p 2222 hadoophoanganh24162006@locnguyen21139037-slave2</w:t>
+        <w:t>chmod 600 /home/</w:t>
+      </w:r>
+      <w:r>
+        <w:t>hadoopanh24162006</w:t>
+      </w:r>
+      <w:r>
+        <w:t>/.ssh/authorized_keys.pub</w:t>
       </w:r>
     </w:p>
     <w:p>
@@ -18548,112 +18731,4274 @@
           <w:bottom w:val="single" w:sz="4" w:space="1" w:color="auto"/>
           <w:right w:val="single" w:sz="4" w:space="4" w:color="auto"/>
         </w:pBdr>
+      </w:pPr>
+      <w:r>
+        <w:t>chmod 600 /home/</w:t>
+      </w:r>
+      <w:r>
+        <w:t>hadoopanh24162006</w:t>
+      </w:r>
+      <w:r>
+        <w:t>/.ssh/authorized_keys</w:t>
+      </w:r>
+    </w:p>
+    <w:p>
+      <w:pPr>
+        <w:pStyle w:val="Nidung"/>
+        <w:jc w:val="center"/>
+      </w:pPr>
+      <w:r>
+        <w:drawing>
+          <wp:inline distT="0" distB="0" distL="0" distR="0" wp14:anchorId="02D250E2" wp14:editId="5975A52C">
+            <wp:extent cx="4854361" cy="960203"/>
+            <wp:effectExtent l="0" t="0" r="3810" b="0"/>
+            <wp:docPr id="1387151843" name="Picture 1"/>
+            <wp:cNvGraphicFramePr>
+              <a:graphicFrameLocks xmlns:a="http://schemas.openxmlformats.org/drawingml/2006/main" noChangeAspect="1"/>
+            </wp:cNvGraphicFramePr>
+            <a:graphic xmlns:a="http://schemas.openxmlformats.org/drawingml/2006/main">
+              <a:graphicData uri="http://schemas.openxmlformats.org/drawingml/2006/picture">
+                <pic:pic xmlns:pic="http://schemas.openxmlformats.org/drawingml/2006/picture">
+                  <pic:nvPicPr>
+                    <pic:cNvPr id="1387151843" name=""/>
+                    <pic:cNvPicPr/>
+                  </pic:nvPicPr>
+                  <pic:blipFill>
+                    <a:blip r:embed="rId18"/>
+                    <a:stretch>
+                      <a:fillRect/>
+                    </a:stretch>
+                  </pic:blipFill>
+                  <pic:spPr>
+                    <a:xfrm>
+                      <a:off x="0" y="0"/>
+                      <a:ext cx="4854361" cy="960203"/>
+                    </a:xfrm>
+                    <a:prstGeom prst="rect">
+                      <a:avLst/>
+                    </a:prstGeom>
+                  </pic:spPr>
+                </pic:pic>
+              </a:graphicData>
+            </a:graphic>
+          </wp:inline>
+        </w:drawing>
+      </w:r>
+    </w:p>
+    <w:p>
+      <w:pPr>
+        <w:pStyle w:val="Nidung"/>
+      </w:pPr>
+    </w:p>
+    <w:p>
+      <w:pPr>
+        <w:pStyle w:val="Heading4"/>
         <w:rPr>
           <w:lang w:val="vi-VN"/>
         </w:rPr>
       </w:pPr>
       <w:r>
-        <w:t>ssh-copy-id -p 2222 hadoophoanganh24162006@hoanganh24133004-slave3</w:t>
+        <w:t>Trao đổi</w:t>
+      </w:r>
+      <w:r>
+        <w:rPr>
+          <w:lang w:val="vi-VN"/>
+        </w:rPr>
+        <w:t xml:space="preserve"> khóa giữa Master </w:t>
+      </w:r>
+      <w:r>
+        <w:rPr>
+          <w:lang w:val="vi-VN"/>
+        </w:rPr>
+        <w:t>–</w:t>
+      </w:r>
+      <w:r>
+        <w:rPr>
+          <w:lang w:val="vi-VN"/>
+        </w:rPr>
+        <w:t xml:space="preserve"> Master</w:t>
       </w:r>
     </w:p>
     <w:p>
       <w:pPr>
         <w:pStyle w:val="Nidung"/>
+        <w:pBdr>
+          <w:top w:val="single" w:sz="4" w:space="1" w:color="auto"/>
+          <w:left w:val="single" w:sz="4" w:space="4" w:color="auto"/>
+          <w:bottom w:val="single" w:sz="4" w:space="1" w:color="auto"/>
+          <w:right w:val="single" w:sz="4" w:space="4" w:color="auto"/>
+        </w:pBdr>
         <w:rPr>
           <w:lang w:val="vi-VN"/>
         </w:rPr>
       </w:pPr>
+      <w:r>
+        <w:rPr>
+          <w:lang w:val="vi-VN"/>
+        </w:rPr>
+        <w:t>ssh-copy-id -i /home/</w:t>
+      </w:r>
+      <w:r>
+        <w:rPr>
+          <w:lang w:val="vi-VN"/>
+        </w:rPr>
+        <w:t>hadoopanh24162006</w:t>
+      </w:r>
+      <w:r>
+        <w:rPr>
+          <w:lang w:val="vi-VN"/>
+        </w:rPr>
+        <w:t>/.ssh/authorized_keys</w:t>
+      </w:r>
+      <w:r>
+        <w:rPr>
+          <w:lang w:val="vi-VN"/>
+        </w:rPr>
+        <w:t xml:space="preserve"> </w:t>
+      </w:r>
+      <w:r>
+        <w:rPr>
+          <w:lang w:val="vi-VN"/>
+        </w:rPr>
+        <w:t>anh24162006</w:t>
+      </w:r>
+      <w:r>
+        <w:rPr>
+          <w:lang w:val="vi-VN"/>
+        </w:rPr>
+        <w:t>-master</w:t>
+      </w:r>
     </w:p>
     <w:p>
       <w:pPr>
         <w:pStyle w:val="Nidung"/>
-      </w:pPr>
+        <w:jc w:val="center"/>
+        <w:rPr>
+          <w:lang w:val="vi-VN"/>
+        </w:rPr>
+      </w:pPr>
+      <w:r>
+        <w:rPr>
+          <w:lang w:val="vi-VN"/>
+        </w:rPr>
+        <w:lastRenderedPageBreak/>
+        <w:drawing>
+          <wp:inline distT="0" distB="0" distL="0" distR="0" wp14:anchorId="0DB2CAAF" wp14:editId="0DEA8E32">
+            <wp:extent cx="5760720" cy="1500505"/>
+            <wp:effectExtent l="0" t="0" r="0" b="4445"/>
+            <wp:docPr id="1862971847" name="Picture 1"/>
+            <wp:cNvGraphicFramePr>
+              <a:graphicFrameLocks xmlns:a="http://schemas.openxmlformats.org/drawingml/2006/main" noChangeAspect="1"/>
+            </wp:cNvGraphicFramePr>
+            <a:graphic xmlns:a="http://schemas.openxmlformats.org/drawingml/2006/main">
+              <a:graphicData uri="http://schemas.openxmlformats.org/drawingml/2006/picture">
+                <pic:pic xmlns:pic="http://schemas.openxmlformats.org/drawingml/2006/picture">
+                  <pic:nvPicPr>
+                    <pic:cNvPr id="1862971847" name=""/>
+                    <pic:cNvPicPr/>
+                  </pic:nvPicPr>
+                  <pic:blipFill>
+                    <a:blip r:embed="rId19"/>
+                    <a:stretch>
+                      <a:fillRect/>
+                    </a:stretch>
+                  </pic:blipFill>
+                  <pic:spPr>
+                    <a:xfrm>
+                      <a:off x="0" y="0"/>
+                      <a:ext cx="5760720" cy="1500505"/>
+                    </a:xfrm>
+                    <a:prstGeom prst="rect">
+                      <a:avLst/>
+                    </a:prstGeom>
+                  </pic:spPr>
+                </pic:pic>
+              </a:graphicData>
+            </a:graphic>
+          </wp:inline>
+        </w:drawing>
+      </w:r>
     </w:p>
     <w:p>
       <w:pPr>
         <w:pStyle w:val="Nidung"/>
-        <w:numPr>
-          <w:ilvl w:val="0"/>
-          <w:numId w:val="21"/>
-        </w:numPr>
-      </w:pPr>
-      <w:r>
-        <w:t>Kiểm thử kết nối SSH toàn cụm: Sau khi sao chép khóa, nhóm thực hiện kiểm tra kết nối SSH từ hoanganh24162006-master đến toàn bộ các node trong cluster. Kết quả trả về đúng hostname của từng node mà không yêu cầu nhập mật khẩu, đảm bảo cụm Hadoop sẵn sàng cho bước khởi chạy các dịch vụ phân tán bằng lệnh start-all.sh.</w:t>
+      </w:pPr>
+    </w:p>
+    <w:p>
+      <w:pPr>
+        <w:pStyle w:val="Heading4"/>
+      </w:pPr>
+      <w:r>
+        <w:t xml:space="preserve">Trao đổi khóa công khai </w:t>
+      </w:r>
+      <w:r>
+        <w:t>giữa</w:t>
+      </w:r>
+      <w:r>
+        <w:rPr>
+          <w:lang w:val="vi-VN"/>
+        </w:rPr>
+        <w:t xml:space="preserve"> </w:t>
+      </w:r>
+      <w:r>
+        <w:t xml:space="preserve">Master </w:t>
+      </w:r>
+      <w:r>
+        <w:rPr>
+          <w:lang w:val="vi-VN"/>
+        </w:rPr>
+        <w:t xml:space="preserve">- </w:t>
+      </w:r>
+      <w:r>
+        <w:t>Slave</w:t>
       </w:r>
     </w:p>
     <w:p>
       <w:pPr>
         <w:pStyle w:val="Nidung"/>
+      </w:pPr>
+      <w:r>
+        <w:t xml:space="preserve">Từ node hoanganh24162006-master, nhóm sử dụng công cụ ssh-copy-id qua cổng 2222 để sao chép khóa công khai sang file ~/.ssh/authorized_keys của ba node Slave: </w:t>
+      </w:r>
+    </w:p>
+    <w:p>
+      <w:pPr>
+        <w:pStyle w:val="Nidung"/>
+        <w:pBdr>
+          <w:top w:val="single" w:sz="4" w:space="1" w:color="auto"/>
+          <w:left w:val="single" w:sz="4" w:space="4" w:color="auto"/>
+          <w:bottom w:val="single" w:sz="4" w:space="1" w:color="auto"/>
+          <w:right w:val="single" w:sz="4" w:space="4" w:color="auto"/>
+        </w:pBdr>
+        <w:jc w:val="left"/>
+      </w:pPr>
+      <w:r>
+        <w:t xml:space="preserve">ssh-copy-id -p 2222 </w:t>
+      </w:r>
+      <w:r>
+        <w:t>-i /home/</w:t>
+      </w:r>
+      <w:r>
+        <w:t>hadoopanh24162006</w:t>
+      </w:r>
+      <w:r>
+        <w:t xml:space="preserve">/.ssh/authorized_keys.pub </w:t>
+      </w:r>
+      <w:r>
+        <w:t>hoc-slave1</w:t>
+      </w:r>
+    </w:p>
+    <w:p>
+      <w:pPr>
+        <w:pStyle w:val="Nidung"/>
+        <w:pBdr>
+          <w:top w:val="single" w:sz="4" w:space="1" w:color="auto"/>
+          <w:left w:val="single" w:sz="4" w:space="4" w:color="auto"/>
+          <w:bottom w:val="single" w:sz="4" w:space="1" w:color="auto"/>
+          <w:right w:val="single" w:sz="4" w:space="4" w:color="auto"/>
+        </w:pBdr>
+        <w:jc w:val="left"/>
+      </w:pPr>
+      <w:r>
+        <w:t xml:space="preserve">ssh-copy-id -p 2222 </w:t>
+      </w:r>
+      <w:r>
+        <w:t>-i /home/</w:t>
+      </w:r>
+      <w:r>
+        <w:t>hadoopanh24162006</w:t>
+      </w:r>
+      <w:r>
+        <w:t xml:space="preserve">/.ssh/authorized_keys.pub </w:t>
+      </w:r>
+      <w:r>
+        <w:t>nguyen-slave2</w:t>
+      </w:r>
+    </w:p>
+    <w:p>
+      <w:pPr>
+        <w:pStyle w:val="Nidung"/>
+        <w:pBdr>
+          <w:top w:val="single" w:sz="4" w:space="1" w:color="auto"/>
+          <w:left w:val="single" w:sz="4" w:space="4" w:color="auto"/>
+          <w:bottom w:val="single" w:sz="4" w:space="1" w:color="auto"/>
+          <w:right w:val="single" w:sz="4" w:space="4" w:color="auto"/>
+        </w:pBdr>
+        <w:jc w:val="left"/>
         <w:rPr>
           <w:lang w:val="vi-VN"/>
         </w:rPr>
       </w:pPr>
+      <w:r>
+        <w:t xml:space="preserve">ssh-copy-id -p 2222 </w:t>
+      </w:r>
+      <w:r>
+        <w:t>-i /home/</w:t>
+      </w:r>
+      <w:r>
+        <w:t>hadoopanh24162006</w:t>
+      </w:r>
+      <w:r>
+        <w:t>/.ssh/authorized_keys.pub</w:t>
+      </w:r>
+      <w:r>
+        <w:rPr>
+          <w:lang w:val="vi-VN"/>
+        </w:rPr>
+        <w:t xml:space="preserve"> </w:t>
+      </w:r>
+      <w:r>
+        <w:t>anh24133004-slave3</w:t>
+      </w:r>
     </w:p>
     <w:p>
       <w:pPr>
         <w:pStyle w:val="Nidung"/>
+        <w:jc w:val="center"/>
         <w:rPr>
           <w:lang w:val="vi-VN"/>
         </w:rPr>
       </w:pPr>
+      <w:r>
+        <w:rPr>
+          <w:lang w:val="vi-VN"/>
+        </w:rPr>
+        <w:drawing>
+          <wp:inline distT="0" distB="0" distL="0" distR="0" wp14:anchorId="75B4396F" wp14:editId="371FC5D7">
+            <wp:extent cx="5760720" cy="1496060"/>
+            <wp:effectExtent l="0" t="0" r="0" b="8890"/>
+            <wp:docPr id="180534404" name="Picture 1"/>
+            <wp:cNvGraphicFramePr>
+              <a:graphicFrameLocks xmlns:a="http://schemas.openxmlformats.org/drawingml/2006/main" noChangeAspect="1"/>
+            </wp:cNvGraphicFramePr>
+            <a:graphic xmlns:a="http://schemas.openxmlformats.org/drawingml/2006/main">
+              <a:graphicData uri="http://schemas.openxmlformats.org/drawingml/2006/picture">
+                <pic:pic xmlns:pic="http://schemas.openxmlformats.org/drawingml/2006/picture">
+                  <pic:nvPicPr>
+                    <pic:cNvPr id="180534404" name=""/>
+                    <pic:cNvPicPr/>
+                  </pic:nvPicPr>
+                  <pic:blipFill>
+                    <a:blip r:embed="rId20"/>
+                    <a:stretch>
+                      <a:fillRect/>
+                    </a:stretch>
+                  </pic:blipFill>
+                  <pic:spPr>
+                    <a:xfrm>
+                      <a:off x="0" y="0"/>
+                      <a:ext cx="5760720" cy="1496060"/>
+                    </a:xfrm>
+                    <a:prstGeom prst="rect">
+                      <a:avLst/>
+                    </a:prstGeom>
+                  </pic:spPr>
+                </pic:pic>
+              </a:graphicData>
+            </a:graphic>
+          </wp:inline>
+        </w:drawing>
+      </w:r>
+    </w:p>
+    <w:p>
+      <w:pPr>
+        <w:pStyle w:val="Nidung"/>
+        <w:jc w:val="center"/>
+        <w:rPr>
+          <w:lang w:val="vi-VN"/>
+        </w:rPr>
+      </w:pPr>
+      <w:r>
+        <w:rPr>
+          <w:lang w:val="vi-VN"/>
+        </w:rPr>
+        <w:drawing>
+          <wp:inline distT="0" distB="0" distL="0" distR="0" wp14:anchorId="401704AE" wp14:editId="7E0824A9">
+            <wp:extent cx="5760720" cy="1520190"/>
+            <wp:effectExtent l="0" t="0" r="0" b="3810"/>
+            <wp:docPr id="1417500469" name="Picture 1"/>
+            <wp:cNvGraphicFramePr>
+              <a:graphicFrameLocks xmlns:a="http://schemas.openxmlformats.org/drawingml/2006/main" noChangeAspect="1"/>
+            </wp:cNvGraphicFramePr>
+            <a:graphic xmlns:a="http://schemas.openxmlformats.org/drawingml/2006/main">
+              <a:graphicData uri="http://schemas.openxmlformats.org/drawingml/2006/picture">
+                <pic:pic xmlns:pic="http://schemas.openxmlformats.org/drawingml/2006/picture">
+                  <pic:nvPicPr>
+                    <pic:cNvPr id="1417500469" name=""/>
+                    <pic:cNvPicPr/>
+                  </pic:nvPicPr>
+                  <pic:blipFill>
+                    <a:blip r:embed="rId21"/>
+                    <a:stretch>
+                      <a:fillRect/>
+                    </a:stretch>
+                  </pic:blipFill>
+                  <pic:spPr>
+                    <a:xfrm>
+                      <a:off x="0" y="0"/>
+                      <a:ext cx="5760720" cy="1520190"/>
+                    </a:xfrm>
+                    <a:prstGeom prst="rect">
+                      <a:avLst/>
+                    </a:prstGeom>
+                  </pic:spPr>
+                </pic:pic>
+              </a:graphicData>
+            </a:graphic>
+          </wp:inline>
+        </w:drawing>
+      </w:r>
+    </w:p>
+    <w:p>
+      <w:pPr>
+        <w:pStyle w:val="Nidung"/>
+        <w:jc w:val="center"/>
+        <w:rPr>
+          <w:lang w:val="vi-VN"/>
+        </w:rPr>
+      </w:pPr>
+      <w:r>
+        <w:rPr>
+          <w:lang w:val="vi-VN"/>
+        </w:rPr>
+        <w:lastRenderedPageBreak/>
+        <w:drawing>
+          <wp:inline distT="0" distB="0" distL="0" distR="0" wp14:anchorId="3298F628" wp14:editId="1D837960">
+            <wp:extent cx="5760720" cy="1452245"/>
+            <wp:effectExtent l="0" t="0" r="0" b="0"/>
+            <wp:docPr id="204011157" name="Picture 1"/>
+            <wp:cNvGraphicFramePr>
+              <a:graphicFrameLocks xmlns:a="http://schemas.openxmlformats.org/drawingml/2006/main" noChangeAspect="1"/>
+            </wp:cNvGraphicFramePr>
+            <a:graphic xmlns:a="http://schemas.openxmlformats.org/drawingml/2006/main">
+              <a:graphicData uri="http://schemas.openxmlformats.org/drawingml/2006/picture">
+                <pic:pic xmlns:pic="http://schemas.openxmlformats.org/drawingml/2006/picture">
+                  <pic:nvPicPr>
+                    <pic:cNvPr id="204011157" name=""/>
+                    <pic:cNvPicPr/>
+                  </pic:nvPicPr>
+                  <pic:blipFill>
+                    <a:blip r:embed="rId22"/>
+                    <a:stretch>
+                      <a:fillRect/>
+                    </a:stretch>
+                  </pic:blipFill>
+                  <pic:spPr>
+                    <a:xfrm>
+                      <a:off x="0" y="0"/>
+                      <a:ext cx="5760720" cy="1452245"/>
+                    </a:xfrm>
+                    <a:prstGeom prst="rect">
+                      <a:avLst/>
+                    </a:prstGeom>
+                  </pic:spPr>
+                </pic:pic>
+              </a:graphicData>
+            </a:graphic>
+          </wp:inline>
+        </w:drawing>
+      </w:r>
+    </w:p>
+    <w:p>
+      <w:pPr>
+        <w:pStyle w:val="Nidung"/>
+        <w:rPr>
+          <w:lang w:val="vi-VN"/>
+        </w:rPr>
+      </w:pPr>
+    </w:p>
+    <w:p>
+      <w:pPr>
+        <w:pStyle w:val="Heading4"/>
+      </w:pPr>
+      <w:r>
+        <w:t>Kiểm thử kết nối SSH toàn cụm</w:t>
+      </w:r>
+    </w:p>
+    <w:p>
+      <w:pPr>
+        <w:pStyle w:val="Nidung"/>
+      </w:pPr>
+      <w:r>
+        <w:t>Sau khi sao chép khóa, nhóm thực hiện kiểm tra kết nối SSH từ hoanganh24162006-master đến toàn bộ các node trong cluster. Kết quả trả về đúng hostname của từng node mà không yêu cầu nhập mật khẩu, đảm bảo cụm Hadoop sẵn sàng cho bước khởi chạy các dịch vụ phân tán bằng lệnh start-all.sh.</w:t>
+      </w:r>
+    </w:p>
+    <w:p>
+      <w:pPr>
+        <w:pStyle w:val="Nidung"/>
+        <w:jc w:val="center"/>
+      </w:pPr>
+      <w:r>
+        <w:rPr>
+          <w:lang w:val="vi-VN"/>
+        </w:rPr>
+        <w:drawing>
+          <wp:inline distT="0" distB="0" distL="0" distR="0" wp14:anchorId="75ABF358" wp14:editId="60A36D81">
+            <wp:extent cx="4762913" cy="2217612"/>
+            <wp:effectExtent l="0" t="0" r="0" b="0"/>
+            <wp:docPr id="845284153" name="Picture 1"/>
+            <wp:cNvGraphicFramePr>
+              <a:graphicFrameLocks xmlns:a="http://schemas.openxmlformats.org/drawingml/2006/main" noChangeAspect="1"/>
+            </wp:cNvGraphicFramePr>
+            <a:graphic xmlns:a="http://schemas.openxmlformats.org/drawingml/2006/main">
+              <a:graphicData uri="http://schemas.openxmlformats.org/drawingml/2006/picture">
+                <pic:pic xmlns:pic="http://schemas.openxmlformats.org/drawingml/2006/picture">
+                  <pic:nvPicPr>
+                    <pic:cNvPr id="845284153" name=""/>
+                    <pic:cNvPicPr/>
+                  </pic:nvPicPr>
+                  <pic:blipFill>
+                    <a:blip r:embed="rId23"/>
+                    <a:stretch>
+                      <a:fillRect/>
+                    </a:stretch>
+                  </pic:blipFill>
+                  <pic:spPr>
+                    <a:xfrm>
+                      <a:off x="0" y="0"/>
+                      <a:ext cx="4762913" cy="2217612"/>
+                    </a:xfrm>
+                    <a:prstGeom prst="rect">
+                      <a:avLst/>
+                    </a:prstGeom>
+                  </pic:spPr>
+                </pic:pic>
+              </a:graphicData>
+            </a:graphic>
+          </wp:inline>
+        </w:drawing>
+      </w:r>
+    </w:p>
+    <w:p>
+      <w:pPr>
+        <w:pStyle w:val="Nidung"/>
+        <w:jc w:val="center"/>
+      </w:pPr>
+      <w:r>
+        <w:drawing>
+          <wp:inline distT="0" distB="0" distL="0" distR="0" wp14:anchorId="3BAC86DD" wp14:editId="64BEA646">
+            <wp:extent cx="4884843" cy="2232853"/>
+            <wp:effectExtent l="0" t="0" r="0" b="0"/>
+            <wp:docPr id="1053688200" name="Picture 1"/>
+            <wp:cNvGraphicFramePr>
+              <a:graphicFrameLocks xmlns:a="http://schemas.openxmlformats.org/drawingml/2006/main" noChangeAspect="1"/>
+            </wp:cNvGraphicFramePr>
+            <a:graphic xmlns:a="http://schemas.openxmlformats.org/drawingml/2006/main">
+              <a:graphicData uri="http://schemas.openxmlformats.org/drawingml/2006/picture">
+                <pic:pic xmlns:pic="http://schemas.openxmlformats.org/drawingml/2006/picture">
+                  <pic:nvPicPr>
+                    <pic:cNvPr id="1053688200" name=""/>
+                    <pic:cNvPicPr/>
+                  </pic:nvPicPr>
+                  <pic:blipFill>
+                    <a:blip r:embed="rId24"/>
+                    <a:stretch>
+                      <a:fillRect/>
+                    </a:stretch>
+                  </pic:blipFill>
+                  <pic:spPr>
+                    <a:xfrm>
+                      <a:off x="0" y="0"/>
+                      <a:ext cx="4884843" cy="2232853"/>
+                    </a:xfrm>
+                    <a:prstGeom prst="rect">
+                      <a:avLst/>
+                    </a:prstGeom>
+                  </pic:spPr>
+                </pic:pic>
+              </a:graphicData>
+            </a:graphic>
+          </wp:inline>
+        </w:drawing>
+      </w:r>
+    </w:p>
+    <w:p>
+      <w:pPr>
+        <w:pStyle w:val="Nidung"/>
+        <w:jc w:val="center"/>
+      </w:pPr>
+      <w:r>
+        <w:lastRenderedPageBreak/>
+        <w:drawing>
+          <wp:inline distT="0" distB="0" distL="0" distR="0" wp14:anchorId="3A6914CE" wp14:editId="6C4FE3A6">
+            <wp:extent cx="5159187" cy="2179509"/>
+            <wp:effectExtent l="0" t="0" r="3810" b="0"/>
+            <wp:docPr id="1183662244" name="Picture 1"/>
+            <wp:cNvGraphicFramePr>
+              <a:graphicFrameLocks xmlns:a="http://schemas.openxmlformats.org/drawingml/2006/main" noChangeAspect="1"/>
+            </wp:cNvGraphicFramePr>
+            <a:graphic xmlns:a="http://schemas.openxmlformats.org/drawingml/2006/main">
+              <a:graphicData uri="http://schemas.openxmlformats.org/drawingml/2006/picture">
+                <pic:pic xmlns:pic="http://schemas.openxmlformats.org/drawingml/2006/picture">
+                  <pic:nvPicPr>
+                    <pic:cNvPr id="1183662244" name=""/>
+                    <pic:cNvPicPr/>
+                  </pic:nvPicPr>
+                  <pic:blipFill>
+                    <a:blip r:embed="rId25"/>
+                    <a:stretch>
+                      <a:fillRect/>
+                    </a:stretch>
+                  </pic:blipFill>
+                  <pic:spPr>
+                    <a:xfrm>
+                      <a:off x="0" y="0"/>
+                      <a:ext cx="5159187" cy="2179509"/>
+                    </a:xfrm>
+                    <a:prstGeom prst="rect">
+                      <a:avLst/>
+                    </a:prstGeom>
+                  </pic:spPr>
+                </pic:pic>
+              </a:graphicData>
+            </a:graphic>
+          </wp:inline>
+        </w:drawing>
+      </w:r>
+    </w:p>
+    <w:p>
+      <w:pPr>
+        <w:pStyle w:val="Nidung"/>
+        <w:rPr>
+          <w:lang w:val="vi-VN"/>
+        </w:rPr>
+      </w:pPr>
     </w:p>
     <w:p>
       <w:pPr>
         <w:pStyle w:val="Heading2"/>
       </w:pPr>
       <w:r>
+        <w:t>KIỂM THỬ HỆ THỐNG</w:t>
+      </w:r>
+    </w:p>
+    <w:p>
+      <w:pPr>
+        <w:pStyle w:val="Heading3"/>
+      </w:pPr>
+      <w:r>
+        <w:t>Khởi động Hadoop</w:t>
+      </w:r>
+      <w:r>
+        <w:t xml:space="preserve"> trên máy Master</w:t>
+      </w:r>
+    </w:p>
+    <w:p>
+      <w:pPr>
+        <w:pStyle w:val="Nidung"/>
+        <w:jc w:val="center"/>
+      </w:pPr>
+      <w:r>
+        <w:drawing>
+          <wp:inline distT="0" distB="0" distL="0" distR="0" wp14:anchorId="07A7FACC" wp14:editId="2509E88F">
+            <wp:extent cx="5760720" cy="2897505"/>
+            <wp:effectExtent l="0" t="0" r="0" b="0"/>
+            <wp:docPr id="514507619" name="Picture 1"/>
+            <wp:cNvGraphicFramePr>
+              <a:graphicFrameLocks xmlns:a="http://schemas.openxmlformats.org/drawingml/2006/main" noChangeAspect="1"/>
+            </wp:cNvGraphicFramePr>
+            <a:graphic xmlns:a="http://schemas.openxmlformats.org/drawingml/2006/main">
+              <a:graphicData uri="http://schemas.openxmlformats.org/drawingml/2006/picture">
+                <pic:pic xmlns:pic="http://schemas.openxmlformats.org/drawingml/2006/picture">
+                  <pic:nvPicPr>
+                    <pic:cNvPr id="514507619" name=""/>
+                    <pic:cNvPicPr/>
+                  </pic:nvPicPr>
+                  <pic:blipFill>
+                    <a:blip r:embed="rId26"/>
+                    <a:stretch>
+                      <a:fillRect/>
+                    </a:stretch>
+                  </pic:blipFill>
+                  <pic:spPr>
+                    <a:xfrm>
+                      <a:off x="0" y="0"/>
+                      <a:ext cx="5760720" cy="2897505"/>
+                    </a:xfrm>
+                    <a:prstGeom prst="rect">
+                      <a:avLst/>
+                    </a:prstGeom>
+                  </pic:spPr>
+                </pic:pic>
+              </a:graphicData>
+            </a:graphic>
+          </wp:inline>
+        </w:drawing>
+      </w:r>
+    </w:p>
+    <w:p>
+      <w:pPr>
+        <w:pStyle w:val="Nidung"/>
+      </w:pPr>
+    </w:p>
+    <w:p>
+      <w:pPr>
+        <w:pStyle w:val="Heading3"/>
+      </w:pPr>
+      <w:r>
+        <w:t>Khởi động Hadoop trên các máy Slave</w:t>
+      </w:r>
+    </w:p>
+    <w:p>
+      <w:pPr>
+        <w:pStyle w:val="Nidung"/>
+        <w:pBdr>
+          <w:top w:val="single" w:sz="4" w:space="1" w:color="auto"/>
+          <w:left w:val="single" w:sz="4" w:space="4" w:color="auto"/>
+          <w:bottom w:val="single" w:sz="4" w:space="1" w:color="auto"/>
+          <w:right w:val="single" w:sz="4" w:space="4" w:color="auto"/>
+        </w:pBdr>
+        <w:jc w:val="left"/>
+      </w:pPr>
+      <w:r>
+        <w:t>ssh hoc-slave1 '~/hadoop/bin/hdfs --daemon stop datanode; ~/hadoop/bin/hdfs --daemon start datanode -Ddfs.datanode.address=0.0.0.0:9866</w:t>
+      </w:r>
+      <w:r>
+        <w:t>; jps</w:t>
+      </w:r>
+      <w:r>
+        <w:t>'</w:t>
+      </w:r>
+    </w:p>
+    <w:p>
+      <w:pPr>
+        <w:pStyle w:val="Nidung"/>
+        <w:pBdr>
+          <w:top w:val="single" w:sz="4" w:space="1" w:color="auto"/>
+          <w:left w:val="single" w:sz="4" w:space="4" w:color="auto"/>
+          <w:bottom w:val="single" w:sz="4" w:space="1" w:color="auto"/>
+          <w:right w:val="single" w:sz="4" w:space="4" w:color="auto"/>
+        </w:pBdr>
+        <w:jc w:val="left"/>
+        <w:rPr>
+          <w:lang w:val="vi-VN"/>
+        </w:rPr>
+      </w:pPr>
+      <w:r>
+        <w:rPr>
+          <w:lang w:val="vi-VN"/>
+        </w:rPr>
+        <w:t>ssh nguyen-slave2 '~/hadoop/bin/hdfs --daemon stop datanode; ~/hadoop/bin/hdfs --daemon start datanode -Ddfs.datanode.address=0.0.0.0:10020</w:t>
+      </w:r>
+      <w:r>
+        <w:t>; jps</w:t>
+      </w:r>
+      <w:r>
+        <w:rPr>
+          <w:lang w:val="vi-VN"/>
+        </w:rPr>
+        <w:t>'</w:t>
+      </w:r>
+    </w:p>
+    <w:p>
+      <w:pPr>
+        <w:pStyle w:val="Nidung"/>
+        <w:pBdr>
+          <w:top w:val="single" w:sz="4" w:space="1" w:color="auto"/>
+          <w:left w:val="single" w:sz="4" w:space="4" w:color="auto"/>
+          <w:bottom w:val="single" w:sz="4" w:space="1" w:color="auto"/>
+          <w:right w:val="single" w:sz="4" w:space="4" w:color="auto"/>
+        </w:pBdr>
+        <w:jc w:val="left"/>
+        <w:rPr>
+          <w:lang w:val="vi-VN"/>
+        </w:rPr>
+      </w:pPr>
+      <w:r>
+        <w:rPr>
+          <w:lang w:val="vi-VN"/>
+        </w:rPr>
+        <w:t>ssh anh24133004-slave3 '~/hadoop/bin/hdfs --daemon stop datanode; ~/hadoop/bin/hdfs --daemon start datanode -Ddfs.datanode.address=0.0.0.0:19888</w:t>
+      </w:r>
+      <w:r>
+        <w:t>; jps</w:t>
+      </w:r>
+      <w:r>
+        <w:rPr>
+          <w:lang w:val="vi-VN"/>
+        </w:rPr>
+        <w:t>'</w:t>
+      </w:r>
+    </w:p>
+    <w:p>
+      <w:pPr>
+        <w:pStyle w:val="Nidung"/>
+        <w:jc w:val="center"/>
+      </w:pPr>
+      <w:r>
         <w:lastRenderedPageBreak/>
-        <w:t>KIỂM THỬ HỆ THỐNG</w:t>
+        <w:drawing>
+          <wp:inline distT="0" distB="0" distL="0" distR="0" wp14:anchorId="285CF875" wp14:editId="403EF5AD">
+            <wp:extent cx="5760720" cy="996950"/>
+            <wp:effectExtent l="0" t="0" r="0" b="0"/>
+            <wp:docPr id="1805867356" name="Picture 1"/>
+            <wp:cNvGraphicFramePr>
+              <a:graphicFrameLocks xmlns:a="http://schemas.openxmlformats.org/drawingml/2006/main" noChangeAspect="1"/>
+            </wp:cNvGraphicFramePr>
+            <a:graphic xmlns:a="http://schemas.openxmlformats.org/drawingml/2006/main">
+              <a:graphicData uri="http://schemas.openxmlformats.org/drawingml/2006/picture">
+                <pic:pic xmlns:pic="http://schemas.openxmlformats.org/drawingml/2006/picture">
+                  <pic:nvPicPr>
+                    <pic:cNvPr id="1805867356" name=""/>
+                    <pic:cNvPicPr/>
+                  </pic:nvPicPr>
+                  <pic:blipFill>
+                    <a:blip r:embed="rId27"/>
+                    <a:stretch>
+                      <a:fillRect/>
+                    </a:stretch>
+                  </pic:blipFill>
+                  <pic:spPr>
+                    <a:xfrm>
+                      <a:off x="0" y="0"/>
+                      <a:ext cx="5760720" cy="996950"/>
+                    </a:xfrm>
+                    <a:prstGeom prst="rect">
+                      <a:avLst/>
+                    </a:prstGeom>
+                  </pic:spPr>
+                </pic:pic>
+              </a:graphicData>
+            </a:graphic>
+          </wp:inline>
+        </w:drawing>
+      </w:r>
+    </w:p>
+    <w:p>
+      <w:pPr>
+        <w:pStyle w:val="Heading3"/>
+      </w:pPr>
+      <w:r>
+        <w:t>Kết quả khởi chạy</w:t>
+      </w:r>
+    </w:p>
+    <w:p>
+      <w:pPr>
+        <w:pStyle w:val="Heading4"/>
+      </w:pPr>
+      <w:r>
+        <w:t>NameNode</w:t>
+      </w:r>
+      <w:r>
+        <w:rPr>
+          <w:lang w:val="vi-VN"/>
+        </w:rPr>
+        <w:t xml:space="preserve"> (anh24162006-master)</w:t>
       </w:r>
     </w:p>
     <w:p>
       <w:pPr>
         <w:pStyle w:val="Nidung"/>
+        <w:jc w:val="center"/>
+      </w:pPr>
+      <w:r>
         <w:rPr>
           <w:lang w:val="vi-VN"/>
         </w:rPr>
-      </w:pPr>
+        <w:drawing>
+          <wp:inline distT="0" distB="0" distL="0" distR="0" wp14:anchorId="1F070BDB" wp14:editId="6C5E98B6">
+            <wp:extent cx="4092295" cy="2987299"/>
+            <wp:effectExtent l="0" t="0" r="3810" b="3810"/>
+            <wp:docPr id="1247554636" name="Picture 1"/>
+            <wp:cNvGraphicFramePr>
+              <a:graphicFrameLocks xmlns:a="http://schemas.openxmlformats.org/drawingml/2006/main" noChangeAspect="1"/>
+            </wp:cNvGraphicFramePr>
+            <a:graphic xmlns:a="http://schemas.openxmlformats.org/drawingml/2006/main">
+              <a:graphicData uri="http://schemas.openxmlformats.org/drawingml/2006/picture">
+                <pic:pic xmlns:pic="http://schemas.openxmlformats.org/drawingml/2006/picture">
+                  <pic:nvPicPr>
+                    <pic:cNvPr id="1247554636" name=""/>
+                    <pic:cNvPicPr/>
+                  </pic:nvPicPr>
+                  <pic:blipFill>
+                    <a:blip r:embed="rId28"/>
+                    <a:stretch>
+                      <a:fillRect/>
+                    </a:stretch>
+                  </pic:blipFill>
+                  <pic:spPr>
+                    <a:xfrm>
+                      <a:off x="0" y="0"/>
+                      <a:ext cx="4092295" cy="2987299"/>
+                    </a:xfrm>
+                    <a:prstGeom prst="rect">
+                      <a:avLst/>
+                    </a:prstGeom>
+                  </pic:spPr>
+                </pic:pic>
+              </a:graphicData>
+            </a:graphic>
+          </wp:inline>
+        </w:drawing>
+      </w:r>
     </w:p>
     <w:p>
       <w:pPr>
         <w:pStyle w:val="Nidung"/>
+      </w:pPr>
+    </w:p>
+    <w:p>
+      <w:pPr>
+        <w:pStyle w:val="Heading4"/>
+      </w:pPr>
+      <w:r>
+        <w:t>DataNode (hoc-slave1)</w:t>
+      </w:r>
+    </w:p>
+    <w:p>
+      <w:pPr>
+        <w:pStyle w:val="Nidung"/>
+        <w:jc w:val="center"/>
+      </w:pPr>
+      <w:r>
         <w:rPr>
           <w:lang w:val="vi-VN"/>
         </w:rPr>
-      </w:pPr>
+        <w:drawing>
+          <wp:inline distT="0" distB="0" distL="0" distR="0" wp14:anchorId="33E47864" wp14:editId="5EEB6FF7">
+            <wp:extent cx="2911092" cy="2568163"/>
+            <wp:effectExtent l="0" t="0" r="3810" b="3810"/>
+            <wp:docPr id="698760555" name="Picture 1"/>
+            <wp:cNvGraphicFramePr>
+              <a:graphicFrameLocks xmlns:a="http://schemas.openxmlformats.org/drawingml/2006/main" noChangeAspect="1"/>
+            </wp:cNvGraphicFramePr>
+            <a:graphic xmlns:a="http://schemas.openxmlformats.org/drawingml/2006/main">
+              <a:graphicData uri="http://schemas.openxmlformats.org/drawingml/2006/picture">
+                <pic:pic xmlns:pic="http://schemas.openxmlformats.org/drawingml/2006/picture">
+                  <pic:nvPicPr>
+                    <pic:cNvPr id="698760555" name=""/>
+                    <pic:cNvPicPr/>
+                  </pic:nvPicPr>
+                  <pic:blipFill>
+                    <a:blip r:embed="rId29"/>
+                    <a:stretch>
+                      <a:fillRect/>
+                    </a:stretch>
+                  </pic:blipFill>
+                  <pic:spPr>
+                    <a:xfrm>
+                      <a:off x="0" y="0"/>
+                      <a:ext cx="2911092" cy="2568163"/>
+                    </a:xfrm>
+                    <a:prstGeom prst="rect">
+                      <a:avLst/>
+                    </a:prstGeom>
+                  </pic:spPr>
+                </pic:pic>
+              </a:graphicData>
+            </a:graphic>
+          </wp:inline>
+        </w:drawing>
+      </w:r>
     </w:p>
     <w:p>
       <w:pPr>
         <w:pStyle w:val="Nidung"/>
+      </w:pPr>
+    </w:p>
+    <w:p>
+      <w:pPr>
+        <w:pStyle w:val="Heading4"/>
+      </w:pPr>
+      <w:r>
+        <w:lastRenderedPageBreak/>
+        <w:t>DataNode (nguyen-slave2)</w:t>
+      </w:r>
+    </w:p>
+    <w:p>
+      <w:pPr>
+        <w:pStyle w:val="Nidung"/>
+        <w:jc w:val="center"/>
+      </w:pPr>
+      <w:r>
         <w:rPr>
           <w:lang w:val="vi-VN"/>
         </w:rPr>
-      </w:pPr>
+        <w:drawing>
+          <wp:inline distT="0" distB="0" distL="0" distR="0" wp14:anchorId="3485D7E3" wp14:editId="0DB7E59A">
+            <wp:extent cx="2857748" cy="2918713"/>
+            <wp:effectExtent l="0" t="0" r="0" b="0"/>
+            <wp:docPr id="1344992539" name="Picture 1"/>
+            <wp:cNvGraphicFramePr>
+              <a:graphicFrameLocks xmlns:a="http://schemas.openxmlformats.org/drawingml/2006/main" noChangeAspect="1"/>
+            </wp:cNvGraphicFramePr>
+            <a:graphic xmlns:a="http://schemas.openxmlformats.org/drawingml/2006/main">
+              <a:graphicData uri="http://schemas.openxmlformats.org/drawingml/2006/picture">
+                <pic:pic xmlns:pic="http://schemas.openxmlformats.org/drawingml/2006/picture">
+                  <pic:nvPicPr>
+                    <pic:cNvPr id="1344992539" name=""/>
+                    <pic:cNvPicPr/>
+                  </pic:nvPicPr>
+                  <pic:blipFill>
+                    <a:blip r:embed="rId30"/>
+                    <a:stretch>
+                      <a:fillRect/>
+                    </a:stretch>
+                  </pic:blipFill>
+                  <pic:spPr>
+                    <a:xfrm>
+                      <a:off x="0" y="0"/>
+                      <a:ext cx="2857748" cy="2918713"/>
+                    </a:xfrm>
+                    <a:prstGeom prst="rect">
+                      <a:avLst/>
+                    </a:prstGeom>
+                  </pic:spPr>
+                </pic:pic>
+              </a:graphicData>
+            </a:graphic>
+          </wp:inline>
+        </w:drawing>
+      </w:r>
     </w:p>
     <w:p>
       <w:pPr>
         <w:pStyle w:val="Nidung"/>
+      </w:pPr>
+    </w:p>
+    <w:p>
+      <w:pPr>
+        <w:pStyle w:val="Heading4"/>
+      </w:pPr>
+      <w:r>
+        <w:t>DataNode (anh24133004-slave3)</w:t>
+      </w:r>
+    </w:p>
+    <w:p>
+      <w:pPr>
+        <w:pStyle w:val="Nidung"/>
+        <w:jc w:val="center"/>
         <w:rPr>
           <w:lang w:val="vi-VN"/>
         </w:rPr>
       </w:pPr>
+      <w:r>
+        <w:rPr>
+          <w:lang w:val="vi-VN"/>
+        </w:rPr>
+        <w:drawing>
+          <wp:inline distT="0" distB="0" distL="0" distR="0" wp14:anchorId="214D2537" wp14:editId="27997B2F">
+            <wp:extent cx="2865368" cy="2636748"/>
+            <wp:effectExtent l="0" t="0" r="0" b="0"/>
+            <wp:docPr id="652597493" name="Picture 1"/>
+            <wp:cNvGraphicFramePr>
+              <a:graphicFrameLocks xmlns:a="http://schemas.openxmlformats.org/drawingml/2006/main" noChangeAspect="1"/>
+            </wp:cNvGraphicFramePr>
+            <a:graphic xmlns:a="http://schemas.openxmlformats.org/drawingml/2006/main">
+              <a:graphicData uri="http://schemas.openxmlformats.org/drawingml/2006/picture">
+                <pic:pic xmlns:pic="http://schemas.openxmlformats.org/drawingml/2006/picture">
+                  <pic:nvPicPr>
+                    <pic:cNvPr id="652597493" name=""/>
+                    <pic:cNvPicPr/>
+                  </pic:nvPicPr>
+                  <pic:blipFill>
+                    <a:blip r:embed="rId31"/>
+                    <a:stretch>
+                      <a:fillRect/>
+                    </a:stretch>
+                  </pic:blipFill>
+                  <pic:spPr>
+                    <a:xfrm>
+                      <a:off x="0" y="0"/>
+                      <a:ext cx="2865368" cy="2636748"/>
+                    </a:xfrm>
+                    <a:prstGeom prst="rect">
+                      <a:avLst/>
+                    </a:prstGeom>
+                  </pic:spPr>
+                </pic:pic>
+              </a:graphicData>
+            </a:graphic>
+          </wp:inline>
+        </w:drawing>
+      </w:r>
     </w:p>
     <w:p>
       <w:pPr>
         <w:pStyle w:val="Nidung"/>
+      </w:pPr>
+    </w:p>
+    <w:p>
+      <w:pPr>
+        <w:pStyle w:val="Heading3"/>
+        <w:rPr>
+          <w:lang w:val="en-US"/>
+        </w:rPr>
+      </w:pPr>
+      <w:r>
+        <w:t>Chạy thử chương trình WordCount</w:t>
+      </w:r>
+    </w:p>
+    <w:p>
+      <w:pPr>
+        <w:pStyle w:val="Heading4"/>
         <w:rPr>
           <w:lang w:val="vi-VN"/>
         </w:rPr>
       </w:pPr>
-    </w:p>
-    <w:p>
-      <w:pPr>
-        <w:rPr>
-          <w:rFonts w:ascii="Times New Roman" w:eastAsiaTheme="majorEastAsia" w:hAnsi="Times New Roman" w:cs="Times New Roman"/>
-          <w:b/>
-          <w:caps/>
-          <w:sz w:val="28"/>
-          <w:szCs w:val="40"/>
+      <w:r>
+        <w:t>Tạo</w:t>
+      </w:r>
+      <w:r>
+        <w:rPr>
+          <w:lang w:val="vi-VN"/>
+        </w:rPr>
+        <w:t xml:space="preserve"> file test.sh</w:t>
+      </w:r>
+    </w:p>
+    <w:p>
+      <w:pPr>
+        <w:pBdr>
+          <w:top w:val="single" w:sz="4" w:space="1" w:color="auto"/>
+          <w:left w:val="single" w:sz="4" w:space="4" w:color="auto"/>
+          <w:bottom w:val="single" w:sz="4" w:space="1" w:color="auto"/>
+          <w:right w:val="single" w:sz="4" w:space="4" w:color="auto"/>
+        </w:pBdr>
+        <w:shd w:val="clear" w:color="auto" w:fill="FFFFFF"/>
+        <w:spacing w:after="0" w:line="285" w:lineRule="atLeast"/>
+        <w:rPr>
+          <w:rFonts w:ascii="Consolas" w:eastAsia="Times New Roman" w:hAnsi="Consolas" w:cs="Times New Roman"/>
+          <w:noProof w:val="0"/>
+          <w:color w:val="000000"/>
+          <w:kern w:val="0"/>
+          <w:sz w:val="21"/>
+          <w:szCs w:val="21"/>
+          <w14:ligatures w14:val="none"/>
+        </w:rPr>
+      </w:pPr>
+      <w:proofErr w:type="gramStart"/>
+      <w:r>
+        <w:rPr>
+          <w:rFonts w:ascii="Consolas" w:eastAsia="Times New Roman" w:hAnsi="Consolas" w:cs="Times New Roman"/>
+          <w:noProof w:val="0"/>
+          <w:color w:val="008000"/>
+          <w:kern w:val="0"/>
+          <w:sz w:val="21"/>
+          <w:szCs w:val="21"/>
+          <w14:ligatures w14:val="none"/>
+        </w:rPr>
+        <w:t>#!/</w:t>
+      </w:r>
+      <w:proofErr w:type="gramEnd"/>
+      <w:r>
+        <w:rPr>
+          <w:rFonts w:ascii="Consolas" w:eastAsia="Times New Roman" w:hAnsi="Consolas" w:cs="Times New Roman"/>
+          <w:noProof w:val="0"/>
+          <w:color w:val="008000"/>
+          <w:kern w:val="0"/>
+          <w:sz w:val="21"/>
+          <w:szCs w:val="21"/>
+          <w14:ligatures w14:val="none"/>
+        </w:rPr>
+        <w:t>bin/bash</w:t>
+      </w:r>
+    </w:p>
+    <w:p>
+      <w:pPr>
+        <w:pBdr>
+          <w:top w:val="single" w:sz="4" w:space="1" w:color="auto"/>
+          <w:left w:val="single" w:sz="4" w:space="4" w:color="auto"/>
+          <w:bottom w:val="single" w:sz="4" w:space="1" w:color="auto"/>
+          <w:right w:val="single" w:sz="4" w:space="4" w:color="auto"/>
+        </w:pBdr>
+        <w:shd w:val="clear" w:color="auto" w:fill="FFFFFF"/>
+        <w:spacing w:after="0" w:line="285" w:lineRule="atLeast"/>
+        <w:rPr>
+          <w:rFonts w:ascii="Consolas" w:eastAsia="Times New Roman" w:hAnsi="Consolas" w:cs="Times New Roman"/>
+          <w:noProof w:val="0"/>
+          <w:color w:val="000000"/>
+          <w:kern w:val="0"/>
+          <w:sz w:val="21"/>
+          <w:szCs w:val="21"/>
+          <w14:ligatures w14:val="none"/>
+        </w:rPr>
+      </w:pPr>
+      <w:r>
+        <w:rPr>
+          <w:rFonts w:ascii="Consolas" w:eastAsia="Times New Roman" w:hAnsi="Consolas" w:cs="Times New Roman"/>
+          <w:noProof w:val="0"/>
+          <w:color w:val="008000"/>
+          <w:kern w:val="0"/>
+          <w:sz w:val="21"/>
+          <w:szCs w:val="21"/>
+          <w14:ligatures w14:val="none"/>
+        </w:rPr>
+        <w:t xml:space="preserve"># </w:t>
+      </w:r>
+      <w:proofErr w:type="spellStart"/>
+      <w:r>
+        <w:rPr>
+          <w:rFonts w:ascii="Consolas" w:eastAsia="Times New Roman" w:hAnsi="Consolas" w:cs="Times New Roman"/>
+          <w:noProof w:val="0"/>
+          <w:color w:val="008000"/>
+          <w:kern w:val="0"/>
+          <w:sz w:val="21"/>
+          <w:szCs w:val="21"/>
+          <w14:ligatures w14:val="none"/>
+        </w:rPr>
+        <w:t>Kiểm</w:t>
+      </w:r>
+      <w:proofErr w:type="spellEnd"/>
+      <w:r>
+        <w:rPr>
+          <w:rFonts w:ascii="Consolas" w:eastAsia="Times New Roman" w:hAnsi="Consolas" w:cs="Times New Roman"/>
+          <w:noProof w:val="0"/>
+          <w:color w:val="008000"/>
+          <w:kern w:val="0"/>
+          <w:sz w:val="21"/>
+          <w:szCs w:val="21"/>
+          <w14:ligatures w14:val="none"/>
+        </w:rPr>
+        <w:t xml:space="preserve"> </w:t>
+      </w:r>
+      <w:proofErr w:type="spellStart"/>
+      <w:r>
+        <w:rPr>
+          <w:rFonts w:ascii="Consolas" w:eastAsia="Times New Roman" w:hAnsi="Consolas" w:cs="Times New Roman"/>
+          <w:noProof w:val="0"/>
+          <w:color w:val="008000"/>
+          <w:kern w:val="0"/>
+          <w:sz w:val="21"/>
+          <w:szCs w:val="21"/>
+          <w14:ligatures w14:val="none"/>
+        </w:rPr>
+        <w:t>thử</w:t>
+      </w:r>
+      <w:proofErr w:type="spellEnd"/>
+      <w:r>
+        <w:rPr>
+          <w:rFonts w:ascii="Consolas" w:eastAsia="Times New Roman" w:hAnsi="Consolas" w:cs="Times New Roman"/>
+          <w:noProof w:val="0"/>
+          <w:color w:val="008000"/>
+          <w:kern w:val="0"/>
+          <w:sz w:val="21"/>
+          <w:szCs w:val="21"/>
+          <w14:ligatures w14:val="none"/>
+        </w:rPr>
+        <w:t xml:space="preserve"> </w:t>
+      </w:r>
+      <w:proofErr w:type="spellStart"/>
+      <w:r>
+        <w:rPr>
+          <w:rFonts w:ascii="Consolas" w:eastAsia="Times New Roman" w:hAnsi="Consolas" w:cs="Times New Roman"/>
+          <w:noProof w:val="0"/>
+          <w:color w:val="008000"/>
+          <w:kern w:val="0"/>
+          <w:sz w:val="21"/>
+          <w:szCs w:val="21"/>
+          <w14:ligatures w14:val="none"/>
+        </w:rPr>
+        <w:t>cụm</w:t>
+      </w:r>
+      <w:proofErr w:type="spellEnd"/>
+      <w:r>
+        <w:rPr>
+          <w:rFonts w:ascii="Consolas" w:eastAsia="Times New Roman" w:hAnsi="Consolas" w:cs="Times New Roman"/>
+          <w:noProof w:val="0"/>
+          <w:color w:val="008000"/>
+          <w:kern w:val="0"/>
+          <w:sz w:val="21"/>
+          <w:szCs w:val="21"/>
+          <w14:ligatures w14:val="none"/>
+        </w:rPr>
+        <w:t xml:space="preserve"> Hadoop </w:t>
+      </w:r>
+      <w:proofErr w:type="spellStart"/>
+      <w:r>
+        <w:rPr>
+          <w:rFonts w:ascii="Consolas" w:eastAsia="Times New Roman" w:hAnsi="Consolas" w:cs="Times New Roman"/>
+          <w:noProof w:val="0"/>
+          <w:color w:val="008000"/>
+          <w:kern w:val="0"/>
+          <w:sz w:val="21"/>
+          <w:szCs w:val="21"/>
+          <w14:ligatures w14:val="none"/>
+        </w:rPr>
+        <w:t>bằng</w:t>
+      </w:r>
+      <w:proofErr w:type="spellEnd"/>
+      <w:r>
+        <w:rPr>
+          <w:rFonts w:ascii="Consolas" w:eastAsia="Times New Roman" w:hAnsi="Consolas" w:cs="Times New Roman"/>
+          <w:noProof w:val="0"/>
+          <w:color w:val="008000"/>
+          <w:kern w:val="0"/>
+          <w:sz w:val="21"/>
+          <w:szCs w:val="21"/>
+          <w14:ligatures w14:val="none"/>
+        </w:rPr>
+        <w:t xml:space="preserve"> </w:t>
+      </w:r>
+      <w:proofErr w:type="spellStart"/>
+      <w:r>
+        <w:rPr>
+          <w:rFonts w:ascii="Consolas" w:eastAsia="Times New Roman" w:hAnsi="Consolas" w:cs="Times New Roman"/>
+          <w:noProof w:val="0"/>
+          <w:color w:val="008000"/>
+          <w:kern w:val="0"/>
+          <w:sz w:val="21"/>
+          <w:szCs w:val="21"/>
+          <w14:ligatures w14:val="none"/>
+        </w:rPr>
+        <w:t>chương</w:t>
+      </w:r>
+      <w:proofErr w:type="spellEnd"/>
+      <w:r>
+        <w:rPr>
+          <w:rFonts w:ascii="Consolas" w:eastAsia="Times New Roman" w:hAnsi="Consolas" w:cs="Times New Roman"/>
+          <w:noProof w:val="0"/>
+          <w:color w:val="008000"/>
+          <w:kern w:val="0"/>
+          <w:sz w:val="21"/>
+          <w:szCs w:val="21"/>
+          <w14:ligatures w14:val="none"/>
+        </w:rPr>
+        <w:t xml:space="preserve"> </w:t>
+      </w:r>
+      <w:proofErr w:type="spellStart"/>
+      <w:r>
+        <w:rPr>
+          <w:rFonts w:ascii="Consolas" w:eastAsia="Times New Roman" w:hAnsi="Consolas" w:cs="Times New Roman"/>
+          <w:noProof w:val="0"/>
+          <w:color w:val="008000"/>
+          <w:kern w:val="0"/>
+          <w:sz w:val="21"/>
+          <w:szCs w:val="21"/>
+          <w14:ligatures w14:val="none"/>
+        </w:rPr>
+        <w:t>trình</w:t>
+      </w:r>
+      <w:proofErr w:type="spellEnd"/>
+      <w:r>
+        <w:rPr>
+          <w:rFonts w:ascii="Consolas" w:eastAsia="Times New Roman" w:hAnsi="Consolas" w:cs="Times New Roman"/>
+          <w:noProof w:val="0"/>
+          <w:color w:val="008000"/>
+          <w:kern w:val="0"/>
+          <w:sz w:val="21"/>
+          <w:szCs w:val="21"/>
+          <w14:ligatures w14:val="none"/>
+        </w:rPr>
+        <w:t xml:space="preserve"> MapReduce </w:t>
+      </w:r>
+      <w:proofErr w:type="spellStart"/>
+      <w:r>
+        <w:rPr>
+          <w:rFonts w:ascii="Consolas" w:eastAsia="Times New Roman" w:hAnsi="Consolas" w:cs="Times New Roman"/>
+          <w:noProof w:val="0"/>
+          <w:color w:val="008000"/>
+          <w:kern w:val="0"/>
+          <w:sz w:val="21"/>
+          <w:szCs w:val="21"/>
+          <w14:ligatures w14:val="none"/>
+        </w:rPr>
+        <w:t>WordCount</w:t>
+      </w:r>
+      <w:proofErr w:type="spellEnd"/>
+      <w:r>
+        <w:rPr>
+          <w:rFonts w:ascii="Consolas" w:eastAsia="Times New Roman" w:hAnsi="Consolas" w:cs="Times New Roman"/>
+          <w:noProof w:val="0"/>
+          <w:color w:val="008000"/>
+          <w:kern w:val="0"/>
+          <w:sz w:val="21"/>
+          <w:szCs w:val="21"/>
+          <w14:ligatures w14:val="none"/>
+        </w:rPr>
+        <w:t xml:space="preserve"> </w:t>
+      </w:r>
+      <w:proofErr w:type="spellStart"/>
+      <w:r>
+        <w:rPr>
+          <w:rFonts w:ascii="Consolas" w:eastAsia="Times New Roman" w:hAnsi="Consolas" w:cs="Times New Roman"/>
+          <w:noProof w:val="0"/>
+          <w:color w:val="008000"/>
+          <w:kern w:val="0"/>
+          <w:sz w:val="21"/>
+          <w:szCs w:val="21"/>
+          <w14:ligatures w14:val="none"/>
+        </w:rPr>
+        <w:t>mẫu</w:t>
+      </w:r>
+      <w:proofErr w:type="spellEnd"/>
+    </w:p>
+    <w:p>
+      <w:pPr>
+        <w:pBdr>
+          <w:top w:val="single" w:sz="4" w:space="1" w:color="auto"/>
+          <w:left w:val="single" w:sz="4" w:space="4" w:color="auto"/>
+          <w:bottom w:val="single" w:sz="4" w:space="1" w:color="auto"/>
+          <w:right w:val="single" w:sz="4" w:space="4" w:color="auto"/>
+        </w:pBdr>
+        <w:shd w:val="clear" w:color="auto" w:fill="FFFFFF"/>
+        <w:spacing w:after="0" w:line="285" w:lineRule="atLeast"/>
+        <w:rPr>
+          <w:rFonts w:ascii="Consolas" w:eastAsia="Times New Roman" w:hAnsi="Consolas" w:cs="Times New Roman"/>
+          <w:noProof w:val="0"/>
+          <w:color w:val="000000"/>
+          <w:kern w:val="0"/>
+          <w:sz w:val="21"/>
+          <w:szCs w:val="21"/>
+          <w14:ligatures w14:val="none"/>
+        </w:rPr>
+      </w:pPr>
+    </w:p>
+    <w:p>
+      <w:pPr>
+        <w:pBdr>
+          <w:top w:val="single" w:sz="4" w:space="1" w:color="auto"/>
+          <w:left w:val="single" w:sz="4" w:space="4" w:color="auto"/>
+          <w:bottom w:val="single" w:sz="4" w:space="1" w:color="auto"/>
+          <w:right w:val="single" w:sz="4" w:space="4" w:color="auto"/>
+        </w:pBdr>
+        <w:shd w:val="clear" w:color="auto" w:fill="FFFFFF"/>
+        <w:spacing w:after="0" w:line="285" w:lineRule="atLeast"/>
+        <w:rPr>
+          <w:rFonts w:ascii="Consolas" w:eastAsia="Times New Roman" w:hAnsi="Consolas" w:cs="Times New Roman"/>
+          <w:noProof w:val="0"/>
+          <w:color w:val="000000"/>
+          <w:kern w:val="0"/>
+          <w:sz w:val="21"/>
+          <w:szCs w:val="21"/>
+          <w14:ligatures w14:val="none"/>
+        </w:rPr>
+      </w:pPr>
+      <w:r>
+        <w:rPr>
+          <w:rFonts w:ascii="Consolas" w:eastAsia="Times New Roman" w:hAnsi="Consolas" w:cs="Times New Roman"/>
+          <w:noProof w:val="0"/>
+          <w:color w:val="008000"/>
+          <w:kern w:val="0"/>
+          <w:sz w:val="21"/>
+          <w:szCs w:val="21"/>
+          <w14:ligatures w14:val="none"/>
+        </w:rPr>
+        <w:t xml:space="preserve"># 1. </w:t>
+      </w:r>
+      <w:proofErr w:type="spellStart"/>
+      <w:r>
+        <w:rPr>
+          <w:rFonts w:ascii="Consolas" w:eastAsia="Times New Roman" w:hAnsi="Consolas" w:cs="Times New Roman"/>
+          <w:noProof w:val="0"/>
+          <w:color w:val="008000"/>
+          <w:kern w:val="0"/>
+          <w:sz w:val="21"/>
+          <w:szCs w:val="21"/>
+          <w14:ligatures w14:val="none"/>
+        </w:rPr>
+        <w:t>Tạo</w:t>
+      </w:r>
+      <w:proofErr w:type="spellEnd"/>
+      <w:r>
+        <w:rPr>
+          <w:rFonts w:ascii="Consolas" w:eastAsia="Times New Roman" w:hAnsi="Consolas" w:cs="Times New Roman"/>
+          <w:noProof w:val="0"/>
+          <w:color w:val="008000"/>
+          <w:kern w:val="0"/>
+          <w:sz w:val="21"/>
+          <w:szCs w:val="21"/>
+          <w14:ligatures w14:val="none"/>
+        </w:rPr>
+        <w:t xml:space="preserve"> </w:t>
+      </w:r>
+      <w:proofErr w:type="spellStart"/>
+      <w:r>
+        <w:rPr>
+          <w:rFonts w:ascii="Consolas" w:eastAsia="Times New Roman" w:hAnsi="Consolas" w:cs="Times New Roman"/>
+          <w:noProof w:val="0"/>
+          <w:color w:val="008000"/>
+          <w:kern w:val="0"/>
+          <w:sz w:val="21"/>
+          <w:szCs w:val="21"/>
+          <w14:ligatures w14:val="none"/>
+        </w:rPr>
+        <w:t>thư</w:t>
+      </w:r>
+      <w:proofErr w:type="spellEnd"/>
+      <w:r>
+        <w:rPr>
+          <w:rFonts w:ascii="Consolas" w:eastAsia="Times New Roman" w:hAnsi="Consolas" w:cs="Times New Roman"/>
+          <w:noProof w:val="0"/>
+          <w:color w:val="008000"/>
+          <w:kern w:val="0"/>
+          <w:sz w:val="21"/>
+          <w:szCs w:val="21"/>
+          <w14:ligatures w14:val="none"/>
+        </w:rPr>
+        <w:t xml:space="preserve"> </w:t>
+      </w:r>
+      <w:proofErr w:type="spellStart"/>
+      <w:r>
+        <w:rPr>
+          <w:rFonts w:ascii="Consolas" w:eastAsia="Times New Roman" w:hAnsi="Consolas" w:cs="Times New Roman"/>
+          <w:noProof w:val="0"/>
+          <w:color w:val="008000"/>
+          <w:kern w:val="0"/>
+          <w:sz w:val="21"/>
+          <w:szCs w:val="21"/>
+          <w14:ligatures w14:val="none"/>
+        </w:rPr>
+        <w:t>mục</w:t>
+      </w:r>
+      <w:proofErr w:type="spellEnd"/>
+      <w:r>
+        <w:rPr>
+          <w:rFonts w:ascii="Consolas" w:eastAsia="Times New Roman" w:hAnsi="Consolas" w:cs="Times New Roman"/>
+          <w:noProof w:val="0"/>
+          <w:color w:val="008000"/>
+          <w:kern w:val="0"/>
+          <w:sz w:val="21"/>
+          <w:szCs w:val="21"/>
+          <w14:ligatures w14:val="none"/>
+        </w:rPr>
+        <w:t xml:space="preserve"> </w:t>
+      </w:r>
+      <w:proofErr w:type="spellStart"/>
+      <w:r>
+        <w:rPr>
+          <w:rFonts w:ascii="Consolas" w:eastAsia="Times New Roman" w:hAnsi="Consolas" w:cs="Times New Roman"/>
+          <w:noProof w:val="0"/>
+          <w:color w:val="008000"/>
+          <w:kern w:val="0"/>
+          <w:sz w:val="21"/>
+          <w:szCs w:val="21"/>
+          <w14:ligatures w14:val="none"/>
+        </w:rPr>
+        <w:t>và</w:t>
+      </w:r>
+      <w:proofErr w:type="spellEnd"/>
+      <w:r>
+        <w:rPr>
+          <w:rFonts w:ascii="Consolas" w:eastAsia="Times New Roman" w:hAnsi="Consolas" w:cs="Times New Roman"/>
+          <w:noProof w:val="0"/>
+          <w:color w:val="008000"/>
+          <w:kern w:val="0"/>
+          <w:sz w:val="21"/>
+          <w:szCs w:val="21"/>
+          <w14:ligatures w14:val="none"/>
+        </w:rPr>
+        <w:t xml:space="preserve"> file </w:t>
+      </w:r>
+      <w:proofErr w:type="spellStart"/>
+      <w:r>
+        <w:rPr>
+          <w:rFonts w:ascii="Consolas" w:eastAsia="Times New Roman" w:hAnsi="Consolas" w:cs="Times New Roman"/>
+          <w:noProof w:val="0"/>
+          <w:color w:val="008000"/>
+          <w:kern w:val="0"/>
+          <w:sz w:val="21"/>
+          <w:szCs w:val="21"/>
+          <w14:ligatures w14:val="none"/>
+        </w:rPr>
+        <w:t>dữ</w:t>
+      </w:r>
+      <w:proofErr w:type="spellEnd"/>
+      <w:r>
+        <w:rPr>
+          <w:rFonts w:ascii="Consolas" w:eastAsia="Times New Roman" w:hAnsi="Consolas" w:cs="Times New Roman"/>
+          <w:noProof w:val="0"/>
+          <w:color w:val="008000"/>
+          <w:kern w:val="0"/>
+          <w:sz w:val="21"/>
+          <w:szCs w:val="21"/>
+          <w14:ligatures w14:val="none"/>
+        </w:rPr>
+        <w:t xml:space="preserve"> </w:t>
+      </w:r>
+      <w:proofErr w:type="spellStart"/>
+      <w:r>
+        <w:rPr>
+          <w:rFonts w:ascii="Consolas" w:eastAsia="Times New Roman" w:hAnsi="Consolas" w:cs="Times New Roman"/>
+          <w:noProof w:val="0"/>
+          <w:color w:val="008000"/>
+          <w:kern w:val="0"/>
+          <w:sz w:val="21"/>
+          <w:szCs w:val="21"/>
+          <w14:ligatures w14:val="none"/>
+        </w:rPr>
+        <w:t>liệu</w:t>
+      </w:r>
+      <w:proofErr w:type="spellEnd"/>
+      <w:r>
+        <w:rPr>
+          <w:rFonts w:ascii="Consolas" w:eastAsia="Times New Roman" w:hAnsi="Consolas" w:cs="Times New Roman"/>
+          <w:noProof w:val="0"/>
+          <w:color w:val="008000"/>
+          <w:kern w:val="0"/>
+          <w:sz w:val="21"/>
+          <w:szCs w:val="21"/>
+          <w14:ligatures w14:val="none"/>
+        </w:rPr>
+        <w:t xml:space="preserve"> </w:t>
+      </w:r>
+      <w:proofErr w:type="spellStart"/>
+      <w:r>
+        <w:rPr>
+          <w:rFonts w:ascii="Consolas" w:eastAsia="Times New Roman" w:hAnsi="Consolas" w:cs="Times New Roman"/>
+          <w:noProof w:val="0"/>
+          <w:color w:val="008000"/>
+          <w:kern w:val="0"/>
+          <w:sz w:val="21"/>
+          <w:szCs w:val="21"/>
+          <w14:ligatures w14:val="none"/>
+        </w:rPr>
+        <w:t>đầu</w:t>
+      </w:r>
+      <w:proofErr w:type="spellEnd"/>
+      <w:r>
+        <w:rPr>
+          <w:rFonts w:ascii="Consolas" w:eastAsia="Times New Roman" w:hAnsi="Consolas" w:cs="Times New Roman"/>
+          <w:noProof w:val="0"/>
+          <w:color w:val="008000"/>
+          <w:kern w:val="0"/>
+          <w:sz w:val="21"/>
+          <w:szCs w:val="21"/>
+          <w14:ligatures w14:val="none"/>
+        </w:rPr>
+        <w:t xml:space="preserve"> </w:t>
+      </w:r>
+      <w:proofErr w:type="spellStart"/>
+      <w:r>
+        <w:rPr>
+          <w:rFonts w:ascii="Consolas" w:eastAsia="Times New Roman" w:hAnsi="Consolas" w:cs="Times New Roman"/>
+          <w:noProof w:val="0"/>
+          <w:color w:val="008000"/>
+          <w:kern w:val="0"/>
+          <w:sz w:val="21"/>
+          <w:szCs w:val="21"/>
+          <w14:ligatures w14:val="none"/>
+        </w:rPr>
+        <w:t>vào</w:t>
+      </w:r>
+      <w:proofErr w:type="spellEnd"/>
+      <w:r>
+        <w:rPr>
+          <w:rFonts w:ascii="Consolas" w:eastAsia="Times New Roman" w:hAnsi="Consolas" w:cs="Times New Roman"/>
+          <w:noProof w:val="0"/>
+          <w:color w:val="008000"/>
+          <w:kern w:val="0"/>
+          <w:sz w:val="21"/>
+          <w:szCs w:val="21"/>
+          <w14:ligatures w14:val="none"/>
+        </w:rPr>
+        <w:t xml:space="preserve"> ở local</w:t>
+      </w:r>
+    </w:p>
+    <w:p>
+      <w:pPr>
+        <w:pBdr>
+          <w:top w:val="single" w:sz="4" w:space="1" w:color="auto"/>
+          <w:left w:val="single" w:sz="4" w:space="4" w:color="auto"/>
+          <w:bottom w:val="single" w:sz="4" w:space="1" w:color="auto"/>
+          <w:right w:val="single" w:sz="4" w:space="4" w:color="auto"/>
+        </w:pBdr>
+        <w:shd w:val="clear" w:color="auto" w:fill="FFFFFF"/>
+        <w:spacing w:after="0" w:line="285" w:lineRule="atLeast"/>
+        <w:rPr>
+          <w:rFonts w:ascii="Consolas" w:eastAsia="Times New Roman" w:hAnsi="Consolas" w:cs="Times New Roman"/>
+          <w:noProof w:val="0"/>
+          <w:color w:val="000000"/>
+          <w:kern w:val="0"/>
+          <w:sz w:val="21"/>
+          <w:szCs w:val="21"/>
+          <w14:ligatures w14:val="none"/>
+        </w:rPr>
+      </w:pPr>
+      <w:proofErr w:type="spellStart"/>
+      <w:r>
+        <w:rPr>
+          <w:rFonts w:ascii="Consolas" w:eastAsia="Times New Roman" w:hAnsi="Consolas" w:cs="Times New Roman"/>
+          <w:noProof w:val="0"/>
+          <w:color w:val="795E26"/>
+          <w:kern w:val="0"/>
+          <w:sz w:val="21"/>
+          <w:szCs w:val="21"/>
+          <w14:ligatures w14:val="none"/>
+        </w:rPr>
+        <w:t>mkdir</w:t>
+      </w:r>
+      <w:proofErr w:type="spellEnd"/>
+      <w:r>
+        <w:rPr>
+          <w:rFonts w:ascii="Consolas" w:eastAsia="Times New Roman" w:hAnsi="Consolas" w:cs="Times New Roman"/>
+          <w:noProof w:val="0"/>
+          <w:color w:val="000000"/>
+          <w:kern w:val="0"/>
+          <w:sz w:val="21"/>
+          <w:szCs w:val="21"/>
+          <w14:ligatures w14:val="none"/>
+        </w:rPr>
+        <w:t xml:space="preserve"> </w:t>
+      </w:r>
+      <w:r>
+        <w:rPr>
+          <w:rFonts w:ascii="Consolas" w:eastAsia="Times New Roman" w:hAnsi="Consolas" w:cs="Times New Roman"/>
+          <w:noProof w:val="0"/>
+          <w:color w:val="0000FF"/>
+          <w:kern w:val="0"/>
+          <w:sz w:val="21"/>
+          <w:szCs w:val="21"/>
+          <w14:ligatures w14:val="none"/>
+        </w:rPr>
+        <w:t>-p</w:t>
+      </w:r>
+      <w:r>
+        <w:rPr>
+          <w:rFonts w:ascii="Consolas" w:eastAsia="Times New Roman" w:hAnsi="Consolas" w:cs="Times New Roman"/>
+          <w:noProof w:val="0"/>
+          <w:color w:val="000000"/>
+          <w:kern w:val="0"/>
+          <w:sz w:val="21"/>
+          <w:szCs w:val="21"/>
+          <w14:ligatures w14:val="none"/>
+        </w:rPr>
+        <w:t xml:space="preserve"> </w:t>
+      </w:r>
+      <w:r>
+        <w:rPr>
+          <w:rFonts w:ascii="Consolas" w:eastAsia="Times New Roman" w:hAnsi="Consolas" w:cs="Times New Roman"/>
+          <w:noProof w:val="0"/>
+          <w:color w:val="A31515"/>
+          <w:kern w:val="0"/>
+          <w:sz w:val="21"/>
+          <w:szCs w:val="21"/>
+          <w14:ligatures w14:val="none"/>
+        </w:rPr>
+        <w:t>input</w:t>
+      </w:r>
+    </w:p>
+    <w:p>
+      <w:pPr>
+        <w:pBdr>
+          <w:top w:val="single" w:sz="4" w:space="1" w:color="auto"/>
+          <w:left w:val="single" w:sz="4" w:space="4" w:color="auto"/>
+          <w:bottom w:val="single" w:sz="4" w:space="1" w:color="auto"/>
+          <w:right w:val="single" w:sz="4" w:space="4" w:color="auto"/>
+        </w:pBdr>
+        <w:shd w:val="clear" w:color="auto" w:fill="FFFFFF"/>
+        <w:spacing w:after="0" w:line="285" w:lineRule="atLeast"/>
+        <w:rPr>
+          <w:rFonts w:ascii="Consolas" w:eastAsia="Times New Roman" w:hAnsi="Consolas" w:cs="Times New Roman"/>
+          <w:noProof w:val="0"/>
+          <w:color w:val="000000"/>
+          <w:kern w:val="0"/>
+          <w:sz w:val="21"/>
+          <w:szCs w:val="21"/>
+          <w14:ligatures w14:val="none"/>
+        </w:rPr>
+      </w:pPr>
+      <w:r>
+        <w:rPr>
+          <w:rFonts w:ascii="Consolas" w:eastAsia="Times New Roman" w:hAnsi="Consolas" w:cs="Times New Roman"/>
+          <w:noProof w:val="0"/>
+          <w:color w:val="795E26"/>
+          <w:kern w:val="0"/>
+          <w:sz w:val="21"/>
+          <w:szCs w:val="21"/>
+          <w14:ligatures w14:val="none"/>
+        </w:rPr>
+        <w:t>echo</w:t>
+      </w:r>
+      <w:r>
+        <w:rPr>
+          <w:rFonts w:ascii="Consolas" w:eastAsia="Times New Roman" w:hAnsi="Consolas" w:cs="Times New Roman"/>
+          <w:noProof w:val="0"/>
+          <w:color w:val="000000"/>
+          <w:kern w:val="0"/>
+          <w:sz w:val="21"/>
+          <w:szCs w:val="21"/>
+          <w14:ligatures w14:val="none"/>
+        </w:rPr>
+        <w:t xml:space="preserve"> </w:t>
+      </w:r>
+      <w:r>
+        <w:rPr>
+          <w:rFonts w:ascii="Consolas" w:eastAsia="Times New Roman" w:hAnsi="Consolas" w:cs="Times New Roman"/>
+          <w:noProof w:val="0"/>
+          <w:color w:val="A31515"/>
+          <w:kern w:val="0"/>
+          <w:sz w:val="21"/>
+          <w:szCs w:val="21"/>
+          <w14:ligatures w14:val="none"/>
+        </w:rPr>
+        <w:t>"Hello World"</w:t>
+      </w:r>
+      <w:r>
+        <w:rPr>
+          <w:rFonts w:ascii="Consolas" w:eastAsia="Times New Roman" w:hAnsi="Consolas" w:cs="Times New Roman"/>
+          <w:noProof w:val="0"/>
+          <w:color w:val="000000"/>
+          <w:kern w:val="0"/>
+          <w:sz w:val="21"/>
+          <w:szCs w:val="21"/>
+          <w14:ligatures w14:val="none"/>
+        </w:rPr>
+        <w:t xml:space="preserve"> &gt; </w:t>
+      </w:r>
+      <w:r>
+        <w:rPr>
+          <w:rFonts w:ascii="Consolas" w:eastAsia="Times New Roman" w:hAnsi="Consolas" w:cs="Times New Roman"/>
+          <w:noProof w:val="0"/>
+          <w:color w:val="A31515"/>
+          <w:kern w:val="0"/>
+          <w:sz w:val="21"/>
+          <w:szCs w:val="21"/>
+          <w14:ligatures w14:val="none"/>
+        </w:rPr>
+        <w:t>input/file1.txt</w:t>
+      </w:r>
+    </w:p>
+    <w:p>
+      <w:pPr>
+        <w:pBdr>
+          <w:top w:val="single" w:sz="4" w:space="1" w:color="auto"/>
+          <w:left w:val="single" w:sz="4" w:space="4" w:color="auto"/>
+          <w:bottom w:val="single" w:sz="4" w:space="1" w:color="auto"/>
+          <w:right w:val="single" w:sz="4" w:space="4" w:color="auto"/>
+        </w:pBdr>
+        <w:shd w:val="clear" w:color="auto" w:fill="FFFFFF"/>
+        <w:spacing w:after="0" w:line="285" w:lineRule="atLeast"/>
+        <w:rPr>
+          <w:rFonts w:ascii="Consolas" w:eastAsia="Times New Roman" w:hAnsi="Consolas" w:cs="Times New Roman"/>
+          <w:noProof w:val="0"/>
+          <w:color w:val="000000"/>
+          <w:kern w:val="0"/>
+          <w:sz w:val="21"/>
+          <w:szCs w:val="21"/>
+          <w14:ligatures w14:val="none"/>
+        </w:rPr>
+      </w:pPr>
+      <w:r>
+        <w:rPr>
+          <w:rFonts w:ascii="Consolas" w:eastAsia="Times New Roman" w:hAnsi="Consolas" w:cs="Times New Roman"/>
+          <w:noProof w:val="0"/>
+          <w:color w:val="795E26"/>
+          <w:kern w:val="0"/>
+          <w:sz w:val="21"/>
+          <w:szCs w:val="21"/>
+          <w14:ligatures w14:val="none"/>
+        </w:rPr>
+        <w:t>echo</w:t>
+      </w:r>
+      <w:r>
+        <w:rPr>
+          <w:rFonts w:ascii="Consolas" w:eastAsia="Times New Roman" w:hAnsi="Consolas" w:cs="Times New Roman"/>
+          <w:noProof w:val="0"/>
+          <w:color w:val="000000"/>
+          <w:kern w:val="0"/>
+          <w:sz w:val="21"/>
+          <w:szCs w:val="21"/>
+          <w14:ligatures w14:val="none"/>
+        </w:rPr>
+        <w:t xml:space="preserve"> </w:t>
+      </w:r>
+      <w:r>
+        <w:rPr>
+          <w:rFonts w:ascii="Consolas" w:eastAsia="Times New Roman" w:hAnsi="Consolas" w:cs="Times New Roman"/>
+          <w:noProof w:val="0"/>
+          <w:color w:val="A31515"/>
+          <w:kern w:val="0"/>
+          <w:sz w:val="21"/>
+          <w:szCs w:val="21"/>
+          <w14:ligatures w14:val="none"/>
+        </w:rPr>
+        <w:t>"Hello Hadoop"</w:t>
+      </w:r>
+      <w:r>
+        <w:rPr>
+          <w:rFonts w:ascii="Consolas" w:eastAsia="Times New Roman" w:hAnsi="Consolas" w:cs="Times New Roman"/>
+          <w:noProof w:val="0"/>
+          <w:color w:val="000000"/>
+          <w:kern w:val="0"/>
+          <w:sz w:val="21"/>
+          <w:szCs w:val="21"/>
+          <w14:ligatures w14:val="none"/>
+        </w:rPr>
+        <w:t xml:space="preserve"> &gt; </w:t>
+      </w:r>
+      <w:r>
+        <w:rPr>
+          <w:rFonts w:ascii="Consolas" w:eastAsia="Times New Roman" w:hAnsi="Consolas" w:cs="Times New Roman"/>
+          <w:noProof w:val="0"/>
+          <w:color w:val="A31515"/>
+          <w:kern w:val="0"/>
+          <w:sz w:val="21"/>
+          <w:szCs w:val="21"/>
+          <w14:ligatures w14:val="none"/>
+        </w:rPr>
+        <w:t>input/file2.txt</w:t>
+      </w:r>
+    </w:p>
+    <w:p>
+      <w:pPr>
+        <w:pBdr>
+          <w:top w:val="single" w:sz="4" w:space="1" w:color="auto"/>
+          <w:left w:val="single" w:sz="4" w:space="4" w:color="auto"/>
+          <w:bottom w:val="single" w:sz="4" w:space="1" w:color="auto"/>
+          <w:right w:val="single" w:sz="4" w:space="4" w:color="auto"/>
+        </w:pBdr>
+        <w:shd w:val="clear" w:color="auto" w:fill="FFFFFF"/>
+        <w:spacing w:after="0" w:line="285" w:lineRule="atLeast"/>
+        <w:rPr>
+          <w:rFonts w:ascii="Consolas" w:eastAsia="Times New Roman" w:hAnsi="Consolas" w:cs="Times New Roman"/>
+          <w:noProof w:val="0"/>
+          <w:color w:val="000000"/>
+          <w:kern w:val="0"/>
+          <w:sz w:val="21"/>
+          <w:szCs w:val="21"/>
+          <w14:ligatures w14:val="none"/>
+        </w:rPr>
+      </w:pPr>
+    </w:p>
+    <w:p>
+      <w:pPr>
+        <w:pBdr>
+          <w:top w:val="single" w:sz="4" w:space="1" w:color="auto"/>
+          <w:left w:val="single" w:sz="4" w:space="4" w:color="auto"/>
+          <w:bottom w:val="single" w:sz="4" w:space="1" w:color="auto"/>
+          <w:right w:val="single" w:sz="4" w:space="4" w:color="auto"/>
+        </w:pBdr>
+        <w:shd w:val="clear" w:color="auto" w:fill="FFFFFF"/>
+        <w:spacing w:after="0" w:line="285" w:lineRule="atLeast"/>
+        <w:rPr>
+          <w:rFonts w:ascii="Consolas" w:eastAsia="Times New Roman" w:hAnsi="Consolas" w:cs="Times New Roman"/>
+          <w:noProof w:val="0"/>
+          <w:color w:val="000000"/>
+          <w:kern w:val="0"/>
+          <w:sz w:val="21"/>
+          <w:szCs w:val="21"/>
+          <w14:ligatures w14:val="none"/>
+        </w:rPr>
+      </w:pPr>
+      <w:r>
+        <w:rPr>
+          <w:rFonts w:ascii="Consolas" w:eastAsia="Times New Roman" w:hAnsi="Consolas" w:cs="Times New Roman"/>
+          <w:noProof w:val="0"/>
+          <w:color w:val="008000"/>
+          <w:kern w:val="0"/>
+          <w:sz w:val="21"/>
+          <w:szCs w:val="21"/>
+          <w14:ligatures w14:val="none"/>
+        </w:rPr>
+        <w:t xml:space="preserve"># 2. </w:t>
+      </w:r>
+      <w:proofErr w:type="spellStart"/>
+      <w:r>
+        <w:rPr>
+          <w:rFonts w:ascii="Consolas" w:eastAsia="Times New Roman" w:hAnsi="Consolas" w:cs="Times New Roman"/>
+          <w:noProof w:val="0"/>
+          <w:color w:val="008000"/>
+          <w:kern w:val="0"/>
+          <w:sz w:val="21"/>
+          <w:szCs w:val="21"/>
+          <w14:ligatures w14:val="none"/>
+        </w:rPr>
+        <w:t>Xóa</w:t>
+      </w:r>
+      <w:proofErr w:type="spellEnd"/>
+      <w:r>
+        <w:rPr>
+          <w:rFonts w:ascii="Consolas" w:eastAsia="Times New Roman" w:hAnsi="Consolas" w:cs="Times New Roman"/>
+          <w:noProof w:val="0"/>
+          <w:color w:val="008000"/>
+          <w:kern w:val="0"/>
+          <w:sz w:val="21"/>
+          <w:szCs w:val="21"/>
+          <w14:ligatures w14:val="none"/>
+        </w:rPr>
+        <w:t xml:space="preserve"> </w:t>
+      </w:r>
+      <w:proofErr w:type="spellStart"/>
+      <w:r>
+        <w:rPr>
+          <w:rFonts w:ascii="Consolas" w:eastAsia="Times New Roman" w:hAnsi="Consolas" w:cs="Times New Roman"/>
+          <w:noProof w:val="0"/>
+          <w:color w:val="008000"/>
+          <w:kern w:val="0"/>
+          <w:sz w:val="21"/>
+          <w:szCs w:val="21"/>
+          <w14:ligatures w14:val="none"/>
+        </w:rPr>
+        <w:t>thư</w:t>
+      </w:r>
+      <w:proofErr w:type="spellEnd"/>
+      <w:r>
+        <w:rPr>
+          <w:rFonts w:ascii="Consolas" w:eastAsia="Times New Roman" w:hAnsi="Consolas" w:cs="Times New Roman"/>
+          <w:noProof w:val="0"/>
+          <w:color w:val="008000"/>
+          <w:kern w:val="0"/>
+          <w:sz w:val="21"/>
+          <w:szCs w:val="21"/>
+          <w14:ligatures w14:val="none"/>
+        </w:rPr>
+        <w:t xml:space="preserve"> </w:t>
+      </w:r>
+      <w:proofErr w:type="spellStart"/>
+      <w:r>
+        <w:rPr>
+          <w:rFonts w:ascii="Consolas" w:eastAsia="Times New Roman" w:hAnsi="Consolas" w:cs="Times New Roman"/>
+          <w:noProof w:val="0"/>
+          <w:color w:val="008000"/>
+          <w:kern w:val="0"/>
+          <w:sz w:val="21"/>
+          <w:szCs w:val="21"/>
+          <w14:ligatures w14:val="none"/>
+        </w:rPr>
+        <w:t>mục</w:t>
+      </w:r>
+      <w:proofErr w:type="spellEnd"/>
+      <w:r>
+        <w:rPr>
+          <w:rFonts w:ascii="Consolas" w:eastAsia="Times New Roman" w:hAnsi="Consolas" w:cs="Times New Roman"/>
+          <w:noProof w:val="0"/>
+          <w:color w:val="008000"/>
+          <w:kern w:val="0"/>
+          <w:sz w:val="21"/>
+          <w:szCs w:val="21"/>
+          <w14:ligatures w14:val="none"/>
+        </w:rPr>
+        <w:t xml:space="preserve"> </w:t>
+      </w:r>
+      <w:proofErr w:type="spellStart"/>
+      <w:r>
+        <w:rPr>
+          <w:rFonts w:ascii="Consolas" w:eastAsia="Times New Roman" w:hAnsi="Consolas" w:cs="Times New Roman"/>
+          <w:noProof w:val="0"/>
+          <w:color w:val="008000"/>
+          <w:kern w:val="0"/>
+          <w:sz w:val="21"/>
+          <w:szCs w:val="21"/>
+          <w14:ligatures w14:val="none"/>
+        </w:rPr>
+        <w:t>cũ</w:t>
+      </w:r>
+      <w:proofErr w:type="spellEnd"/>
+      <w:r>
+        <w:rPr>
+          <w:rFonts w:ascii="Consolas" w:eastAsia="Times New Roman" w:hAnsi="Consolas" w:cs="Times New Roman"/>
+          <w:noProof w:val="0"/>
+          <w:color w:val="008000"/>
+          <w:kern w:val="0"/>
+          <w:sz w:val="21"/>
+          <w:szCs w:val="21"/>
+          <w14:ligatures w14:val="none"/>
+        </w:rPr>
+        <w:t xml:space="preserve"> </w:t>
+      </w:r>
+      <w:proofErr w:type="spellStart"/>
+      <w:r>
+        <w:rPr>
+          <w:rFonts w:ascii="Consolas" w:eastAsia="Times New Roman" w:hAnsi="Consolas" w:cs="Times New Roman"/>
+          <w:noProof w:val="0"/>
+          <w:color w:val="008000"/>
+          <w:kern w:val="0"/>
+          <w:sz w:val="21"/>
+          <w:szCs w:val="21"/>
+          <w14:ligatures w14:val="none"/>
+        </w:rPr>
+        <w:t>trên</w:t>
+      </w:r>
+      <w:proofErr w:type="spellEnd"/>
+      <w:r>
+        <w:rPr>
+          <w:rFonts w:ascii="Consolas" w:eastAsia="Times New Roman" w:hAnsi="Consolas" w:cs="Times New Roman"/>
+          <w:noProof w:val="0"/>
+          <w:color w:val="008000"/>
+          <w:kern w:val="0"/>
+          <w:sz w:val="21"/>
+          <w:szCs w:val="21"/>
+          <w14:ligatures w14:val="none"/>
+        </w:rPr>
+        <w:t xml:space="preserve"> HDFS (</w:t>
+      </w:r>
+      <w:proofErr w:type="spellStart"/>
+      <w:r>
+        <w:rPr>
+          <w:rFonts w:ascii="Consolas" w:eastAsia="Times New Roman" w:hAnsi="Consolas" w:cs="Times New Roman"/>
+          <w:noProof w:val="0"/>
+          <w:color w:val="008000"/>
+          <w:kern w:val="0"/>
+          <w:sz w:val="21"/>
+          <w:szCs w:val="21"/>
+          <w14:ligatures w14:val="none"/>
+        </w:rPr>
+        <w:t>nếu</w:t>
+      </w:r>
+      <w:proofErr w:type="spellEnd"/>
+      <w:r>
+        <w:rPr>
+          <w:rFonts w:ascii="Consolas" w:eastAsia="Times New Roman" w:hAnsi="Consolas" w:cs="Times New Roman"/>
+          <w:noProof w:val="0"/>
+          <w:color w:val="008000"/>
+          <w:kern w:val="0"/>
+          <w:sz w:val="21"/>
+          <w:szCs w:val="21"/>
+          <w14:ligatures w14:val="none"/>
+        </w:rPr>
+        <w:t xml:space="preserve"> </w:t>
+      </w:r>
+      <w:proofErr w:type="spellStart"/>
+      <w:r>
+        <w:rPr>
+          <w:rFonts w:ascii="Consolas" w:eastAsia="Times New Roman" w:hAnsi="Consolas" w:cs="Times New Roman"/>
+          <w:noProof w:val="0"/>
+          <w:color w:val="008000"/>
+          <w:kern w:val="0"/>
+          <w:sz w:val="21"/>
+          <w:szCs w:val="21"/>
+          <w14:ligatures w14:val="none"/>
+        </w:rPr>
+        <w:t>có</w:t>
+      </w:r>
+      <w:proofErr w:type="spellEnd"/>
+      <w:r>
+        <w:rPr>
+          <w:rFonts w:ascii="Consolas" w:eastAsia="Times New Roman" w:hAnsi="Consolas" w:cs="Times New Roman"/>
+          <w:noProof w:val="0"/>
+          <w:color w:val="008000"/>
+          <w:kern w:val="0"/>
+          <w:sz w:val="21"/>
+          <w:szCs w:val="21"/>
+          <w14:ligatures w14:val="none"/>
+        </w:rPr>
+        <w:t xml:space="preserve">) </w:t>
+      </w:r>
+      <w:proofErr w:type="spellStart"/>
+      <w:r>
+        <w:rPr>
+          <w:rFonts w:ascii="Consolas" w:eastAsia="Times New Roman" w:hAnsi="Consolas" w:cs="Times New Roman"/>
+          <w:noProof w:val="0"/>
+          <w:color w:val="008000"/>
+          <w:kern w:val="0"/>
+          <w:sz w:val="21"/>
+          <w:szCs w:val="21"/>
+          <w14:ligatures w14:val="none"/>
+        </w:rPr>
+        <w:t>và</w:t>
+      </w:r>
+      <w:proofErr w:type="spellEnd"/>
+      <w:r>
+        <w:rPr>
+          <w:rFonts w:ascii="Consolas" w:eastAsia="Times New Roman" w:hAnsi="Consolas" w:cs="Times New Roman"/>
+          <w:noProof w:val="0"/>
+          <w:color w:val="008000"/>
+          <w:kern w:val="0"/>
+          <w:sz w:val="21"/>
+          <w:szCs w:val="21"/>
+          <w14:ligatures w14:val="none"/>
+        </w:rPr>
+        <w:t xml:space="preserve"> </w:t>
+      </w:r>
+      <w:proofErr w:type="spellStart"/>
+      <w:r>
+        <w:rPr>
+          <w:rFonts w:ascii="Consolas" w:eastAsia="Times New Roman" w:hAnsi="Consolas" w:cs="Times New Roman"/>
+          <w:noProof w:val="0"/>
+          <w:color w:val="008000"/>
+          <w:kern w:val="0"/>
+          <w:sz w:val="21"/>
+          <w:szCs w:val="21"/>
+          <w14:ligatures w14:val="none"/>
+        </w:rPr>
+        <w:t>đẩy</w:t>
+      </w:r>
+      <w:proofErr w:type="spellEnd"/>
+      <w:r>
+        <w:rPr>
+          <w:rFonts w:ascii="Consolas" w:eastAsia="Times New Roman" w:hAnsi="Consolas" w:cs="Times New Roman"/>
+          <w:noProof w:val="0"/>
+          <w:color w:val="008000"/>
+          <w:kern w:val="0"/>
+          <w:sz w:val="21"/>
+          <w:szCs w:val="21"/>
+          <w14:ligatures w14:val="none"/>
+        </w:rPr>
+        <w:t xml:space="preserve"> </w:t>
+      </w:r>
+      <w:proofErr w:type="spellStart"/>
+      <w:r>
+        <w:rPr>
+          <w:rFonts w:ascii="Consolas" w:eastAsia="Times New Roman" w:hAnsi="Consolas" w:cs="Times New Roman"/>
+          <w:noProof w:val="0"/>
+          <w:color w:val="008000"/>
+          <w:kern w:val="0"/>
+          <w:sz w:val="21"/>
+          <w:szCs w:val="21"/>
+          <w14:ligatures w14:val="none"/>
+        </w:rPr>
+        <w:t>dữ</w:t>
+      </w:r>
+      <w:proofErr w:type="spellEnd"/>
+      <w:r>
+        <w:rPr>
+          <w:rFonts w:ascii="Consolas" w:eastAsia="Times New Roman" w:hAnsi="Consolas" w:cs="Times New Roman"/>
+          <w:noProof w:val="0"/>
+          <w:color w:val="008000"/>
+          <w:kern w:val="0"/>
+          <w:sz w:val="21"/>
+          <w:szCs w:val="21"/>
+          <w14:ligatures w14:val="none"/>
+        </w:rPr>
+        <w:t xml:space="preserve"> </w:t>
+      </w:r>
+      <w:proofErr w:type="spellStart"/>
+      <w:r>
+        <w:rPr>
+          <w:rFonts w:ascii="Consolas" w:eastAsia="Times New Roman" w:hAnsi="Consolas" w:cs="Times New Roman"/>
+          <w:noProof w:val="0"/>
+          <w:color w:val="008000"/>
+          <w:kern w:val="0"/>
+          <w:sz w:val="21"/>
+          <w:szCs w:val="21"/>
+          <w14:ligatures w14:val="none"/>
+        </w:rPr>
+        <w:t>liệu</w:t>
+      </w:r>
+      <w:proofErr w:type="spellEnd"/>
+      <w:r>
+        <w:rPr>
+          <w:rFonts w:ascii="Consolas" w:eastAsia="Times New Roman" w:hAnsi="Consolas" w:cs="Times New Roman"/>
+          <w:noProof w:val="0"/>
+          <w:color w:val="008000"/>
+          <w:kern w:val="0"/>
+          <w:sz w:val="21"/>
+          <w:szCs w:val="21"/>
+          <w14:ligatures w14:val="none"/>
+        </w:rPr>
+        <w:t xml:space="preserve"> </w:t>
+      </w:r>
+      <w:proofErr w:type="spellStart"/>
+      <w:r>
+        <w:rPr>
+          <w:rFonts w:ascii="Consolas" w:eastAsia="Times New Roman" w:hAnsi="Consolas" w:cs="Times New Roman"/>
+          <w:noProof w:val="0"/>
+          <w:color w:val="008000"/>
+          <w:kern w:val="0"/>
+          <w:sz w:val="21"/>
+          <w:szCs w:val="21"/>
+          <w14:ligatures w14:val="none"/>
+        </w:rPr>
+        <w:t>mới</w:t>
+      </w:r>
+      <w:proofErr w:type="spellEnd"/>
+      <w:r>
+        <w:rPr>
+          <w:rFonts w:ascii="Consolas" w:eastAsia="Times New Roman" w:hAnsi="Consolas" w:cs="Times New Roman"/>
+          <w:noProof w:val="0"/>
+          <w:color w:val="008000"/>
+          <w:kern w:val="0"/>
+          <w:sz w:val="21"/>
+          <w:szCs w:val="21"/>
+          <w14:ligatures w14:val="none"/>
+        </w:rPr>
+        <w:t xml:space="preserve"> </w:t>
+      </w:r>
+      <w:proofErr w:type="spellStart"/>
+      <w:r>
+        <w:rPr>
+          <w:rFonts w:ascii="Consolas" w:eastAsia="Times New Roman" w:hAnsi="Consolas" w:cs="Times New Roman"/>
+          <w:noProof w:val="0"/>
+          <w:color w:val="008000"/>
+          <w:kern w:val="0"/>
+          <w:sz w:val="21"/>
+          <w:szCs w:val="21"/>
+          <w14:ligatures w14:val="none"/>
+        </w:rPr>
+        <w:t>lên</w:t>
+      </w:r>
+      <w:proofErr w:type="spellEnd"/>
+      <w:r>
+        <w:rPr>
+          <w:rFonts w:ascii="Consolas" w:eastAsia="Times New Roman" w:hAnsi="Consolas" w:cs="Times New Roman"/>
+          <w:noProof w:val="0"/>
+          <w:color w:val="008000"/>
+          <w:kern w:val="0"/>
+          <w:sz w:val="21"/>
+          <w:szCs w:val="21"/>
+          <w14:ligatures w14:val="none"/>
+        </w:rPr>
+        <w:t xml:space="preserve"> HDFS</w:t>
+      </w:r>
+    </w:p>
+    <w:p>
+      <w:pPr>
+        <w:pBdr>
+          <w:top w:val="single" w:sz="4" w:space="1" w:color="auto"/>
+          <w:left w:val="single" w:sz="4" w:space="4" w:color="auto"/>
+          <w:bottom w:val="single" w:sz="4" w:space="1" w:color="auto"/>
+          <w:right w:val="single" w:sz="4" w:space="4" w:color="auto"/>
+        </w:pBdr>
+        <w:shd w:val="clear" w:color="auto" w:fill="FFFFFF"/>
+        <w:spacing w:after="0" w:line="285" w:lineRule="atLeast"/>
+        <w:rPr>
+          <w:rFonts w:ascii="Consolas" w:eastAsia="Times New Roman" w:hAnsi="Consolas" w:cs="Times New Roman"/>
+          <w:noProof w:val="0"/>
+          <w:color w:val="000000"/>
+          <w:kern w:val="0"/>
+          <w:sz w:val="21"/>
+          <w:szCs w:val="21"/>
+          <w14:ligatures w14:val="none"/>
+        </w:rPr>
+      </w:pPr>
+      <w:proofErr w:type="spellStart"/>
+      <w:r>
+        <w:rPr>
+          <w:rFonts w:ascii="Consolas" w:eastAsia="Times New Roman" w:hAnsi="Consolas" w:cs="Times New Roman"/>
+          <w:noProof w:val="0"/>
+          <w:color w:val="795E26"/>
+          <w:kern w:val="0"/>
+          <w:sz w:val="21"/>
+          <w:szCs w:val="21"/>
+          <w14:ligatures w14:val="none"/>
+        </w:rPr>
+        <w:lastRenderedPageBreak/>
+        <w:t>hdfs</w:t>
+      </w:r>
+      <w:proofErr w:type="spellEnd"/>
+      <w:r>
+        <w:rPr>
+          <w:rFonts w:ascii="Consolas" w:eastAsia="Times New Roman" w:hAnsi="Consolas" w:cs="Times New Roman"/>
+          <w:noProof w:val="0"/>
+          <w:color w:val="000000"/>
+          <w:kern w:val="0"/>
+          <w:sz w:val="21"/>
+          <w:szCs w:val="21"/>
+          <w14:ligatures w14:val="none"/>
+        </w:rPr>
+        <w:t xml:space="preserve"> </w:t>
+      </w:r>
+      <w:proofErr w:type="spellStart"/>
+      <w:r>
+        <w:rPr>
+          <w:rFonts w:ascii="Consolas" w:eastAsia="Times New Roman" w:hAnsi="Consolas" w:cs="Times New Roman"/>
+          <w:noProof w:val="0"/>
+          <w:color w:val="A31515"/>
+          <w:kern w:val="0"/>
+          <w:sz w:val="21"/>
+          <w:szCs w:val="21"/>
+          <w14:ligatures w14:val="none"/>
+        </w:rPr>
+        <w:t>dfs</w:t>
+      </w:r>
+      <w:proofErr w:type="spellEnd"/>
+      <w:r>
+        <w:rPr>
+          <w:rFonts w:ascii="Consolas" w:eastAsia="Times New Roman" w:hAnsi="Consolas" w:cs="Times New Roman"/>
+          <w:noProof w:val="0"/>
+          <w:color w:val="000000"/>
+          <w:kern w:val="0"/>
+          <w:sz w:val="21"/>
+          <w:szCs w:val="21"/>
+          <w14:ligatures w14:val="none"/>
+        </w:rPr>
+        <w:t xml:space="preserve"> </w:t>
+      </w:r>
+      <w:r>
+        <w:rPr>
+          <w:rFonts w:ascii="Consolas" w:eastAsia="Times New Roman" w:hAnsi="Consolas" w:cs="Times New Roman"/>
+          <w:noProof w:val="0"/>
+          <w:color w:val="0000FF"/>
+          <w:kern w:val="0"/>
+          <w:sz w:val="21"/>
+          <w:szCs w:val="21"/>
+          <w14:ligatures w14:val="none"/>
+        </w:rPr>
+        <w:t>-rm</w:t>
+      </w:r>
+      <w:r>
+        <w:rPr>
+          <w:rFonts w:ascii="Consolas" w:eastAsia="Times New Roman" w:hAnsi="Consolas" w:cs="Times New Roman"/>
+          <w:noProof w:val="0"/>
+          <w:color w:val="000000"/>
+          <w:kern w:val="0"/>
+          <w:sz w:val="21"/>
+          <w:szCs w:val="21"/>
+          <w14:ligatures w14:val="none"/>
+        </w:rPr>
+        <w:t xml:space="preserve"> </w:t>
+      </w:r>
+      <w:r>
+        <w:rPr>
+          <w:rFonts w:ascii="Consolas" w:eastAsia="Times New Roman" w:hAnsi="Consolas" w:cs="Times New Roman"/>
+          <w:noProof w:val="0"/>
+          <w:color w:val="0000FF"/>
+          <w:kern w:val="0"/>
+          <w:sz w:val="21"/>
+          <w:szCs w:val="21"/>
+          <w14:ligatures w14:val="none"/>
+        </w:rPr>
+        <w:t>-r</w:t>
+      </w:r>
+      <w:r>
+        <w:rPr>
+          <w:rFonts w:ascii="Consolas" w:eastAsia="Times New Roman" w:hAnsi="Consolas" w:cs="Times New Roman"/>
+          <w:noProof w:val="0"/>
+          <w:color w:val="000000"/>
+          <w:kern w:val="0"/>
+          <w:sz w:val="21"/>
+          <w:szCs w:val="21"/>
+          <w14:ligatures w14:val="none"/>
+        </w:rPr>
+        <w:t xml:space="preserve"> </w:t>
+      </w:r>
+      <w:r>
+        <w:rPr>
+          <w:rFonts w:ascii="Consolas" w:eastAsia="Times New Roman" w:hAnsi="Consolas" w:cs="Times New Roman"/>
+          <w:noProof w:val="0"/>
+          <w:color w:val="0000FF"/>
+          <w:kern w:val="0"/>
+          <w:sz w:val="21"/>
+          <w:szCs w:val="21"/>
+          <w14:ligatures w14:val="none"/>
+        </w:rPr>
+        <w:t>-f</w:t>
+      </w:r>
+      <w:r>
+        <w:rPr>
+          <w:rFonts w:ascii="Consolas" w:eastAsia="Times New Roman" w:hAnsi="Consolas" w:cs="Times New Roman"/>
+          <w:noProof w:val="0"/>
+          <w:color w:val="000000"/>
+          <w:kern w:val="0"/>
+          <w:sz w:val="21"/>
+          <w:szCs w:val="21"/>
+          <w14:ligatures w14:val="none"/>
+        </w:rPr>
+        <w:t xml:space="preserve"> </w:t>
+      </w:r>
+      <w:r>
+        <w:rPr>
+          <w:rFonts w:ascii="Consolas" w:eastAsia="Times New Roman" w:hAnsi="Consolas" w:cs="Times New Roman"/>
+          <w:noProof w:val="0"/>
+          <w:color w:val="A31515"/>
+          <w:kern w:val="0"/>
+          <w:sz w:val="21"/>
+          <w:szCs w:val="21"/>
+          <w14:ligatures w14:val="none"/>
+        </w:rPr>
+        <w:t>input1</w:t>
+      </w:r>
+      <w:r>
+        <w:rPr>
+          <w:rFonts w:ascii="Consolas" w:eastAsia="Times New Roman" w:hAnsi="Consolas" w:cs="Times New Roman"/>
+          <w:noProof w:val="0"/>
+          <w:color w:val="000000"/>
+          <w:kern w:val="0"/>
+          <w:sz w:val="21"/>
+          <w:szCs w:val="21"/>
+          <w14:ligatures w14:val="none"/>
+        </w:rPr>
+        <w:t xml:space="preserve"> </w:t>
+      </w:r>
+      <w:r>
+        <w:rPr>
+          <w:rFonts w:ascii="Consolas" w:eastAsia="Times New Roman" w:hAnsi="Consolas" w:cs="Times New Roman"/>
+          <w:noProof w:val="0"/>
+          <w:color w:val="A31515"/>
+          <w:kern w:val="0"/>
+          <w:sz w:val="21"/>
+          <w:szCs w:val="21"/>
+          <w14:ligatures w14:val="none"/>
+        </w:rPr>
+        <w:t>output1</w:t>
+      </w:r>
+    </w:p>
+    <w:p>
+      <w:pPr>
+        <w:pBdr>
+          <w:top w:val="single" w:sz="4" w:space="1" w:color="auto"/>
+          <w:left w:val="single" w:sz="4" w:space="4" w:color="auto"/>
+          <w:bottom w:val="single" w:sz="4" w:space="1" w:color="auto"/>
+          <w:right w:val="single" w:sz="4" w:space="4" w:color="auto"/>
+        </w:pBdr>
+        <w:shd w:val="clear" w:color="auto" w:fill="FFFFFF"/>
+        <w:spacing w:after="0" w:line="285" w:lineRule="atLeast"/>
+        <w:rPr>
+          <w:rFonts w:ascii="Consolas" w:eastAsia="Times New Roman" w:hAnsi="Consolas" w:cs="Times New Roman"/>
+          <w:noProof w:val="0"/>
+          <w:color w:val="000000"/>
+          <w:kern w:val="0"/>
+          <w:sz w:val="21"/>
+          <w:szCs w:val="21"/>
+          <w14:ligatures w14:val="none"/>
+        </w:rPr>
+      </w:pPr>
+      <w:proofErr w:type="spellStart"/>
+      <w:r>
+        <w:rPr>
+          <w:rFonts w:ascii="Consolas" w:eastAsia="Times New Roman" w:hAnsi="Consolas" w:cs="Times New Roman"/>
+          <w:noProof w:val="0"/>
+          <w:color w:val="795E26"/>
+          <w:kern w:val="0"/>
+          <w:sz w:val="21"/>
+          <w:szCs w:val="21"/>
+          <w14:ligatures w14:val="none"/>
+        </w:rPr>
+        <w:t>hdfs</w:t>
+      </w:r>
+      <w:proofErr w:type="spellEnd"/>
+      <w:r>
+        <w:rPr>
+          <w:rFonts w:ascii="Consolas" w:eastAsia="Times New Roman" w:hAnsi="Consolas" w:cs="Times New Roman"/>
+          <w:noProof w:val="0"/>
+          <w:color w:val="000000"/>
+          <w:kern w:val="0"/>
+          <w:sz w:val="21"/>
+          <w:szCs w:val="21"/>
+          <w14:ligatures w14:val="none"/>
+        </w:rPr>
+        <w:t xml:space="preserve"> </w:t>
+      </w:r>
+      <w:proofErr w:type="spellStart"/>
+      <w:r>
+        <w:rPr>
+          <w:rFonts w:ascii="Consolas" w:eastAsia="Times New Roman" w:hAnsi="Consolas" w:cs="Times New Roman"/>
+          <w:noProof w:val="0"/>
+          <w:color w:val="A31515"/>
+          <w:kern w:val="0"/>
+          <w:sz w:val="21"/>
+          <w:szCs w:val="21"/>
+          <w14:ligatures w14:val="none"/>
+        </w:rPr>
+        <w:t>dfs</w:t>
+      </w:r>
+      <w:proofErr w:type="spellEnd"/>
+      <w:r>
+        <w:rPr>
+          <w:rFonts w:ascii="Consolas" w:eastAsia="Times New Roman" w:hAnsi="Consolas" w:cs="Times New Roman"/>
+          <w:noProof w:val="0"/>
+          <w:color w:val="000000"/>
+          <w:kern w:val="0"/>
+          <w:sz w:val="21"/>
+          <w:szCs w:val="21"/>
+          <w14:ligatures w14:val="none"/>
+        </w:rPr>
+        <w:t xml:space="preserve"> </w:t>
+      </w:r>
+      <w:r>
+        <w:rPr>
+          <w:rFonts w:ascii="Consolas" w:eastAsia="Times New Roman" w:hAnsi="Consolas" w:cs="Times New Roman"/>
+          <w:noProof w:val="0"/>
+          <w:color w:val="0000FF"/>
+          <w:kern w:val="0"/>
+          <w:sz w:val="21"/>
+          <w:szCs w:val="21"/>
+          <w14:ligatures w14:val="none"/>
+        </w:rPr>
+        <w:t>-</w:t>
+      </w:r>
+      <w:proofErr w:type="spellStart"/>
+      <w:r>
+        <w:rPr>
+          <w:rFonts w:ascii="Consolas" w:eastAsia="Times New Roman" w:hAnsi="Consolas" w:cs="Times New Roman"/>
+          <w:noProof w:val="0"/>
+          <w:color w:val="0000FF"/>
+          <w:kern w:val="0"/>
+          <w:sz w:val="21"/>
+          <w:szCs w:val="21"/>
+          <w14:ligatures w14:val="none"/>
+        </w:rPr>
+        <w:t>mkdir</w:t>
+      </w:r>
+      <w:proofErr w:type="spellEnd"/>
+      <w:r>
+        <w:rPr>
+          <w:rFonts w:ascii="Consolas" w:eastAsia="Times New Roman" w:hAnsi="Consolas" w:cs="Times New Roman"/>
+          <w:noProof w:val="0"/>
+          <w:color w:val="000000"/>
+          <w:kern w:val="0"/>
+          <w:sz w:val="21"/>
+          <w:szCs w:val="21"/>
+          <w14:ligatures w14:val="none"/>
+        </w:rPr>
+        <w:t xml:space="preserve"> </w:t>
+      </w:r>
+      <w:r>
+        <w:rPr>
+          <w:rFonts w:ascii="Consolas" w:eastAsia="Times New Roman" w:hAnsi="Consolas" w:cs="Times New Roman"/>
+          <w:noProof w:val="0"/>
+          <w:color w:val="0000FF"/>
+          <w:kern w:val="0"/>
+          <w:sz w:val="21"/>
+          <w:szCs w:val="21"/>
+          <w14:ligatures w14:val="none"/>
+        </w:rPr>
+        <w:t>-p</w:t>
+      </w:r>
+      <w:r>
+        <w:rPr>
+          <w:rFonts w:ascii="Consolas" w:eastAsia="Times New Roman" w:hAnsi="Consolas" w:cs="Times New Roman"/>
+          <w:noProof w:val="0"/>
+          <w:color w:val="000000"/>
+          <w:kern w:val="0"/>
+          <w:sz w:val="21"/>
+          <w:szCs w:val="21"/>
+          <w14:ligatures w14:val="none"/>
+        </w:rPr>
+        <w:t xml:space="preserve"> </w:t>
+      </w:r>
+      <w:r>
+        <w:rPr>
+          <w:rFonts w:ascii="Consolas" w:eastAsia="Times New Roman" w:hAnsi="Consolas" w:cs="Times New Roman"/>
+          <w:noProof w:val="0"/>
+          <w:color w:val="A31515"/>
+          <w:kern w:val="0"/>
+          <w:sz w:val="21"/>
+          <w:szCs w:val="21"/>
+          <w14:ligatures w14:val="none"/>
+        </w:rPr>
+        <w:t>input1</w:t>
+      </w:r>
+    </w:p>
+    <w:p>
+      <w:pPr>
+        <w:pBdr>
+          <w:top w:val="single" w:sz="4" w:space="1" w:color="auto"/>
+          <w:left w:val="single" w:sz="4" w:space="4" w:color="auto"/>
+          <w:bottom w:val="single" w:sz="4" w:space="1" w:color="auto"/>
+          <w:right w:val="single" w:sz="4" w:space="4" w:color="auto"/>
+        </w:pBdr>
+        <w:shd w:val="clear" w:color="auto" w:fill="FFFFFF"/>
+        <w:spacing w:after="0" w:line="285" w:lineRule="atLeast"/>
+        <w:rPr>
+          <w:rFonts w:ascii="Consolas" w:eastAsia="Times New Roman" w:hAnsi="Consolas" w:cs="Times New Roman"/>
+          <w:noProof w:val="0"/>
+          <w:color w:val="000000"/>
+          <w:kern w:val="0"/>
+          <w:sz w:val="21"/>
+          <w:szCs w:val="21"/>
+          <w14:ligatures w14:val="none"/>
+        </w:rPr>
+      </w:pPr>
+      <w:proofErr w:type="spellStart"/>
+      <w:r>
+        <w:rPr>
+          <w:rFonts w:ascii="Consolas" w:eastAsia="Times New Roman" w:hAnsi="Consolas" w:cs="Times New Roman"/>
+          <w:noProof w:val="0"/>
+          <w:color w:val="795E26"/>
+          <w:kern w:val="0"/>
+          <w:sz w:val="21"/>
+          <w:szCs w:val="21"/>
+          <w14:ligatures w14:val="none"/>
+        </w:rPr>
+        <w:t>hdfs</w:t>
+      </w:r>
+      <w:proofErr w:type="spellEnd"/>
+      <w:r>
+        <w:rPr>
+          <w:rFonts w:ascii="Consolas" w:eastAsia="Times New Roman" w:hAnsi="Consolas" w:cs="Times New Roman"/>
+          <w:noProof w:val="0"/>
+          <w:color w:val="000000"/>
+          <w:kern w:val="0"/>
+          <w:sz w:val="21"/>
+          <w:szCs w:val="21"/>
+          <w14:ligatures w14:val="none"/>
+        </w:rPr>
+        <w:t xml:space="preserve"> </w:t>
+      </w:r>
+      <w:proofErr w:type="spellStart"/>
+      <w:r>
+        <w:rPr>
+          <w:rFonts w:ascii="Consolas" w:eastAsia="Times New Roman" w:hAnsi="Consolas" w:cs="Times New Roman"/>
+          <w:noProof w:val="0"/>
+          <w:color w:val="A31515"/>
+          <w:kern w:val="0"/>
+          <w:sz w:val="21"/>
+          <w:szCs w:val="21"/>
+          <w14:ligatures w14:val="none"/>
+        </w:rPr>
+        <w:t>dfs</w:t>
+      </w:r>
+      <w:proofErr w:type="spellEnd"/>
+      <w:r>
+        <w:rPr>
+          <w:rFonts w:ascii="Consolas" w:eastAsia="Times New Roman" w:hAnsi="Consolas" w:cs="Times New Roman"/>
+          <w:noProof w:val="0"/>
+          <w:color w:val="000000"/>
+          <w:kern w:val="0"/>
+          <w:sz w:val="21"/>
+          <w:szCs w:val="21"/>
+          <w14:ligatures w14:val="none"/>
+        </w:rPr>
+        <w:t xml:space="preserve"> </w:t>
+      </w:r>
+      <w:r>
+        <w:rPr>
+          <w:rFonts w:ascii="Consolas" w:eastAsia="Times New Roman" w:hAnsi="Consolas" w:cs="Times New Roman"/>
+          <w:noProof w:val="0"/>
+          <w:color w:val="0000FF"/>
+          <w:kern w:val="0"/>
+          <w:sz w:val="21"/>
+          <w:szCs w:val="21"/>
+          <w14:ligatures w14:val="none"/>
+        </w:rPr>
+        <w:t>-</w:t>
+      </w:r>
+      <w:proofErr w:type="gramStart"/>
+      <w:r>
+        <w:rPr>
+          <w:rFonts w:ascii="Consolas" w:eastAsia="Times New Roman" w:hAnsi="Consolas" w:cs="Times New Roman"/>
+          <w:noProof w:val="0"/>
+          <w:color w:val="0000FF"/>
+          <w:kern w:val="0"/>
+          <w:sz w:val="21"/>
+          <w:szCs w:val="21"/>
+          <w14:ligatures w14:val="none"/>
+        </w:rPr>
+        <w:t>put</w:t>
+      </w:r>
+      <w:r>
+        <w:rPr>
+          <w:rFonts w:ascii="Consolas" w:eastAsia="Times New Roman" w:hAnsi="Consolas" w:cs="Times New Roman"/>
+          <w:noProof w:val="0"/>
+          <w:color w:val="000000"/>
+          <w:kern w:val="0"/>
+          <w:sz w:val="21"/>
+          <w:szCs w:val="21"/>
+          <w14:ligatures w14:val="none"/>
+        </w:rPr>
+        <w:t xml:space="preserve"> </w:t>
+      </w:r>
+      <w:r>
+        <w:rPr>
+          <w:rFonts w:ascii="Consolas" w:eastAsia="Times New Roman" w:hAnsi="Consolas" w:cs="Times New Roman"/>
+          <w:noProof w:val="0"/>
+          <w:color w:val="A31515"/>
+          <w:kern w:val="0"/>
+          <w:sz w:val="21"/>
+          <w:szCs w:val="21"/>
+          <w14:ligatures w14:val="none"/>
+        </w:rPr>
+        <w:t>.</w:t>
+      </w:r>
+      <w:proofErr w:type="gramEnd"/>
+      <w:r>
+        <w:rPr>
+          <w:rFonts w:ascii="Consolas" w:eastAsia="Times New Roman" w:hAnsi="Consolas" w:cs="Times New Roman"/>
+          <w:noProof w:val="0"/>
+          <w:color w:val="A31515"/>
+          <w:kern w:val="0"/>
+          <w:sz w:val="21"/>
+          <w:szCs w:val="21"/>
+          <w14:ligatures w14:val="none"/>
+        </w:rPr>
+        <w:t>/input/</w:t>
+      </w:r>
+      <w:r>
+        <w:rPr>
+          <w:rFonts w:ascii="Consolas" w:eastAsia="Times New Roman" w:hAnsi="Consolas" w:cs="Times New Roman"/>
+          <w:noProof w:val="0"/>
+          <w:color w:val="0000FF"/>
+          <w:kern w:val="0"/>
+          <w:sz w:val="21"/>
+          <w:szCs w:val="21"/>
+          <w14:ligatures w14:val="none"/>
+        </w:rPr>
+        <w:t>*</w:t>
+      </w:r>
+      <w:r>
+        <w:rPr>
+          <w:rFonts w:ascii="Consolas" w:eastAsia="Times New Roman" w:hAnsi="Consolas" w:cs="Times New Roman"/>
+          <w:noProof w:val="0"/>
+          <w:color w:val="000000"/>
+          <w:kern w:val="0"/>
+          <w:sz w:val="21"/>
+          <w:szCs w:val="21"/>
+          <w14:ligatures w14:val="none"/>
+        </w:rPr>
+        <w:t xml:space="preserve"> </w:t>
+      </w:r>
+      <w:r>
+        <w:rPr>
+          <w:rFonts w:ascii="Consolas" w:eastAsia="Times New Roman" w:hAnsi="Consolas" w:cs="Times New Roman"/>
+          <w:noProof w:val="0"/>
+          <w:color w:val="A31515"/>
+          <w:kern w:val="0"/>
+          <w:sz w:val="21"/>
+          <w:szCs w:val="21"/>
+          <w14:ligatures w14:val="none"/>
+        </w:rPr>
+        <w:t>input1</w:t>
+      </w:r>
+    </w:p>
+    <w:p>
+      <w:pPr>
+        <w:pBdr>
+          <w:top w:val="single" w:sz="4" w:space="1" w:color="auto"/>
+          <w:left w:val="single" w:sz="4" w:space="4" w:color="auto"/>
+          <w:bottom w:val="single" w:sz="4" w:space="1" w:color="auto"/>
+          <w:right w:val="single" w:sz="4" w:space="4" w:color="auto"/>
+        </w:pBdr>
+        <w:shd w:val="clear" w:color="auto" w:fill="FFFFFF"/>
+        <w:spacing w:after="0" w:line="285" w:lineRule="atLeast"/>
+        <w:rPr>
+          <w:rFonts w:ascii="Consolas" w:eastAsia="Times New Roman" w:hAnsi="Consolas" w:cs="Times New Roman"/>
+          <w:noProof w:val="0"/>
+          <w:color w:val="000000"/>
+          <w:kern w:val="0"/>
+          <w:sz w:val="21"/>
+          <w:szCs w:val="21"/>
+          <w14:ligatures w14:val="none"/>
+        </w:rPr>
+      </w:pPr>
+    </w:p>
+    <w:p>
+      <w:pPr>
+        <w:pBdr>
+          <w:top w:val="single" w:sz="4" w:space="1" w:color="auto"/>
+          <w:left w:val="single" w:sz="4" w:space="4" w:color="auto"/>
+          <w:bottom w:val="single" w:sz="4" w:space="1" w:color="auto"/>
+          <w:right w:val="single" w:sz="4" w:space="4" w:color="auto"/>
+        </w:pBdr>
+        <w:shd w:val="clear" w:color="auto" w:fill="FFFFFF"/>
+        <w:spacing w:after="0" w:line="285" w:lineRule="atLeast"/>
+        <w:rPr>
+          <w:rFonts w:ascii="Consolas" w:eastAsia="Times New Roman" w:hAnsi="Consolas" w:cs="Times New Roman"/>
+          <w:noProof w:val="0"/>
+          <w:color w:val="000000"/>
+          <w:kern w:val="0"/>
+          <w:sz w:val="21"/>
+          <w:szCs w:val="21"/>
+          <w14:ligatures w14:val="none"/>
+        </w:rPr>
+      </w:pPr>
+      <w:r>
+        <w:rPr>
+          <w:rFonts w:ascii="Consolas" w:eastAsia="Times New Roman" w:hAnsi="Consolas" w:cs="Times New Roman"/>
+          <w:noProof w:val="0"/>
+          <w:color w:val="008000"/>
+          <w:kern w:val="0"/>
+          <w:sz w:val="21"/>
+          <w:szCs w:val="21"/>
+          <w14:ligatures w14:val="none"/>
+        </w:rPr>
+        <w:t xml:space="preserve"># 3. </w:t>
+      </w:r>
+      <w:proofErr w:type="spellStart"/>
+      <w:r>
+        <w:rPr>
+          <w:rFonts w:ascii="Consolas" w:eastAsia="Times New Roman" w:hAnsi="Consolas" w:cs="Times New Roman"/>
+          <w:noProof w:val="0"/>
+          <w:color w:val="008000"/>
+          <w:kern w:val="0"/>
+          <w:sz w:val="21"/>
+          <w:szCs w:val="21"/>
+          <w14:ligatures w14:val="none"/>
+        </w:rPr>
+        <w:t>Chạy</w:t>
+      </w:r>
+      <w:proofErr w:type="spellEnd"/>
+      <w:r>
+        <w:rPr>
+          <w:rFonts w:ascii="Consolas" w:eastAsia="Times New Roman" w:hAnsi="Consolas" w:cs="Times New Roman"/>
+          <w:noProof w:val="0"/>
+          <w:color w:val="008000"/>
+          <w:kern w:val="0"/>
+          <w:sz w:val="21"/>
+          <w:szCs w:val="21"/>
+          <w14:ligatures w14:val="none"/>
+        </w:rPr>
+        <w:t xml:space="preserve"> </w:t>
+      </w:r>
+      <w:proofErr w:type="spellStart"/>
+      <w:r>
+        <w:rPr>
+          <w:rFonts w:ascii="Consolas" w:eastAsia="Times New Roman" w:hAnsi="Consolas" w:cs="Times New Roman"/>
+          <w:noProof w:val="0"/>
+          <w:color w:val="008000"/>
+          <w:kern w:val="0"/>
+          <w:sz w:val="21"/>
+          <w:szCs w:val="21"/>
+          <w14:ligatures w14:val="none"/>
+        </w:rPr>
+        <w:t>chương</w:t>
+      </w:r>
+      <w:proofErr w:type="spellEnd"/>
+      <w:r>
+        <w:rPr>
+          <w:rFonts w:ascii="Consolas" w:eastAsia="Times New Roman" w:hAnsi="Consolas" w:cs="Times New Roman"/>
+          <w:noProof w:val="0"/>
+          <w:color w:val="008000"/>
+          <w:kern w:val="0"/>
+          <w:sz w:val="21"/>
+          <w:szCs w:val="21"/>
+          <w14:ligatures w14:val="none"/>
+        </w:rPr>
+        <w:t xml:space="preserve"> </w:t>
+      </w:r>
+      <w:proofErr w:type="spellStart"/>
+      <w:r>
+        <w:rPr>
+          <w:rFonts w:ascii="Consolas" w:eastAsia="Times New Roman" w:hAnsi="Consolas" w:cs="Times New Roman"/>
+          <w:noProof w:val="0"/>
+          <w:color w:val="008000"/>
+          <w:kern w:val="0"/>
+          <w:sz w:val="21"/>
+          <w:szCs w:val="21"/>
+          <w14:ligatures w14:val="none"/>
+        </w:rPr>
+        <w:t>trình</w:t>
+      </w:r>
+      <w:proofErr w:type="spellEnd"/>
+      <w:r>
+        <w:rPr>
+          <w:rFonts w:ascii="Consolas" w:eastAsia="Times New Roman" w:hAnsi="Consolas" w:cs="Times New Roman"/>
+          <w:noProof w:val="0"/>
+          <w:color w:val="008000"/>
+          <w:kern w:val="0"/>
+          <w:sz w:val="21"/>
+          <w:szCs w:val="21"/>
+          <w14:ligatures w14:val="none"/>
+        </w:rPr>
+        <w:t xml:space="preserve"> MapReduce </w:t>
+      </w:r>
+      <w:proofErr w:type="spellStart"/>
+      <w:r>
+        <w:rPr>
+          <w:rFonts w:ascii="Consolas" w:eastAsia="Times New Roman" w:hAnsi="Consolas" w:cs="Times New Roman"/>
+          <w:noProof w:val="0"/>
+          <w:color w:val="008000"/>
+          <w:kern w:val="0"/>
+          <w:sz w:val="21"/>
+          <w:szCs w:val="21"/>
+          <w14:ligatures w14:val="none"/>
+        </w:rPr>
+        <w:t>WordCount</w:t>
+      </w:r>
+      <w:proofErr w:type="spellEnd"/>
+    </w:p>
+    <w:p>
+      <w:pPr>
+        <w:pBdr>
+          <w:top w:val="single" w:sz="4" w:space="1" w:color="auto"/>
+          <w:left w:val="single" w:sz="4" w:space="4" w:color="auto"/>
+          <w:bottom w:val="single" w:sz="4" w:space="1" w:color="auto"/>
+          <w:right w:val="single" w:sz="4" w:space="4" w:color="auto"/>
+        </w:pBdr>
+        <w:shd w:val="clear" w:color="auto" w:fill="FFFFFF"/>
+        <w:spacing w:after="0" w:line="285" w:lineRule="atLeast"/>
+        <w:rPr>
+          <w:rFonts w:ascii="Consolas" w:eastAsia="Times New Roman" w:hAnsi="Consolas" w:cs="Times New Roman"/>
+          <w:noProof w:val="0"/>
+          <w:color w:val="000000"/>
+          <w:kern w:val="0"/>
+          <w:sz w:val="21"/>
+          <w:szCs w:val="21"/>
+          <w14:ligatures w14:val="none"/>
+        </w:rPr>
+      </w:pPr>
+      <w:proofErr w:type="spellStart"/>
+      <w:r>
+        <w:rPr>
+          <w:rFonts w:ascii="Consolas" w:eastAsia="Times New Roman" w:hAnsi="Consolas" w:cs="Times New Roman"/>
+          <w:noProof w:val="0"/>
+          <w:color w:val="795E26"/>
+          <w:kern w:val="0"/>
+          <w:sz w:val="21"/>
+          <w:szCs w:val="21"/>
+          <w14:ligatures w14:val="none"/>
+        </w:rPr>
+        <w:t>hadoop</w:t>
+      </w:r>
+      <w:proofErr w:type="spellEnd"/>
+      <w:r>
+        <w:rPr>
+          <w:rFonts w:ascii="Consolas" w:eastAsia="Times New Roman" w:hAnsi="Consolas" w:cs="Times New Roman"/>
+          <w:noProof w:val="0"/>
+          <w:color w:val="000000"/>
+          <w:kern w:val="0"/>
+          <w:sz w:val="21"/>
+          <w:szCs w:val="21"/>
+          <w14:ligatures w14:val="none"/>
+        </w:rPr>
+        <w:t xml:space="preserve"> </w:t>
+      </w:r>
+      <w:r>
+        <w:rPr>
+          <w:rFonts w:ascii="Consolas" w:eastAsia="Times New Roman" w:hAnsi="Consolas" w:cs="Times New Roman"/>
+          <w:noProof w:val="0"/>
+          <w:color w:val="A31515"/>
+          <w:kern w:val="0"/>
+          <w:sz w:val="21"/>
+          <w:szCs w:val="21"/>
+          <w14:ligatures w14:val="none"/>
+        </w:rPr>
+        <w:t>jar</w:t>
+      </w:r>
+      <w:r>
+        <w:rPr>
+          <w:rFonts w:ascii="Consolas" w:eastAsia="Times New Roman" w:hAnsi="Consolas" w:cs="Times New Roman"/>
+          <w:noProof w:val="0"/>
+          <w:color w:val="000000"/>
+          <w:kern w:val="0"/>
+          <w:sz w:val="21"/>
+          <w:szCs w:val="21"/>
+          <w14:ligatures w14:val="none"/>
+        </w:rPr>
+        <w:t xml:space="preserve"> </w:t>
+      </w:r>
+      <w:r>
+        <w:rPr>
+          <w:rFonts w:ascii="Consolas" w:eastAsia="Times New Roman" w:hAnsi="Consolas" w:cs="Times New Roman"/>
+          <w:noProof w:val="0"/>
+          <w:color w:val="001080"/>
+          <w:kern w:val="0"/>
+          <w:sz w:val="21"/>
+          <w:szCs w:val="21"/>
+          <w14:ligatures w14:val="none"/>
+        </w:rPr>
+        <w:t>$HADOOP_HOME</w:t>
+      </w:r>
+      <w:r>
+        <w:rPr>
+          <w:rFonts w:ascii="Consolas" w:eastAsia="Times New Roman" w:hAnsi="Consolas" w:cs="Times New Roman"/>
+          <w:noProof w:val="0"/>
+          <w:color w:val="A31515"/>
+          <w:kern w:val="0"/>
+          <w:sz w:val="21"/>
+          <w:szCs w:val="21"/>
+          <w14:ligatures w14:val="none"/>
+        </w:rPr>
+        <w:t>/share/hadoop/mapreduce/hadoop-mapreduce-examples-3.5.0.jar</w:t>
+      </w:r>
+      <w:r>
+        <w:rPr>
+          <w:rFonts w:ascii="Consolas" w:eastAsia="Times New Roman" w:hAnsi="Consolas" w:cs="Times New Roman"/>
+          <w:noProof w:val="0"/>
+          <w:color w:val="000000"/>
+          <w:kern w:val="0"/>
+          <w:sz w:val="21"/>
+          <w:szCs w:val="21"/>
+          <w14:ligatures w14:val="none"/>
+        </w:rPr>
+        <w:t xml:space="preserve"> </w:t>
+      </w:r>
+      <w:r>
+        <w:rPr>
+          <w:rFonts w:ascii="Consolas" w:eastAsia="Times New Roman" w:hAnsi="Consolas" w:cs="Times New Roman"/>
+          <w:noProof w:val="0"/>
+          <w:color w:val="A31515"/>
+          <w:kern w:val="0"/>
+          <w:sz w:val="21"/>
+          <w:szCs w:val="21"/>
+          <w14:ligatures w14:val="none"/>
+        </w:rPr>
+        <w:t>wordcount</w:t>
+      </w:r>
+      <w:r>
+        <w:rPr>
+          <w:rFonts w:ascii="Consolas" w:eastAsia="Times New Roman" w:hAnsi="Consolas" w:cs="Times New Roman"/>
+          <w:noProof w:val="0"/>
+          <w:color w:val="000000"/>
+          <w:kern w:val="0"/>
+          <w:sz w:val="21"/>
+          <w:szCs w:val="21"/>
+          <w14:ligatures w14:val="none"/>
+        </w:rPr>
+        <w:t xml:space="preserve"> </w:t>
+      </w:r>
+      <w:r>
+        <w:rPr>
+          <w:rFonts w:ascii="Consolas" w:eastAsia="Times New Roman" w:hAnsi="Consolas" w:cs="Times New Roman"/>
+          <w:noProof w:val="0"/>
+          <w:color w:val="A31515"/>
+          <w:kern w:val="0"/>
+          <w:sz w:val="21"/>
+          <w:szCs w:val="21"/>
+          <w14:ligatures w14:val="none"/>
+        </w:rPr>
+        <w:t>input1</w:t>
+      </w:r>
+      <w:r>
+        <w:rPr>
+          <w:rFonts w:ascii="Consolas" w:eastAsia="Times New Roman" w:hAnsi="Consolas" w:cs="Times New Roman"/>
+          <w:noProof w:val="0"/>
+          <w:color w:val="000000"/>
+          <w:kern w:val="0"/>
+          <w:sz w:val="21"/>
+          <w:szCs w:val="21"/>
+          <w14:ligatures w14:val="none"/>
+        </w:rPr>
+        <w:t xml:space="preserve"> </w:t>
+      </w:r>
+      <w:r>
+        <w:rPr>
+          <w:rFonts w:ascii="Consolas" w:eastAsia="Times New Roman" w:hAnsi="Consolas" w:cs="Times New Roman"/>
+          <w:noProof w:val="0"/>
+          <w:color w:val="A31515"/>
+          <w:kern w:val="0"/>
+          <w:sz w:val="21"/>
+          <w:szCs w:val="21"/>
+          <w14:ligatures w14:val="none"/>
+        </w:rPr>
+        <w:t>output1</w:t>
+      </w:r>
+    </w:p>
+    <w:p>
+      <w:pPr>
+        <w:pBdr>
+          <w:top w:val="single" w:sz="4" w:space="1" w:color="auto"/>
+          <w:left w:val="single" w:sz="4" w:space="4" w:color="auto"/>
+          <w:bottom w:val="single" w:sz="4" w:space="1" w:color="auto"/>
+          <w:right w:val="single" w:sz="4" w:space="4" w:color="auto"/>
+        </w:pBdr>
+        <w:shd w:val="clear" w:color="auto" w:fill="FFFFFF"/>
+        <w:spacing w:after="0" w:line="285" w:lineRule="atLeast"/>
+        <w:rPr>
+          <w:rFonts w:ascii="Consolas" w:eastAsia="Times New Roman" w:hAnsi="Consolas" w:cs="Times New Roman"/>
+          <w:noProof w:val="0"/>
+          <w:color w:val="000000"/>
+          <w:kern w:val="0"/>
+          <w:sz w:val="21"/>
+          <w:szCs w:val="21"/>
+          <w14:ligatures w14:val="none"/>
+        </w:rPr>
+      </w:pPr>
+    </w:p>
+    <w:p>
+      <w:pPr>
+        <w:pBdr>
+          <w:top w:val="single" w:sz="4" w:space="1" w:color="auto"/>
+          <w:left w:val="single" w:sz="4" w:space="4" w:color="auto"/>
+          <w:bottom w:val="single" w:sz="4" w:space="1" w:color="auto"/>
+          <w:right w:val="single" w:sz="4" w:space="4" w:color="auto"/>
+        </w:pBdr>
+        <w:shd w:val="clear" w:color="auto" w:fill="FFFFFF"/>
+        <w:spacing w:after="0" w:line="285" w:lineRule="atLeast"/>
+        <w:rPr>
+          <w:rFonts w:ascii="Consolas" w:eastAsia="Times New Roman" w:hAnsi="Consolas" w:cs="Times New Roman"/>
+          <w:noProof w:val="0"/>
+          <w:color w:val="000000"/>
+          <w:kern w:val="0"/>
+          <w:sz w:val="21"/>
+          <w:szCs w:val="21"/>
+          <w14:ligatures w14:val="none"/>
+        </w:rPr>
+      </w:pPr>
+      <w:r>
+        <w:rPr>
+          <w:rFonts w:ascii="Consolas" w:eastAsia="Times New Roman" w:hAnsi="Consolas" w:cs="Times New Roman"/>
+          <w:noProof w:val="0"/>
+          <w:color w:val="008000"/>
+          <w:kern w:val="0"/>
+          <w:sz w:val="21"/>
+          <w:szCs w:val="21"/>
+          <w14:ligatures w14:val="none"/>
+        </w:rPr>
+        <w:t xml:space="preserve"># 4. In </w:t>
+      </w:r>
+      <w:proofErr w:type="spellStart"/>
+      <w:r>
+        <w:rPr>
+          <w:rFonts w:ascii="Consolas" w:eastAsia="Times New Roman" w:hAnsi="Consolas" w:cs="Times New Roman"/>
+          <w:noProof w:val="0"/>
+          <w:color w:val="008000"/>
+          <w:kern w:val="0"/>
+          <w:sz w:val="21"/>
+          <w:szCs w:val="21"/>
+          <w14:ligatures w14:val="none"/>
+        </w:rPr>
+        <w:t>nội</w:t>
+      </w:r>
+      <w:proofErr w:type="spellEnd"/>
+      <w:r>
+        <w:rPr>
+          <w:rFonts w:ascii="Consolas" w:eastAsia="Times New Roman" w:hAnsi="Consolas" w:cs="Times New Roman"/>
+          <w:noProof w:val="0"/>
+          <w:color w:val="008000"/>
+          <w:kern w:val="0"/>
+          <w:sz w:val="21"/>
+          <w:szCs w:val="21"/>
+          <w14:ligatures w14:val="none"/>
+        </w:rPr>
+        <w:t xml:space="preserve"> dung </w:t>
+      </w:r>
+      <w:proofErr w:type="spellStart"/>
+      <w:r>
+        <w:rPr>
+          <w:rFonts w:ascii="Consolas" w:eastAsia="Times New Roman" w:hAnsi="Consolas" w:cs="Times New Roman"/>
+          <w:noProof w:val="0"/>
+          <w:color w:val="008000"/>
+          <w:kern w:val="0"/>
+          <w:sz w:val="21"/>
+          <w:szCs w:val="21"/>
+          <w14:ligatures w14:val="none"/>
+        </w:rPr>
+        <w:t>các</w:t>
+      </w:r>
+      <w:proofErr w:type="spellEnd"/>
+      <w:r>
+        <w:rPr>
+          <w:rFonts w:ascii="Consolas" w:eastAsia="Times New Roman" w:hAnsi="Consolas" w:cs="Times New Roman"/>
+          <w:noProof w:val="0"/>
+          <w:color w:val="008000"/>
+          <w:kern w:val="0"/>
+          <w:sz w:val="21"/>
+          <w:szCs w:val="21"/>
+          <w14:ligatures w14:val="none"/>
+        </w:rPr>
+        <w:t xml:space="preserve"> file </w:t>
+      </w:r>
+      <w:proofErr w:type="spellStart"/>
+      <w:r>
+        <w:rPr>
+          <w:rFonts w:ascii="Consolas" w:eastAsia="Times New Roman" w:hAnsi="Consolas" w:cs="Times New Roman"/>
+          <w:noProof w:val="0"/>
+          <w:color w:val="008000"/>
+          <w:kern w:val="0"/>
+          <w:sz w:val="21"/>
+          <w:szCs w:val="21"/>
+          <w14:ligatures w14:val="none"/>
+        </w:rPr>
+        <w:t>đầu</w:t>
+      </w:r>
+      <w:proofErr w:type="spellEnd"/>
+      <w:r>
+        <w:rPr>
+          <w:rFonts w:ascii="Consolas" w:eastAsia="Times New Roman" w:hAnsi="Consolas" w:cs="Times New Roman"/>
+          <w:noProof w:val="0"/>
+          <w:color w:val="008000"/>
+          <w:kern w:val="0"/>
+          <w:sz w:val="21"/>
+          <w:szCs w:val="21"/>
+          <w14:ligatures w14:val="none"/>
+        </w:rPr>
+        <w:t xml:space="preserve"> </w:t>
+      </w:r>
+      <w:proofErr w:type="spellStart"/>
+      <w:r>
+        <w:rPr>
+          <w:rFonts w:ascii="Consolas" w:eastAsia="Times New Roman" w:hAnsi="Consolas" w:cs="Times New Roman"/>
+          <w:noProof w:val="0"/>
+          <w:color w:val="008000"/>
+          <w:kern w:val="0"/>
+          <w:sz w:val="21"/>
+          <w:szCs w:val="21"/>
+          <w14:ligatures w14:val="none"/>
+        </w:rPr>
+        <w:t>vào</w:t>
+      </w:r>
+      <w:proofErr w:type="spellEnd"/>
+      <w:r>
+        <w:rPr>
+          <w:rFonts w:ascii="Consolas" w:eastAsia="Times New Roman" w:hAnsi="Consolas" w:cs="Times New Roman"/>
+          <w:noProof w:val="0"/>
+          <w:color w:val="008000"/>
+          <w:kern w:val="0"/>
+          <w:sz w:val="21"/>
+          <w:szCs w:val="21"/>
+          <w14:ligatures w14:val="none"/>
+        </w:rPr>
+        <w:t xml:space="preserve"> </w:t>
+      </w:r>
+      <w:proofErr w:type="spellStart"/>
+      <w:r>
+        <w:rPr>
+          <w:rFonts w:ascii="Consolas" w:eastAsia="Times New Roman" w:hAnsi="Consolas" w:cs="Times New Roman"/>
+          <w:noProof w:val="0"/>
+          <w:color w:val="008000"/>
+          <w:kern w:val="0"/>
+          <w:sz w:val="21"/>
+          <w:szCs w:val="21"/>
+          <w14:ligatures w14:val="none"/>
+        </w:rPr>
+        <w:t>trên</w:t>
+      </w:r>
+      <w:proofErr w:type="spellEnd"/>
+      <w:r>
+        <w:rPr>
+          <w:rFonts w:ascii="Consolas" w:eastAsia="Times New Roman" w:hAnsi="Consolas" w:cs="Times New Roman"/>
+          <w:noProof w:val="0"/>
+          <w:color w:val="008000"/>
+          <w:kern w:val="0"/>
+          <w:sz w:val="21"/>
+          <w:szCs w:val="21"/>
+          <w14:ligatures w14:val="none"/>
+        </w:rPr>
+        <w:t xml:space="preserve"> HDFS</w:t>
+      </w:r>
+    </w:p>
+    <w:p>
+      <w:pPr>
+        <w:pBdr>
+          <w:top w:val="single" w:sz="4" w:space="1" w:color="auto"/>
+          <w:left w:val="single" w:sz="4" w:space="4" w:color="auto"/>
+          <w:bottom w:val="single" w:sz="4" w:space="1" w:color="auto"/>
+          <w:right w:val="single" w:sz="4" w:space="4" w:color="auto"/>
+        </w:pBdr>
+        <w:shd w:val="clear" w:color="auto" w:fill="FFFFFF"/>
+        <w:spacing w:after="0" w:line="285" w:lineRule="atLeast"/>
+        <w:rPr>
+          <w:rFonts w:ascii="Consolas" w:eastAsia="Times New Roman" w:hAnsi="Consolas" w:cs="Times New Roman"/>
+          <w:noProof w:val="0"/>
+          <w:color w:val="000000"/>
+          <w:kern w:val="0"/>
+          <w:sz w:val="21"/>
+          <w:szCs w:val="21"/>
+          <w14:ligatures w14:val="none"/>
+        </w:rPr>
+      </w:pPr>
+      <w:r>
+        <w:rPr>
+          <w:rFonts w:ascii="Consolas" w:eastAsia="Times New Roman" w:hAnsi="Consolas" w:cs="Times New Roman"/>
+          <w:noProof w:val="0"/>
+          <w:color w:val="795E26"/>
+          <w:kern w:val="0"/>
+          <w:sz w:val="21"/>
+          <w:szCs w:val="21"/>
+          <w14:ligatures w14:val="none"/>
+        </w:rPr>
+        <w:t>echo</w:t>
+      </w:r>
+      <w:r>
+        <w:rPr>
+          <w:rFonts w:ascii="Consolas" w:eastAsia="Times New Roman" w:hAnsi="Consolas" w:cs="Times New Roman"/>
+          <w:noProof w:val="0"/>
+          <w:color w:val="000000"/>
+          <w:kern w:val="0"/>
+          <w:sz w:val="21"/>
+          <w:szCs w:val="21"/>
+          <w14:ligatures w14:val="none"/>
+        </w:rPr>
+        <w:t xml:space="preserve"> </w:t>
+      </w:r>
+      <w:r>
+        <w:rPr>
+          <w:rFonts w:ascii="Consolas" w:eastAsia="Times New Roman" w:hAnsi="Consolas" w:cs="Times New Roman"/>
+          <w:noProof w:val="0"/>
+          <w:color w:val="0000FF"/>
+          <w:kern w:val="0"/>
+          <w:sz w:val="21"/>
+          <w:szCs w:val="21"/>
+          <w14:ligatures w14:val="none"/>
+        </w:rPr>
+        <w:t>-e</w:t>
+      </w:r>
+      <w:r>
+        <w:rPr>
+          <w:rFonts w:ascii="Consolas" w:eastAsia="Times New Roman" w:hAnsi="Consolas" w:cs="Times New Roman"/>
+          <w:noProof w:val="0"/>
+          <w:color w:val="000000"/>
+          <w:kern w:val="0"/>
+          <w:sz w:val="21"/>
+          <w:szCs w:val="21"/>
+          <w14:ligatures w14:val="none"/>
+        </w:rPr>
+        <w:t xml:space="preserve"> </w:t>
+      </w:r>
+      <w:r>
+        <w:rPr>
+          <w:rFonts w:ascii="Consolas" w:eastAsia="Times New Roman" w:hAnsi="Consolas" w:cs="Times New Roman"/>
+          <w:noProof w:val="0"/>
+          <w:color w:val="A31515"/>
+          <w:kern w:val="0"/>
+          <w:sz w:val="21"/>
+          <w:szCs w:val="21"/>
+          <w14:ligatures w14:val="none"/>
+        </w:rPr>
+        <w:t>"\</w:t>
+      </w:r>
+      <w:proofErr w:type="spellStart"/>
+      <w:r>
+        <w:rPr>
+          <w:rFonts w:ascii="Consolas" w:eastAsia="Times New Roman" w:hAnsi="Consolas" w:cs="Times New Roman"/>
+          <w:noProof w:val="0"/>
+          <w:color w:val="A31515"/>
+          <w:kern w:val="0"/>
+          <w:sz w:val="21"/>
+          <w:szCs w:val="21"/>
+          <w14:ligatures w14:val="none"/>
+        </w:rPr>
+        <w:t>ninput</w:t>
+      </w:r>
+      <w:proofErr w:type="spellEnd"/>
+      <w:r>
+        <w:rPr>
+          <w:rFonts w:ascii="Consolas" w:eastAsia="Times New Roman" w:hAnsi="Consolas" w:cs="Times New Roman"/>
+          <w:noProof w:val="0"/>
+          <w:color w:val="A31515"/>
+          <w:kern w:val="0"/>
+          <w:sz w:val="21"/>
+          <w:szCs w:val="21"/>
+          <w14:ligatures w14:val="none"/>
+        </w:rPr>
+        <w:t xml:space="preserve"> file1.txt:"</w:t>
+      </w:r>
+    </w:p>
+    <w:p>
+      <w:pPr>
+        <w:pBdr>
+          <w:top w:val="single" w:sz="4" w:space="1" w:color="auto"/>
+          <w:left w:val="single" w:sz="4" w:space="4" w:color="auto"/>
+          <w:bottom w:val="single" w:sz="4" w:space="1" w:color="auto"/>
+          <w:right w:val="single" w:sz="4" w:space="4" w:color="auto"/>
+        </w:pBdr>
+        <w:shd w:val="clear" w:color="auto" w:fill="FFFFFF"/>
+        <w:spacing w:after="0" w:line="285" w:lineRule="atLeast"/>
+        <w:rPr>
+          <w:rFonts w:ascii="Consolas" w:eastAsia="Times New Roman" w:hAnsi="Consolas" w:cs="Times New Roman"/>
+          <w:noProof w:val="0"/>
+          <w:color w:val="000000"/>
+          <w:kern w:val="0"/>
+          <w:sz w:val="21"/>
+          <w:szCs w:val="21"/>
+          <w14:ligatures w14:val="none"/>
+        </w:rPr>
+      </w:pPr>
+      <w:proofErr w:type="spellStart"/>
+      <w:r>
+        <w:rPr>
+          <w:rFonts w:ascii="Consolas" w:eastAsia="Times New Roman" w:hAnsi="Consolas" w:cs="Times New Roman"/>
+          <w:noProof w:val="0"/>
+          <w:color w:val="795E26"/>
+          <w:kern w:val="0"/>
+          <w:sz w:val="21"/>
+          <w:szCs w:val="21"/>
+          <w14:ligatures w14:val="none"/>
+        </w:rPr>
+        <w:t>hdfs</w:t>
+      </w:r>
+      <w:proofErr w:type="spellEnd"/>
+      <w:r>
+        <w:rPr>
+          <w:rFonts w:ascii="Consolas" w:eastAsia="Times New Roman" w:hAnsi="Consolas" w:cs="Times New Roman"/>
+          <w:noProof w:val="0"/>
+          <w:color w:val="000000"/>
+          <w:kern w:val="0"/>
+          <w:sz w:val="21"/>
+          <w:szCs w:val="21"/>
+          <w14:ligatures w14:val="none"/>
+        </w:rPr>
+        <w:t xml:space="preserve"> </w:t>
+      </w:r>
+      <w:proofErr w:type="spellStart"/>
+      <w:r>
+        <w:rPr>
+          <w:rFonts w:ascii="Consolas" w:eastAsia="Times New Roman" w:hAnsi="Consolas" w:cs="Times New Roman"/>
+          <w:noProof w:val="0"/>
+          <w:color w:val="A31515"/>
+          <w:kern w:val="0"/>
+          <w:sz w:val="21"/>
+          <w:szCs w:val="21"/>
+          <w14:ligatures w14:val="none"/>
+        </w:rPr>
+        <w:t>dfs</w:t>
+      </w:r>
+      <w:proofErr w:type="spellEnd"/>
+      <w:r>
+        <w:rPr>
+          <w:rFonts w:ascii="Consolas" w:eastAsia="Times New Roman" w:hAnsi="Consolas" w:cs="Times New Roman"/>
+          <w:noProof w:val="0"/>
+          <w:color w:val="000000"/>
+          <w:kern w:val="0"/>
+          <w:sz w:val="21"/>
+          <w:szCs w:val="21"/>
+          <w14:ligatures w14:val="none"/>
+        </w:rPr>
+        <w:t xml:space="preserve"> </w:t>
+      </w:r>
+      <w:r>
+        <w:rPr>
+          <w:rFonts w:ascii="Consolas" w:eastAsia="Times New Roman" w:hAnsi="Consolas" w:cs="Times New Roman"/>
+          <w:noProof w:val="0"/>
+          <w:color w:val="0000FF"/>
+          <w:kern w:val="0"/>
+          <w:sz w:val="21"/>
+          <w:szCs w:val="21"/>
+          <w14:ligatures w14:val="none"/>
+        </w:rPr>
+        <w:t>-cat</w:t>
+      </w:r>
+      <w:r>
+        <w:rPr>
+          <w:rFonts w:ascii="Consolas" w:eastAsia="Times New Roman" w:hAnsi="Consolas" w:cs="Times New Roman"/>
+          <w:noProof w:val="0"/>
+          <w:color w:val="000000"/>
+          <w:kern w:val="0"/>
+          <w:sz w:val="21"/>
+          <w:szCs w:val="21"/>
+          <w14:ligatures w14:val="none"/>
+        </w:rPr>
+        <w:t xml:space="preserve"> </w:t>
+      </w:r>
+      <w:r>
+        <w:rPr>
+          <w:rFonts w:ascii="Consolas" w:eastAsia="Times New Roman" w:hAnsi="Consolas" w:cs="Times New Roman"/>
+          <w:noProof w:val="0"/>
+          <w:color w:val="A31515"/>
+          <w:kern w:val="0"/>
+          <w:sz w:val="21"/>
+          <w:szCs w:val="21"/>
+          <w14:ligatures w14:val="none"/>
+        </w:rPr>
+        <w:t>input1/file1.txt</w:t>
+      </w:r>
+    </w:p>
+    <w:p>
+      <w:pPr>
+        <w:pBdr>
+          <w:top w:val="single" w:sz="4" w:space="1" w:color="auto"/>
+          <w:left w:val="single" w:sz="4" w:space="4" w:color="auto"/>
+          <w:bottom w:val="single" w:sz="4" w:space="1" w:color="auto"/>
+          <w:right w:val="single" w:sz="4" w:space="4" w:color="auto"/>
+        </w:pBdr>
+        <w:shd w:val="clear" w:color="auto" w:fill="FFFFFF"/>
+        <w:spacing w:after="0" w:line="285" w:lineRule="atLeast"/>
+        <w:rPr>
+          <w:rFonts w:ascii="Consolas" w:eastAsia="Times New Roman" w:hAnsi="Consolas" w:cs="Times New Roman"/>
+          <w:noProof w:val="0"/>
+          <w:color w:val="000000"/>
+          <w:kern w:val="0"/>
+          <w:sz w:val="21"/>
+          <w:szCs w:val="21"/>
+          <w14:ligatures w14:val="none"/>
+        </w:rPr>
+      </w:pPr>
+    </w:p>
+    <w:p>
+      <w:pPr>
+        <w:pBdr>
+          <w:top w:val="single" w:sz="4" w:space="1" w:color="auto"/>
+          <w:left w:val="single" w:sz="4" w:space="4" w:color="auto"/>
+          <w:bottom w:val="single" w:sz="4" w:space="1" w:color="auto"/>
+          <w:right w:val="single" w:sz="4" w:space="4" w:color="auto"/>
+        </w:pBdr>
+        <w:shd w:val="clear" w:color="auto" w:fill="FFFFFF"/>
+        <w:spacing w:after="0" w:line="285" w:lineRule="atLeast"/>
+        <w:rPr>
+          <w:rFonts w:ascii="Consolas" w:eastAsia="Times New Roman" w:hAnsi="Consolas" w:cs="Times New Roman"/>
+          <w:noProof w:val="0"/>
+          <w:color w:val="000000"/>
+          <w:kern w:val="0"/>
+          <w:sz w:val="21"/>
+          <w:szCs w:val="21"/>
+          <w14:ligatures w14:val="none"/>
+        </w:rPr>
+      </w:pPr>
+      <w:r>
+        <w:rPr>
+          <w:rFonts w:ascii="Consolas" w:eastAsia="Times New Roman" w:hAnsi="Consolas" w:cs="Times New Roman"/>
+          <w:noProof w:val="0"/>
+          <w:color w:val="795E26"/>
+          <w:kern w:val="0"/>
+          <w:sz w:val="21"/>
+          <w:szCs w:val="21"/>
+          <w14:ligatures w14:val="none"/>
+        </w:rPr>
+        <w:t>echo</w:t>
+      </w:r>
+      <w:r>
+        <w:rPr>
+          <w:rFonts w:ascii="Consolas" w:eastAsia="Times New Roman" w:hAnsi="Consolas" w:cs="Times New Roman"/>
+          <w:noProof w:val="0"/>
+          <w:color w:val="000000"/>
+          <w:kern w:val="0"/>
+          <w:sz w:val="21"/>
+          <w:szCs w:val="21"/>
+          <w14:ligatures w14:val="none"/>
+        </w:rPr>
+        <w:t xml:space="preserve"> </w:t>
+      </w:r>
+      <w:r>
+        <w:rPr>
+          <w:rFonts w:ascii="Consolas" w:eastAsia="Times New Roman" w:hAnsi="Consolas" w:cs="Times New Roman"/>
+          <w:noProof w:val="0"/>
+          <w:color w:val="0000FF"/>
+          <w:kern w:val="0"/>
+          <w:sz w:val="21"/>
+          <w:szCs w:val="21"/>
+          <w14:ligatures w14:val="none"/>
+        </w:rPr>
+        <w:t>-e</w:t>
+      </w:r>
+      <w:r>
+        <w:rPr>
+          <w:rFonts w:ascii="Consolas" w:eastAsia="Times New Roman" w:hAnsi="Consolas" w:cs="Times New Roman"/>
+          <w:noProof w:val="0"/>
+          <w:color w:val="000000"/>
+          <w:kern w:val="0"/>
+          <w:sz w:val="21"/>
+          <w:szCs w:val="21"/>
+          <w14:ligatures w14:val="none"/>
+        </w:rPr>
+        <w:t xml:space="preserve"> </w:t>
+      </w:r>
+      <w:r>
+        <w:rPr>
+          <w:rFonts w:ascii="Consolas" w:eastAsia="Times New Roman" w:hAnsi="Consolas" w:cs="Times New Roman"/>
+          <w:noProof w:val="0"/>
+          <w:color w:val="A31515"/>
+          <w:kern w:val="0"/>
+          <w:sz w:val="21"/>
+          <w:szCs w:val="21"/>
+          <w14:ligatures w14:val="none"/>
+        </w:rPr>
+        <w:t>"\</w:t>
+      </w:r>
+      <w:proofErr w:type="spellStart"/>
+      <w:r>
+        <w:rPr>
+          <w:rFonts w:ascii="Consolas" w:eastAsia="Times New Roman" w:hAnsi="Consolas" w:cs="Times New Roman"/>
+          <w:noProof w:val="0"/>
+          <w:color w:val="A31515"/>
+          <w:kern w:val="0"/>
+          <w:sz w:val="21"/>
+          <w:szCs w:val="21"/>
+          <w14:ligatures w14:val="none"/>
+        </w:rPr>
+        <w:t>ninput</w:t>
+      </w:r>
+      <w:proofErr w:type="spellEnd"/>
+      <w:r>
+        <w:rPr>
+          <w:rFonts w:ascii="Consolas" w:eastAsia="Times New Roman" w:hAnsi="Consolas" w:cs="Times New Roman"/>
+          <w:noProof w:val="0"/>
+          <w:color w:val="A31515"/>
+          <w:kern w:val="0"/>
+          <w:sz w:val="21"/>
+          <w:szCs w:val="21"/>
+          <w14:ligatures w14:val="none"/>
+        </w:rPr>
+        <w:t xml:space="preserve"> file2.txt:"</w:t>
+      </w:r>
+    </w:p>
+    <w:p>
+      <w:pPr>
+        <w:pBdr>
+          <w:top w:val="single" w:sz="4" w:space="1" w:color="auto"/>
+          <w:left w:val="single" w:sz="4" w:space="4" w:color="auto"/>
+          <w:bottom w:val="single" w:sz="4" w:space="1" w:color="auto"/>
+          <w:right w:val="single" w:sz="4" w:space="4" w:color="auto"/>
+        </w:pBdr>
+        <w:shd w:val="clear" w:color="auto" w:fill="FFFFFF"/>
+        <w:spacing w:after="0" w:line="285" w:lineRule="atLeast"/>
+        <w:rPr>
+          <w:rFonts w:ascii="Consolas" w:eastAsia="Times New Roman" w:hAnsi="Consolas" w:cs="Times New Roman"/>
+          <w:noProof w:val="0"/>
+          <w:color w:val="000000"/>
+          <w:kern w:val="0"/>
+          <w:sz w:val="21"/>
+          <w:szCs w:val="21"/>
+          <w14:ligatures w14:val="none"/>
+        </w:rPr>
+      </w:pPr>
+      <w:proofErr w:type="spellStart"/>
+      <w:r>
+        <w:rPr>
+          <w:rFonts w:ascii="Consolas" w:eastAsia="Times New Roman" w:hAnsi="Consolas" w:cs="Times New Roman"/>
+          <w:noProof w:val="0"/>
+          <w:color w:val="795E26"/>
+          <w:kern w:val="0"/>
+          <w:sz w:val="21"/>
+          <w:szCs w:val="21"/>
+          <w14:ligatures w14:val="none"/>
+        </w:rPr>
+        <w:t>hdfs</w:t>
+      </w:r>
+      <w:proofErr w:type="spellEnd"/>
+      <w:r>
+        <w:rPr>
+          <w:rFonts w:ascii="Consolas" w:eastAsia="Times New Roman" w:hAnsi="Consolas" w:cs="Times New Roman"/>
+          <w:noProof w:val="0"/>
+          <w:color w:val="000000"/>
+          <w:kern w:val="0"/>
+          <w:sz w:val="21"/>
+          <w:szCs w:val="21"/>
+          <w14:ligatures w14:val="none"/>
+        </w:rPr>
+        <w:t xml:space="preserve"> </w:t>
+      </w:r>
+      <w:proofErr w:type="spellStart"/>
+      <w:r>
+        <w:rPr>
+          <w:rFonts w:ascii="Consolas" w:eastAsia="Times New Roman" w:hAnsi="Consolas" w:cs="Times New Roman"/>
+          <w:noProof w:val="0"/>
+          <w:color w:val="A31515"/>
+          <w:kern w:val="0"/>
+          <w:sz w:val="21"/>
+          <w:szCs w:val="21"/>
+          <w14:ligatures w14:val="none"/>
+        </w:rPr>
+        <w:t>dfs</w:t>
+      </w:r>
+      <w:proofErr w:type="spellEnd"/>
+      <w:r>
+        <w:rPr>
+          <w:rFonts w:ascii="Consolas" w:eastAsia="Times New Roman" w:hAnsi="Consolas" w:cs="Times New Roman"/>
+          <w:noProof w:val="0"/>
+          <w:color w:val="000000"/>
+          <w:kern w:val="0"/>
+          <w:sz w:val="21"/>
+          <w:szCs w:val="21"/>
+          <w14:ligatures w14:val="none"/>
+        </w:rPr>
+        <w:t xml:space="preserve"> </w:t>
+      </w:r>
+      <w:r>
+        <w:rPr>
+          <w:rFonts w:ascii="Consolas" w:eastAsia="Times New Roman" w:hAnsi="Consolas" w:cs="Times New Roman"/>
+          <w:noProof w:val="0"/>
+          <w:color w:val="0000FF"/>
+          <w:kern w:val="0"/>
+          <w:sz w:val="21"/>
+          <w:szCs w:val="21"/>
+          <w14:ligatures w14:val="none"/>
+        </w:rPr>
+        <w:t>-cat</w:t>
+      </w:r>
+      <w:r>
+        <w:rPr>
+          <w:rFonts w:ascii="Consolas" w:eastAsia="Times New Roman" w:hAnsi="Consolas" w:cs="Times New Roman"/>
+          <w:noProof w:val="0"/>
+          <w:color w:val="000000"/>
+          <w:kern w:val="0"/>
+          <w:sz w:val="21"/>
+          <w:szCs w:val="21"/>
+          <w14:ligatures w14:val="none"/>
+        </w:rPr>
+        <w:t xml:space="preserve"> </w:t>
+      </w:r>
+      <w:r>
+        <w:rPr>
+          <w:rFonts w:ascii="Consolas" w:eastAsia="Times New Roman" w:hAnsi="Consolas" w:cs="Times New Roman"/>
+          <w:noProof w:val="0"/>
+          <w:color w:val="A31515"/>
+          <w:kern w:val="0"/>
+          <w:sz w:val="21"/>
+          <w:szCs w:val="21"/>
+          <w14:ligatures w14:val="none"/>
+        </w:rPr>
+        <w:t>input1/file2.txt</w:t>
+      </w:r>
+    </w:p>
+    <w:p>
+      <w:pPr>
+        <w:pBdr>
+          <w:top w:val="single" w:sz="4" w:space="1" w:color="auto"/>
+          <w:left w:val="single" w:sz="4" w:space="4" w:color="auto"/>
+          <w:bottom w:val="single" w:sz="4" w:space="1" w:color="auto"/>
+          <w:right w:val="single" w:sz="4" w:space="4" w:color="auto"/>
+        </w:pBdr>
+        <w:shd w:val="clear" w:color="auto" w:fill="FFFFFF"/>
+        <w:spacing w:after="0" w:line="285" w:lineRule="atLeast"/>
+        <w:rPr>
+          <w:rFonts w:ascii="Consolas" w:eastAsia="Times New Roman" w:hAnsi="Consolas" w:cs="Times New Roman"/>
+          <w:noProof w:val="0"/>
+          <w:color w:val="000000"/>
+          <w:kern w:val="0"/>
+          <w:sz w:val="21"/>
+          <w:szCs w:val="21"/>
+          <w14:ligatures w14:val="none"/>
+        </w:rPr>
+      </w:pPr>
+    </w:p>
+    <w:p>
+      <w:pPr>
+        <w:pBdr>
+          <w:top w:val="single" w:sz="4" w:space="1" w:color="auto"/>
+          <w:left w:val="single" w:sz="4" w:space="4" w:color="auto"/>
+          <w:bottom w:val="single" w:sz="4" w:space="1" w:color="auto"/>
+          <w:right w:val="single" w:sz="4" w:space="4" w:color="auto"/>
+        </w:pBdr>
+        <w:shd w:val="clear" w:color="auto" w:fill="FFFFFF"/>
+        <w:spacing w:after="0" w:line="285" w:lineRule="atLeast"/>
+        <w:rPr>
+          <w:rFonts w:ascii="Consolas" w:eastAsia="Times New Roman" w:hAnsi="Consolas" w:cs="Times New Roman"/>
+          <w:noProof w:val="0"/>
+          <w:color w:val="000000"/>
+          <w:kern w:val="0"/>
+          <w:sz w:val="21"/>
+          <w:szCs w:val="21"/>
+          <w14:ligatures w14:val="none"/>
+        </w:rPr>
+      </w:pPr>
+      <w:r>
+        <w:rPr>
+          <w:rFonts w:ascii="Consolas" w:eastAsia="Times New Roman" w:hAnsi="Consolas" w:cs="Times New Roman"/>
+          <w:noProof w:val="0"/>
+          <w:color w:val="008000"/>
+          <w:kern w:val="0"/>
+          <w:sz w:val="21"/>
+          <w:szCs w:val="21"/>
+          <w14:ligatures w14:val="none"/>
+        </w:rPr>
+        <w:t xml:space="preserve"># 5. In </w:t>
+      </w:r>
+      <w:proofErr w:type="spellStart"/>
+      <w:r>
+        <w:rPr>
+          <w:rFonts w:ascii="Consolas" w:eastAsia="Times New Roman" w:hAnsi="Consolas" w:cs="Times New Roman"/>
+          <w:noProof w:val="0"/>
+          <w:color w:val="008000"/>
+          <w:kern w:val="0"/>
+          <w:sz w:val="21"/>
+          <w:szCs w:val="21"/>
+          <w14:ligatures w14:val="none"/>
+        </w:rPr>
+        <w:t>kết</w:t>
+      </w:r>
+      <w:proofErr w:type="spellEnd"/>
+      <w:r>
+        <w:rPr>
+          <w:rFonts w:ascii="Consolas" w:eastAsia="Times New Roman" w:hAnsi="Consolas" w:cs="Times New Roman"/>
+          <w:noProof w:val="0"/>
+          <w:color w:val="008000"/>
+          <w:kern w:val="0"/>
+          <w:sz w:val="21"/>
+          <w:szCs w:val="21"/>
+          <w14:ligatures w14:val="none"/>
+        </w:rPr>
+        <w:t xml:space="preserve"> </w:t>
+      </w:r>
+      <w:proofErr w:type="spellStart"/>
+      <w:r>
+        <w:rPr>
+          <w:rFonts w:ascii="Consolas" w:eastAsia="Times New Roman" w:hAnsi="Consolas" w:cs="Times New Roman"/>
+          <w:noProof w:val="0"/>
+          <w:color w:val="008000"/>
+          <w:kern w:val="0"/>
+          <w:sz w:val="21"/>
+          <w:szCs w:val="21"/>
+          <w14:ligatures w14:val="none"/>
+        </w:rPr>
+        <w:t>quả</w:t>
+      </w:r>
+      <w:proofErr w:type="spellEnd"/>
+      <w:r>
+        <w:rPr>
+          <w:rFonts w:ascii="Consolas" w:eastAsia="Times New Roman" w:hAnsi="Consolas" w:cs="Times New Roman"/>
+          <w:noProof w:val="0"/>
+          <w:color w:val="008000"/>
+          <w:kern w:val="0"/>
+          <w:sz w:val="21"/>
+          <w:szCs w:val="21"/>
+          <w14:ligatures w14:val="none"/>
+        </w:rPr>
+        <w:t xml:space="preserve"> </w:t>
+      </w:r>
+      <w:proofErr w:type="spellStart"/>
+      <w:r>
+        <w:rPr>
+          <w:rFonts w:ascii="Consolas" w:eastAsia="Times New Roman" w:hAnsi="Consolas" w:cs="Times New Roman"/>
+          <w:noProof w:val="0"/>
+          <w:color w:val="008000"/>
+          <w:kern w:val="0"/>
+          <w:sz w:val="21"/>
+          <w:szCs w:val="21"/>
+          <w14:ligatures w14:val="none"/>
+        </w:rPr>
+        <w:t>đầu</w:t>
+      </w:r>
+      <w:proofErr w:type="spellEnd"/>
+      <w:r>
+        <w:rPr>
+          <w:rFonts w:ascii="Consolas" w:eastAsia="Times New Roman" w:hAnsi="Consolas" w:cs="Times New Roman"/>
+          <w:noProof w:val="0"/>
+          <w:color w:val="008000"/>
+          <w:kern w:val="0"/>
+          <w:sz w:val="21"/>
+          <w:szCs w:val="21"/>
+          <w14:ligatures w14:val="none"/>
+        </w:rPr>
+        <w:t xml:space="preserve"> </w:t>
+      </w:r>
+      <w:proofErr w:type="spellStart"/>
+      <w:r>
+        <w:rPr>
+          <w:rFonts w:ascii="Consolas" w:eastAsia="Times New Roman" w:hAnsi="Consolas" w:cs="Times New Roman"/>
+          <w:noProof w:val="0"/>
+          <w:color w:val="008000"/>
+          <w:kern w:val="0"/>
+          <w:sz w:val="21"/>
+          <w:szCs w:val="21"/>
+          <w14:ligatures w14:val="none"/>
+        </w:rPr>
+        <w:t>ra</w:t>
+      </w:r>
+      <w:proofErr w:type="spellEnd"/>
+      <w:r>
+        <w:rPr>
+          <w:rFonts w:ascii="Consolas" w:eastAsia="Times New Roman" w:hAnsi="Consolas" w:cs="Times New Roman"/>
+          <w:noProof w:val="0"/>
+          <w:color w:val="008000"/>
+          <w:kern w:val="0"/>
+          <w:sz w:val="21"/>
+          <w:szCs w:val="21"/>
+          <w14:ligatures w14:val="none"/>
+        </w:rPr>
+        <w:t xml:space="preserve"> </w:t>
+      </w:r>
+      <w:proofErr w:type="spellStart"/>
+      <w:r>
+        <w:rPr>
+          <w:rFonts w:ascii="Consolas" w:eastAsia="Times New Roman" w:hAnsi="Consolas" w:cs="Times New Roman"/>
+          <w:noProof w:val="0"/>
+          <w:color w:val="008000"/>
+          <w:kern w:val="0"/>
+          <w:sz w:val="21"/>
+          <w:szCs w:val="21"/>
+          <w14:ligatures w14:val="none"/>
+        </w:rPr>
+        <w:t>của</w:t>
+      </w:r>
+      <w:proofErr w:type="spellEnd"/>
+      <w:r>
+        <w:rPr>
+          <w:rFonts w:ascii="Consolas" w:eastAsia="Times New Roman" w:hAnsi="Consolas" w:cs="Times New Roman"/>
+          <w:noProof w:val="0"/>
+          <w:color w:val="008000"/>
+          <w:kern w:val="0"/>
+          <w:sz w:val="21"/>
+          <w:szCs w:val="21"/>
+          <w14:ligatures w14:val="none"/>
+        </w:rPr>
+        <w:t xml:space="preserve"> </w:t>
+      </w:r>
+      <w:proofErr w:type="spellStart"/>
+      <w:r>
+        <w:rPr>
+          <w:rFonts w:ascii="Consolas" w:eastAsia="Times New Roman" w:hAnsi="Consolas" w:cs="Times New Roman"/>
+          <w:noProof w:val="0"/>
+          <w:color w:val="008000"/>
+          <w:kern w:val="0"/>
+          <w:sz w:val="21"/>
+          <w:szCs w:val="21"/>
+          <w14:ligatures w14:val="none"/>
+        </w:rPr>
+        <w:t>WordCount</w:t>
+      </w:r>
+      <w:proofErr w:type="spellEnd"/>
+    </w:p>
+    <w:p>
+      <w:pPr>
+        <w:pBdr>
+          <w:top w:val="single" w:sz="4" w:space="1" w:color="auto"/>
+          <w:left w:val="single" w:sz="4" w:space="4" w:color="auto"/>
+          <w:bottom w:val="single" w:sz="4" w:space="1" w:color="auto"/>
+          <w:right w:val="single" w:sz="4" w:space="4" w:color="auto"/>
+        </w:pBdr>
+        <w:shd w:val="clear" w:color="auto" w:fill="FFFFFF"/>
+        <w:spacing w:after="0" w:line="285" w:lineRule="atLeast"/>
+        <w:rPr>
+          <w:rFonts w:ascii="Consolas" w:eastAsia="Times New Roman" w:hAnsi="Consolas" w:cs="Times New Roman"/>
+          <w:noProof w:val="0"/>
+          <w:color w:val="000000"/>
+          <w:kern w:val="0"/>
+          <w:sz w:val="21"/>
+          <w:szCs w:val="21"/>
+          <w14:ligatures w14:val="none"/>
+        </w:rPr>
+      </w:pPr>
+      <w:r>
+        <w:rPr>
+          <w:rFonts w:ascii="Consolas" w:eastAsia="Times New Roman" w:hAnsi="Consolas" w:cs="Times New Roman"/>
+          <w:noProof w:val="0"/>
+          <w:color w:val="795E26"/>
+          <w:kern w:val="0"/>
+          <w:sz w:val="21"/>
+          <w:szCs w:val="21"/>
+          <w14:ligatures w14:val="none"/>
+        </w:rPr>
+        <w:t>echo</w:t>
+      </w:r>
+      <w:r>
+        <w:rPr>
+          <w:rFonts w:ascii="Consolas" w:eastAsia="Times New Roman" w:hAnsi="Consolas" w:cs="Times New Roman"/>
+          <w:noProof w:val="0"/>
+          <w:color w:val="000000"/>
+          <w:kern w:val="0"/>
+          <w:sz w:val="21"/>
+          <w:szCs w:val="21"/>
+          <w14:ligatures w14:val="none"/>
+        </w:rPr>
+        <w:t xml:space="preserve"> </w:t>
+      </w:r>
+      <w:r>
+        <w:rPr>
+          <w:rFonts w:ascii="Consolas" w:eastAsia="Times New Roman" w:hAnsi="Consolas" w:cs="Times New Roman"/>
+          <w:noProof w:val="0"/>
+          <w:color w:val="0000FF"/>
+          <w:kern w:val="0"/>
+          <w:sz w:val="21"/>
+          <w:szCs w:val="21"/>
+          <w14:ligatures w14:val="none"/>
+        </w:rPr>
+        <w:t>-e</w:t>
+      </w:r>
+      <w:r>
+        <w:rPr>
+          <w:rFonts w:ascii="Consolas" w:eastAsia="Times New Roman" w:hAnsi="Consolas" w:cs="Times New Roman"/>
+          <w:noProof w:val="0"/>
+          <w:color w:val="000000"/>
+          <w:kern w:val="0"/>
+          <w:sz w:val="21"/>
+          <w:szCs w:val="21"/>
+          <w14:ligatures w14:val="none"/>
+        </w:rPr>
+        <w:t xml:space="preserve"> </w:t>
+      </w:r>
+      <w:r>
+        <w:rPr>
+          <w:rFonts w:ascii="Consolas" w:eastAsia="Times New Roman" w:hAnsi="Consolas" w:cs="Times New Roman"/>
+          <w:noProof w:val="0"/>
+          <w:color w:val="A31515"/>
+          <w:kern w:val="0"/>
+          <w:sz w:val="21"/>
+          <w:szCs w:val="21"/>
+          <w14:ligatures w14:val="none"/>
+        </w:rPr>
+        <w:t>"\</w:t>
+      </w:r>
+      <w:proofErr w:type="spellStart"/>
+      <w:r>
+        <w:rPr>
+          <w:rFonts w:ascii="Consolas" w:eastAsia="Times New Roman" w:hAnsi="Consolas" w:cs="Times New Roman"/>
+          <w:noProof w:val="0"/>
+          <w:color w:val="A31515"/>
+          <w:kern w:val="0"/>
+          <w:sz w:val="21"/>
+          <w:szCs w:val="21"/>
+          <w14:ligatures w14:val="none"/>
+        </w:rPr>
+        <w:t>nwordcount</w:t>
+      </w:r>
+      <w:proofErr w:type="spellEnd"/>
+      <w:r>
+        <w:rPr>
+          <w:rFonts w:ascii="Consolas" w:eastAsia="Times New Roman" w:hAnsi="Consolas" w:cs="Times New Roman"/>
+          <w:noProof w:val="0"/>
+          <w:color w:val="A31515"/>
+          <w:kern w:val="0"/>
+          <w:sz w:val="21"/>
+          <w:szCs w:val="21"/>
+          <w14:ligatures w14:val="none"/>
+        </w:rPr>
+        <w:t xml:space="preserve"> output:"</w:t>
+      </w:r>
+    </w:p>
+    <w:p>
+      <w:pPr>
+        <w:pBdr>
+          <w:top w:val="single" w:sz="4" w:space="1" w:color="auto"/>
+          <w:left w:val="single" w:sz="4" w:space="4" w:color="auto"/>
+          <w:bottom w:val="single" w:sz="4" w:space="1" w:color="auto"/>
+          <w:right w:val="single" w:sz="4" w:space="4" w:color="auto"/>
+        </w:pBdr>
+        <w:shd w:val="clear" w:color="auto" w:fill="FFFFFF"/>
+        <w:spacing w:after="0" w:line="285" w:lineRule="atLeast"/>
+        <w:rPr>
+          <w:rFonts w:ascii="Consolas" w:eastAsia="Times New Roman" w:hAnsi="Consolas" w:cs="Times New Roman"/>
+          <w:noProof w:val="0"/>
+          <w:color w:val="000000"/>
+          <w:kern w:val="0"/>
+          <w:sz w:val="21"/>
+          <w:szCs w:val="21"/>
+          <w14:ligatures w14:val="none"/>
+        </w:rPr>
+      </w:pPr>
+      <w:proofErr w:type="spellStart"/>
+      <w:r>
+        <w:rPr>
+          <w:rFonts w:ascii="Consolas" w:eastAsia="Times New Roman" w:hAnsi="Consolas" w:cs="Times New Roman"/>
+          <w:noProof w:val="0"/>
+          <w:color w:val="795E26"/>
+          <w:kern w:val="0"/>
+          <w:sz w:val="21"/>
+          <w:szCs w:val="21"/>
+          <w14:ligatures w14:val="none"/>
+        </w:rPr>
+        <w:t>hdfs</w:t>
+      </w:r>
+      <w:proofErr w:type="spellEnd"/>
+      <w:r>
+        <w:rPr>
+          <w:rFonts w:ascii="Consolas" w:eastAsia="Times New Roman" w:hAnsi="Consolas" w:cs="Times New Roman"/>
+          <w:noProof w:val="0"/>
+          <w:color w:val="000000"/>
+          <w:kern w:val="0"/>
+          <w:sz w:val="21"/>
+          <w:szCs w:val="21"/>
+          <w14:ligatures w14:val="none"/>
+        </w:rPr>
+        <w:t xml:space="preserve"> </w:t>
+      </w:r>
+      <w:proofErr w:type="spellStart"/>
+      <w:r>
+        <w:rPr>
+          <w:rFonts w:ascii="Consolas" w:eastAsia="Times New Roman" w:hAnsi="Consolas" w:cs="Times New Roman"/>
+          <w:noProof w:val="0"/>
+          <w:color w:val="A31515"/>
+          <w:kern w:val="0"/>
+          <w:sz w:val="21"/>
+          <w:szCs w:val="21"/>
+          <w14:ligatures w14:val="none"/>
+        </w:rPr>
+        <w:t>dfs</w:t>
+      </w:r>
+      <w:proofErr w:type="spellEnd"/>
+      <w:r>
+        <w:rPr>
+          <w:rFonts w:ascii="Consolas" w:eastAsia="Times New Roman" w:hAnsi="Consolas" w:cs="Times New Roman"/>
+          <w:noProof w:val="0"/>
+          <w:color w:val="000000"/>
+          <w:kern w:val="0"/>
+          <w:sz w:val="21"/>
+          <w:szCs w:val="21"/>
+          <w14:ligatures w14:val="none"/>
+        </w:rPr>
+        <w:t xml:space="preserve"> </w:t>
+      </w:r>
+      <w:r>
+        <w:rPr>
+          <w:rFonts w:ascii="Consolas" w:eastAsia="Times New Roman" w:hAnsi="Consolas" w:cs="Times New Roman"/>
+          <w:noProof w:val="0"/>
+          <w:color w:val="0000FF"/>
+          <w:kern w:val="0"/>
+          <w:sz w:val="21"/>
+          <w:szCs w:val="21"/>
+          <w14:ligatures w14:val="none"/>
+        </w:rPr>
+        <w:t>-cat</w:t>
+      </w:r>
+      <w:r>
+        <w:rPr>
+          <w:rFonts w:ascii="Consolas" w:eastAsia="Times New Roman" w:hAnsi="Consolas" w:cs="Times New Roman"/>
+          <w:noProof w:val="0"/>
+          <w:color w:val="000000"/>
+          <w:kern w:val="0"/>
+          <w:sz w:val="21"/>
+          <w:szCs w:val="21"/>
+          <w14:ligatures w14:val="none"/>
+        </w:rPr>
+        <w:t xml:space="preserve"> </w:t>
+      </w:r>
+      <w:r>
+        <w:rPr>
+          <w:rFonts w:ascii="Consolas" w:eastAsia="Times New Roman" w:hAnsi="Consolas" w:cs="Times New Roman"/>
+          <w:noProof w:val="0"/>
+          <w:color w:val="A31515"/>
+          <w:kern w:val="0"/>
+          <w:sz w:val="21"/>
+          <w:szCs w:val="21"/>
+          <w14:ligatures w14:val="none"/>
+        </w:rPr>
+        <w:t>output1/part-r-00000</w:t>
+      </w:r>
+    </w:p>
+    <w:p>
+      <w:pPr>
+        <w:pStyle w:val="Nidung"/>
+        <w:rPr>
+          <w:lang w:val="vi-VN"/>
+        </w:rPr>
+      </w:pPr>
+    </w:p>
+    <w:p>
+      <w:pPr>
+        <w:pStyle w:val="Nidung"/>
+        <w:rPr>
+          <w:lang w:val="vi-VN"/>
+        </w:rPr>
+      </w:pPr>
+      <w:r>
+        <w:rPr>
+          <w:lang w:val="vi-VN"/>
+        </w:rPr>
+        <w:t>Copy vào máy ảo thông qua thư mục test_bigdata được mount vào máy ảo</w:t>
+      </w:r>
+    </w:p>
+    <w:p>
+      <w:pPr>
+        <w:pStyle w:val="Nidung"/>
+        <w:jc w:val="center"/>
+      </w:pPr>
+      <w:r>
+        <w:drawing>
+          <wp:inline distT="0" distB="0" distL="0" distR="0" wp14:anchorId="1D7435C9" wp14:editId="0E403451">
+            <wp:extent cx="3749365" cy="1150720"/>
+            <wp:effectExtent l="0" t="0" r="3810" b="0"/>
+            <wp:docPr id="1179003583" name="Picture 1"/>
+            <wp:cNvGraphicFramePr>
+              <a:graphicFrameLocks xmlns:a="http://schemas.openxmlformats.org/drawingml/2006/main" noChangeAspect="1"/>
+            </wp:cNvGraphicFramePr>
+            <a:graphic xmlns:a="http://schemas.openxmlformats.org/drawingml/2006/main">
+              <a:graphicData uri="http://schemas.openxmlformats.org/drawingml/2006/picture">
+                <pic:pic xmlns:pic="http://schemas.openxmlformats.org/drawingml/2006/picture">
+                  <pic:nvPicPr>
+                    <pic:cNvPr id="1179003583" name=""/>
+                    <pic:cNvPicPr/>
+                  </pic:nvPicPr>
+                  <pic:blipFill>
+                    <a:blip r:embed="rId32"/>
+                    <a:stretch>
+                      <a:fillRect/>
+                    </a:stretch>
+                  </pic:blipFill>
+                  <pic:spPr>
+                    <a:xfrm>
+                      <a:off x="0" y="0"/>
+                      <a:ext cx="3749365" cy="1150720"/>
+                    </a:xfrm>
+                    <a:prstGeom prst="rect">
+                      <a:avLst/>
+                    </a:prstGeom>
+                  </pic:spPr>
+                </pic:pic>
+              </a:graphicData>
+            </a:graphic>
+          </wp:inline>
+        </w:drawing>
+      </w:r>
+    </w:p>
+    <w:p>
+      <w:pPr>
+        <w:pStyle w:val="Nidung"/>
+        <w:rPr>
+          <w:lang w:val="vi-VN"/>
+        </w:rPr>
+      </w:pPr>
+    </w:p>
+    <w:p>
+      <w:pPr>
+        <w:pStyle w:val="Heading4"/>
+        <w:rPr>
+          <w:lang w:val="vi-VN"/>
+        </w:rPr>
+      </w:pPr>
+      <w:r>
+        <w:t>Chạy</w:t>
+      </w:r>
+      <w:r>
+        <w:rPr>
+          <w:lang w:val="vi-VN"/>
+        </w:rPr>
+        <w:t xml:space="preserve"> thử</w:t>
+      </w:r>
+      <w:r>
+        <w:rPr>
+          <w:lang w:val="vi-VN"/>
+        </w:rPr>
+        <w:t xml:space="preserve"> và đọc kết quả</w:t>
+      </w:r>
+    </w:p>
+    <w:p>
+      <w:pPr>
+        <w:pStyle w:val="Nidung"/>
+      </w:pPr>
+    </w:p>
+    <w:p>
+      <w:pPr>
+        <w:pStyle w:val="Nidung"/>
+        <w:rPr>
+          <w:lang w:val="vi-VN"/>
+        </w:rPr>
+      </w:pPr>
+    </w:p>
+    <w:p>
+      <w:pPr>
+        <w:pStyle w:val="Nidung"/>
+        <w:rPr>
+          <w:lang w:val="vi-VN"/>
         </w:rPr>
       </w:pPr>
       <w:r>
@@ -18786,7 +23131,7 @@
       <w:r>
         <w:t xml:space="preserve">Shivam Bansal, “Netflix Movies and TV Shows,” Kaggle. [Trực tuyến]. Có tại: </w:t>
       </w:r>
-      <w:hyperlink r:id="rId15" w:history="1">
+      <w:hyperlink r:id="rId33" w:history="1">
         <w:r>
           <w:rPr>
             <w:rStyle w:val="Hyperlink"/>
@@ -18805,7 +23150,7 @@
       <w:r>
         <w:t xml:space="preserve">Microsoft, “Power BI report and dashboard creation documentation,” Microsoft Learn. [Trực tuyến]. Có tại: </w:t>
       </w:r>
-      <w:hyperlink r:id="rId16" w:history="1">
+      <w:hyperlink r:id="rId34" w:history="1">
         <w:r>
           <w:rPr>
             <w:rStyle w:val="Hyperlink"/>
@@ -18824,7 +23169,7 @@
       <w:r>
         <w:t xml:space="preserve">pandas Development Team, “User Guide” pandas Documentation. [Trực tuyến]. Có tại: </w:t>
       </w:r>
-      <w:hyperlink r:id="rId17" w:history="1">
+      <w:hyperlink r:id="rId35" w:history="1">
         <w:r>
           <w:rPr>
             <w:rStyle w:val="Hyperlink"/>
@@ -18843,7 +23188,7 @@
       <w:r>
         <w:t xml:space="preserve">scikit-learn developers, “LinearRegression”, scikit-learn Documentation. [Trực tuyến]. Có tại: </w:t>
       </w:r>
-      <w:hyperlink r:id="rId18" w:history="1">
+      <w:hyperlink r:id="rId36" w:history="1">
         <w:r>
           <w:rPr>
             <w:rStyle w:val="Hyperlink"/>
@@ -18862,7 +23207,7 @@
       <w:r>
         <w:t xml:space="preserve">scikit-learn developers, “Model evaluation,” scikit-learn Documentation. [Trực tuyến]. Có tại: </w:t>
       </w:r>
-      <w:hyperlink r:id="rId19" w:history="1">
+      <w:hyperlink r:id="rId37" w:history="1">
         <w:r>
           <w:rPr>
             <w:rStyle w:val="Hyperlink"/>

</xml_diff>

<commit_message>
feat(config): update port range for the yarn manager
</commit_message>
<xml_diff>
--- a/docs/baocao.docx
+++ b/docs/baocao.docx
@@ -6666,9 +6666,63 @@
     <w:p>
       <w:pPr>
         <w:pStyle w:val="Nidung"/>
+        <w:pBdr>
+          <w:top w:val="single" w:sz="4" w:space="1" w:color="auto"/>
+          <w:left w:val="single" w:sz="4" w:space="4" w:color="auto"/>
+          <w:bottom w:val="single" w:sz="4" w:space="1" w:color="auto"/>
+          <w:right w:val="single" w:sz="4" w:space="4" w:color="auto"/>
+        </w:pBdr>
         <w:rPr>
           <w:lang w:val="vi-VN"/>
         </w:rPr>
+      </w:pPr>
+      <w:r>
+        <w:rPr>
+          <w:lang w:val="vi-VN"/>
+        </w:rPr>
+        <w:t>hoc-slave1</w:t>
+      </w:r>
+    </w:p>
+    <w:p>
+      <w:pPr>
+        <w:pStyle w:val="Nidung"/>
+        <w:pBdr>
+          <w:top w:val="single" w:sz="4" w:space="1" w:color="auto"/>
+          <w:left w:val="single" w:sz="4" w:space="4" w:color="auto"/>
+          <w:bottom w:val="single" w:sz="4" w:space="1" w:color="auto"/>
+          <w:right w:val="single" w:sz="4" w:space="4" w:color="auto"/>
+        </w:pBdr>
+        <w:rPr>
+          <w:lang w:val="vi-VN"/>
+        </w:rPr>
+      </w:pPr>
+      <w:r>
+        <w:rPr>
+          <w:lang w:val="vi-VN"/>
+        </w:rPr>
+        <w:t>nguyen-slave2</w:t>
+      </w:r>
+    </w:p>
+    <w:p>
+      <w:pPr>
+        <w:pStyle w:val="Nidung"/>
+        <w:pBdr>
+          <w:top w:val="single" w:sz="4" w:space="1" w:color="auto"/>
+          <w:left w:val="single" w:sz="4" w:space="4" w:color="auto"/>
+          <w:bottom w:val="single" w:sz="4" w:space="1" w:color="auto"/>
+          <w:right w:val="single" w:sz="4" w:space="4" w:color="auto"/>
+        </w:pBdr>
+      </w:pPr>
+      <w:r>
+        <w:rPr>
+          <w:lang w:val="vi-VN"/>
+        </w:rPr>
+        <w:t>anh24133004-slave3</w:t>
+      </w:r>
+    </w:p>
+    <w:p>
+      <w:pPr>
+        <w:pStyle w:val="Nidung"/>
       </w:pPr>
     </w:p>
     <w:p>
@@ -8986,6 +9040,7 @@
           <w:szCs w:val="21"/>
           <w14:ligatures w14:val="none"/>
         </w:rPr>
+        <w:lastRenderedPageBreak/>
         <w:t xml:space="preserve">        </w:t>
       </w:r>
       <w:r>
@@ -9297,7 +9352,6 @@
           <w:szCs w:val="21"/>
           <w14:ligatures w14:val="none"/>
         </w:rPr>
-        <w:lastRenderedPageBreak/>
         <w:t xml:space="preserve">    </w:t>
       </w:r>
       <w:r>
@@ -11780,6 +11834,7 @@
           <w:szCs w:val="21"/>
           <w14:ligatures w14:val="none"/>
         </w:rPr>
+        <w:lastRenderedPageBreak/>
         <w:t xml:space="preserve">        </w:t>
       </w:r>
       <w:r>
@@ -12123,7 +12178,6 @@
           <w:szCs w:val="21"/>
           <w14:ligatures w14:val="none"/>
         </w:rPr>
-        <w:lastRenderedPageBreak/>
         <w:t xml:space="preserve">        </w:t>
       </w:r>
       <w:r>
@@ -14760,6 +14814,7 @@
           <w:szCs w:val="21"/>
           <w14:ligatures w14:val="none"/>
         </w:rPr>
+        <w:lastRenderedPageBreak/>
         <w:t xml:space="preserve">    </w:t>
       </w:r>
       <w:r>
@@ -15165,7 +15220,6 @@
           <w:szCs w:val="21"/>
           <w14:ligatures w14:val="none"/>
         </w:rPr>
-        <w:lastRenderedPageBreak/>
         <w:t xml:space="preserve">    </w:t>
       </w:r>
       <w:r>
@@ -17925,6 +17979,7 @@
           <w:szCs w:val="21"/>
           <w14:ligatures w14:val="none"/>
         </w:rPr>
+        <w:lastRenderedPageBreak/>
         <w:t xml:space="preserve">        </w:t>
       </w:r>
       <w:r>
@@ -18380,13 +18435,55 @@
       <w:pPr>
         <w:pStyle w:val="Nidung"/>
       </w:pPr>
+      <w:r>
+        <w:lastRenderedPageBreak/>
+        <w:drawing>
+          <wp:inline distT="0" distB="0" distL="0" distR="0" wp14:anchorId="114345B1" wp14:editId="602A919A">
+            <wp:extent cx="5760720" cy="2654300"/>
+            <wp:effectExtent l="0" t="0" r="0" b="0"/>
+            <wp:docPr id="1684164220" name="Picture 1"/>
+            <wp:cNvGraphicFramePr>
+              <a:graphicFrameLocks xmlns:a="http://schemas.openxmlformats.org/drawingml/2006/main" noChangeAspect="1"/>
+            </wp:cNvGraphicFramePr>
+            <a:graphic xmlns:a="http://schemas.openxmlformats.org/drawingml/2006/main">
+              <a:graphicData uri="http://schemas.openxmlformats.org/drawingml/2006/picture">
+                <pic:pic xmlns:pic="http://schemas.openxmlformats.org/drawingml/2006/picture">
+                  <pic:nvPicPr>
+                    <pic:cNvPr id="1684164220" name=""/>
+                    <pic:cNvPicPr/>
+                  </pic:nvPicPr>
+                  <pic:blipFill>
+                    <a:blip r:embed="rId15"/>
+                    <a:stretch>
+                      <a:fillRect/>
+                    </a:stretch>
+                  </pic:blipFill>
+                  <pic:spPr>
+                    <a:xfrm>
+                      <a:off x="0" y="0"/>
+                      <a:ext cx="5760720" cy="2654300"/>
+                    </a:xfrm>
+                    <a:prstGeom prst="rect">
+                      <a:avLst/>
+                    </a:prstGeom>
+                  </pic:spPr>
+                </pic:pic>
+              </a:graphicData>
+            </a:graphic>
+          </wp:inline>
+        </w:drawing>
+      </w:r>
+    </w:p>
+    <w:p>
+      <w:pPr>
+        <w:pStyle w:val="Nidung"/>
+      </w:pPr>
     </w:p>
     <w:p>
       <w:pPr>
         <w:pStyle w:val="Heading3"/>
       </w:pPr>
       <w:r>
-        <w:lastRenderedPageBreak/>
         <w:t xml:space="preserve"> Mở cổng 2222 trên </w:t>
       </w:r>
       <w:r>
@@ -18424,7 +18521,7 @@
                     <pic:cNvPicPr/>
                   </pic:nvPicPr>
                   <pic:blipFill>
-                    <a:blip r:embed="rId15"/>
+                    <a:blip r:embed="rId16"/>
                     <a:stretch>
                       <a:fillRect/>
                     </a:stretch>
@@ -18534,6 +18631,7 @@
         </w:rPr>
       </w:pPr>
       <w:r>
+        <w:lastRenderedPageBreak/>
         <w:t xml:space="preserve">ssh-keygen -t rsa -P "" -f ~/.ssh/id_rsa </w:t>
       </w:r>
     </w:p>
@@ -18556,7 +18654,6 @@
         <w:jc w:val="center"/>
       </w:pPr>
       <w:r>
-        <w:lastRenderedPageBreak/>
         <w:drawing>
           <wp:inline distT="0" distB="0" distL="0" distR="0" wp14:anchorId="197FEDC3" wp14:editId="5BD11AF8">
             <wp:extent cx="4922947" cy="2895851"/>
@@ -18573,7 +18670,7 @@
                     <pic:cNvPicPr/>
                   </pic:nvPicPr>
                   <pic:blipFill>
-                    <a:blip r:embed="rId16"/>
+                    <a:blip r:embed="rId17"/>
                     <a:stretch>
                       <a:fillRect/>
                     </a:stretch>
@@ -18676,7 +18773,7 @@
                     <pic:cNvPicPr/>
                   </pic:nvPicPr>
                   <pic:blipFill>
-                    <a:blip r:embed="rId17"/>
+                    <a:blip r:embed="rId18"/>
                     <a:stretch>
                       <a:fillRect/>
                     </a:stretch>
@@ -18764,7 +18861,7 @@
                     <pic:cNvPicPr/>
                   </pic:nvPicPr>
                   <pic:blipFill>
-                    <a:blip r:embed="rId18"/>
+                    <a:blip r:embed="rId19"/>
                     <a:stretch>
                       <a:fillRect/>
                     </a:stretch>
@@ -18898,7 +18995,7 @@
                     <pic:cNvPicPr/>
                   </pic:nvPicPr>
                   <pic:blipFill>
-                    <a:blip r:embed="rId19"/>
+                    <a:blip r:embed="rId20"/>
                     <a:stretch>
                       <a:fillRect/>
                     </a:stretch>
@@ -19079,7 +19176,7 @@
                     <pic:cNvPicPr/>
                   </pic:nvPicPr>
                   <pic:blipFill>
-                    <a:blip r:embed="rId20"/>
+                    <a:blip r:embed="rId21"/>
                     <a:stretch>
                       <a:fillRect/>
                     </a:stretch>
@@ -19128,7 +19225,7 @@
                     <pic:cNvPicPr/>
                   </pic:nvPicPr>
                   <pic:blipFill>
-                    <a:blip r:embed="rId21"/>
+                    <a:blip r:embed="rId22"/>
                     <a:stretch>
                       <a:fillRect/>
                     </a:stretch>
@@ -19178,7 +19275,7 @@
                     <pic:cNvPicPr/>
                   </pic:nvPicPr>
                   <pic:blipFill>
-                    <a:blip r:embed="rId22"/>
+                    <a:blip r:embed="rId23"/>
                     <a:stretch>
                       <a:fillRect/>
                     </a:stretch>
@@ -19248,7 +19345,7 @@
                     <pic:cNvPicPr/>
                   </pic:nvPicPr>
                   <pic:blipFill>
-                    <a:blip r:embed="rId23"/>
+                    <a:blip r:embed="rId24"/>
                     <a:stretch>
                       <a:fillRect/>
                     </a:stretch>
@@ -19291,7 +19388,7 @@
                     <pic:cNvPicPr/>
                   </pic:nvPicPr>
                   <pic:blipFill>
-                    <a:blip r:embed="rId24"/>
+                    <a:blip r:embed="rId25"/>
                     <a:stretch>
                       <a:fillRect/>
                     </a:stretch>
@@ -19335,7 +19432,7 @@
                     <pic:cNvPicPr/>
                   </pic:nvPicPr>
                   <pic:blipFill>
-                    <a:blip r:embed="rId25"/>
+                    <a:blip r:embed="rId26"/>
                     <a:stretch>
                       <a:fillRect/>
                     </a:stretch>
@@ -19405,7 +19502,7 @@
                     <pic:cNvPicPr/>
                   </pic:nvPicPr>
                   <pic:blipFill>
-                    <a:blip r:embed="rId26"/>
+                    <a:blip r:embed="rId27"/>
                     <a:stretch>
                       <a:fillRect/>
                     </a:stretch>
@@ -19543,7 +19640,7 @@
                     <pic:cNvPicPr/>
                   </pic:nvPicPr>
                   <pic:blipFill>
-                    <a:blip r:embed="rId27"/>
+                    <a:blip r:embed="rId28"/>
                     <a:stretch>
                       <a:fillRect/>
                     </a:stretch>
@@ -19611,7 +19708,7 @@
                     <pic:cNvPicPr/>
                   </pic:nvPicPr>
                   <pic:blipFill>
-                    <a:blip r:embed="rId28"/>
+                    <a:blip r:embed="rId29"/>
                     <a:stretch>
                       <a:fillRect/>
                     </a:stretch>
@@ -19670,7 +19767,7 @@
                     <pic:cNvPicPr/>
                   </pic:nvPicPr>
                   <pic:blipFill>
-                    <a:blip r:embed="rId29"/>
+                    <a:blip r:embed="rId30"/>
                     <a:stretch>
                       <a:fillRect/>
                     </a:stretch>
@@ -19730,7 +19827,7 @@
                     <pic:cNvPicPr/>
                   </pic:nvPicPr>
                   <pic:blipFill>
-                    <a:blip r:embed="rId30"/>
+                    <a:blip r:embed="rId31"/>
                     <a:stretch>
                       <a:fillRect/>
                     </a:stretch>
@@ -19792,7 +19889,7 @@
                     <pic:cNvPicPr/>
                   </pic:nvPicPr>
                   <pic:blipFill>
-                    <a:blip r:embed="rId31"/>
+                    <a:blip r:embed="rId32"/>
                     <a:stretch>
                       <a:fillRect/>
                     </a:stretch>
@@ -22929,7 +23026,7 @@
                     <pic:cNvPicPr/>
                   </pic:nvPicPr>
                   <pic:blipFill>
-                    <a:blip r:embed="rId32"/>
+                    <a:blip r:embed="rId33"/>
                     <a:stretch>
                       <a:fillRect/>
                     </a:stretch>
@@ -23131,7 +23228,7 @@
       <w:r>
         <w:t xml:space="preserve">Shivam Bansal, “Netflix Movies and TV Shows,” Kaggle. [Trực tuyến]. Có tại: </w:t>
       </w:r>
-      <w:hyperlink r:id="rId33" w:history="1">
+      <w:hyperlink r:id="rId34" w:history="1">
         <w:r>
           <w:rPr>
             <w:rStyle w:val="Hyperlink"/>
@@ -23150,7 +23247,7 @@
       <w:r>
         <w:t xml:space="preserve">Microsoft, “Power BI report and dashboard creation documentation,” Microsoft Learn. [Trực tuyến]. Có tại: </w:t>
       </w:r>
-      <w:hyperlink r:id="rId34" w:history="1">
+      <w:hyperlink r:id="rId35" w:history="1">
         <w:r>
           <w:rPr>
             <w:rStyle w:val="Hyperlink"/>
@@ -23169,7 +23266,7 @@
       <w:r>
         <w:t xml:space="preserve">pandas Development Team, “User Guide” pandas Documentation. [Trực tuyến]. Có tại: </w:t>
       </w:r>
-      <w:hyperlink r:id="rId35" w:history="1">
+      <w:hyperlink r:id="rId36" w:history="1">
         <w:r>
           <w:rPr>
             <w:rStyle w:val="Hyperlink"/>
@@ -23188,7 +23285,7 @@
       <w:r>
         <w:t xml:space="preserve">scikit-learn developers, “LinearRegression”, scikit-learn Documentation. [Trực tuyến]. Có tại: </w:t>
       </w:r>
-      <w:hyperlink r:id="rId36" w:history="1">
+      <w:hyperlink r:id="rId37" w:history="1">
         <w:r>
           <w:rPr>
             <w:rStyle w:val="Hyperlink"/>
@@ -23207,7 +23304,7 @@
       <w:r>
         <w:t xml:space="preserve">scikit-learn developers, “Model evaluation,” scikit-learn Documentation. [Trực tuyến]. Có tại: </w:t>
       </w:r>
-      <w:hyperlink r:id="rId37" w:history="1">
+      <w:hyperlink r:id="rId38" w:history="1">
         <w:r>
           <w:rPr>
             <w:rStyle w:val="Hyperlink"/>

</xml_diff>